<commit_message>
Remove and fix some bugs
</commit_message>
<xml_diff>
--- a/Manual_layout_check.docx
+++ b/Manual_layout_check.docx
@@ -425,7 +425,7 @@
           </w:tcPr>
           <w:p>
             <w:r>
-              <w:t xml:space="preserve">329 tests discovered. All 325 non-GUI tests passed with every optional backend required; the four GUI tests passed when run separately; see Section 9.</w:t>
+              <w:t xml:space="preserve">332 tests discovered. All 328 non-GUI tests passed with every optional backend required; the four GUI tests passed when run separately; see Section 9.</w:t>
             </w:r>
           </w:p>
         </w:tc>
@@ -5655,7 +5655,7 @@
     </w:p>
     <w:p>
       <w:r>
-        <w:t>Run python3 builder_gui.py from program/ after installing the core requirements and ensuring Tkinter is available. The Tk desktop interface imports and hashes files in the background, helps declare workflows and graph relationships, offers workflow preflight and full assessment, and saves the complete JSON response. Full assessment stages verified originals in a temporary bundle and invokes the same production worker as the CLI.</w:t>
+        <w:t xml:space="preserve">Run python3 builder_gui.py from program/ after installing the core requirements and ensuring Tkinter is available. The Tk desktop interface imports and hashes files in the background, helps declare workflows and graph relationships, offers workflow preflight and full assessment, and saves the complete JSON response. Full assessment stages verified originals in a temporary bundle and invokes the same production worker as the CLI. Its preflight uses the evaluator's limits (128 artefacts, 512 MiB per object, 1 GiB per request); before 0.8.1 it refused files over 32 MiB.</w:t>
       </w:r>
     </w:p>
     <w:p>
@@ -31306,7 +31306,7 @@
           </w:tcPr>
           <w:p>
             <w:r>
-              <w:t xml:space="preserve">Background operations, export integrity, production-worker assessment, result display (audio summaries, calibration lines and C2PA problem states) and explicit local-reference authorization. The results view labels a contradicted Integrity with its count. test_builder.py imports run before its worker tests mock subprocess.Popen, because importing c2pa calls platform.processor(), which spawns a subprocess; the module therefore also passes when run on its own.</w:t>
+              <w:t xml:space="preserve">Background operations, export integrity, production-worker assessment, result display (audio summaries, calibration lines and C2PA problem states) and explicit local-reference authorization. The results view labels a contradicted Integrity with its count. test_builder.py imports run before its worker tests mock subprocess.Popen, because importing c2pa calls platform.processor(), which spawns a subprocess; the module therefore also passes when run on its own. ManifestLimitTests check that the builder's preflight limits equal the evaluator's (512 MiB per object, 1 GiB per request).</w:t>
             </w:r>
           </w:p>
         </w:tc>
@@ -31437,7 +31437,7 @@
     </w:p>
     <w:p>
       <w:r>
-        <w:t xml:space="preserve">On 22 October 2026, the 308 non-GUI tests were run against version 0.8.0 with REQUIRE_AUDIO_BACKENDS=1, so every optional backend had to be present: all 308 passed in 26.7 seconds, with no failures, errors or skips. For version 0.8.1 the same procedure ran 325 non-GUI tests in one process (all passed in 29 seconds, no skips) and each of the four test_builder.GuiTests cases in a separate process (all passed); reports/test-results.txt and reports/release.json record the run. The environment included c2pa-python 0.37.10, the audio libraries and the benchmark-only mir_eval 0.8.2 from requirements-benchmark.txt. A writable NUMBA_CACHE_DIR was supplied because the default audio library cache location may not be writable.</w:t>
+        <w:t xml:space="preserve">On 22 October 2026, the 308 non-GUI tests were run against version 0.8.0 with REQUIRE_AUDIO_BACKENDS=1, so every optional backend had to be present: all 308 passed in 26.7 seconds, with no failures, errors or skips. For version 0.8.1 the same procedure ran 328 non-GUI tests in one process (all passed in 31 seconds, no skips) and each of the four test_builder.GuiTests cases in a separate process (all passed); reports/test-results.txt and reports/release.json record the run. The environment included c2pa-python 0.37.10, the audio libraries and the benchmark-only mir_eval 0.8.2 from requirements-benchmark.txt. A writable NUMBA_CACHE_DIR was supplied because the default audio library cache location may not be writable.</w:t>
       </w:r>
     </w:p>
     <w:p>
@@ -31451,7 +31451,7 @@
     <w:p>
       <w:r>
         <w:lastRenderedPageBreak/>
-        <w:t xml:space="preserve">The current discovery contains 329 cases: 131 core; 41 audio diagnostics; 24 C2PA; 22 remediation; 16 non-GUI builder; 15 builder-result; 14 scoring-remediation; 12 local-file-reference; 27 production-document; 9 audio calibration; 6 DAW-session; 5 structure benchmark; 3 music benchmark; and 4 GUI cases. Run GUI cases in separate processes when investigating macOS Tk lifecycle hangs; do not treat excluded cases as passes or skips.</w:t>
+        <w:t xml:space="preserve">The current discovery contains 332 cases: 131 core; 41 audio diagnostics; 24 C2PA; 22 remediation; 19 non-GUI builder; 15 builder-result; 14 scoring-remediation; 12 local-file-reference; 27 production-document; 9 audio calibration; 6 DAW-session; 5 structure benchmark; 3 music benchmark; and 4 GUI cases. Run GUI cases in separate processes when investigating macOS Tk lifecycle hangs; do not treat excluded cases as passes or skips.</w:t>
       </w:r>
     </w:p>
     <w:p>
@@ -31472,7 +31472,7 @@
         <w:spacing w:line="276" w:lineRule="auto"/>
       </w:pPr>
       <w:r>
-        <w:t xml:space="preserve">Version 0.8.1 applies the Project Rock findings: recorder metadata only for files that name their recording, raw takes accepted by mixed_from, AAF take coverage and non-recorder media, contradiction counts in integrity_decision, AAF-range audio diagnostics and the BWF chronology warning. Only the mixed_from change can alter a score. The example responses under examples/ were regenerated with 0.8.1; since their 0.7.0 snapshots, attestation_strength reads 0.0 rather than null for files without a C2PA manifest, as defined in 0.8.0.</w:t>
+        <w:t xml:space="preserve">Version 0.8.1 applies the Project Rock findings: recorder metadata only for files that name their recording, raw takes accepted by mixed_from, AAF take coverage and non-recorder media, contradiction counts in integrity_decision, AAF-range audio diagnostics and the BWF chronology warning. Only the mixed_from change can alter a score. The example responses under examples/ were regenerated with 0.8.1; since their 0.7.0 snapshots, attestation_strength reads 0.0 rather than null for files without a C2PA manifest, as defined in 0.8.0. It also aligns the desktop builder's size limits with the evaluator and removes duplicate builder and relationship_modes modules from music_target/.</w:t>
       </w:r>
     </w:p>
     <w:p>

</xml_diff>

<commit_message>
Add Wilson intervals to audio calibration counts, CSEC adversarial-testing handoff package, update CSEC handoff doc, add FLAC/MP3 support plan
</commit_message>
<xml_diff>
--- a/Manual_layout_check.docx
+++ b/Manual_layout_check.docx
@@ -425,7 +425,7 @@
           </w:tcPr>
           <w:p>
             <w:r>
-              <w:t xml:space="preserve">332 tests discovered. All 328 non-GUI tests passed with every optional backend required; the four GUI tests passed when run separately; see Section 9.</w:t>
+              <w:t xml:space="preserve">342 tests discovered. All 338 non-GUI tests passed with every optional backend required; the four GUI tests passed when run separately; see Section 9.</w:t>
             </w:r>
           </w:p>
         </w:tc>
@@ -18399,7 +18399,7 @@
     </w:p>
     <w:p>
       <w:r>
-        <w:t>Version-two semantic validation contained 72 derivative cases: 57 supported and 15 abstained. Supported pitch estimates were correct in 57/57 cases, with maximum relative tempo error 1.27%; none of 29 controls was supported. These limited counts do not establish population accuracy. On the eight-recording section test, macro boundary F at 3-second tolerance improved from 0.339 for fixed phrases to 0.538 for acoustic novelty. Fingerprint support on the original four held-out Lumina families improved from 14/16 to 15/16 at density 40, with one weak mixture source still missed. Always report abstentions and sample counts alongside accuracy.</w:t>
+        <w:t xml:space="preserve">Version-two semantic validation contained 72 derivative cases: 57 supported and 15 abstained. Supported pitch estimates were correct in 57/57 cases, with maximum relative tempo error 1.27%; none of 29 controls was supported. These limited counts do not establish population accuracy. On the eight-recording section test, macro boundary F at 3-second tolerance improved from 0.339 for fixed phrases to 0.538 for acoustic novelty. Fingerprint support on the original four held-out Lumina families improved from 14/16 to 15/16 at density 40, with one weak mixture source still missed. Always report abstentions and sample counts alongside accuracy. Each count now carries a 95% Wilson interval: none of 29 held-out controls supported is still consistent with a false-support rate of up to 11.7%, and 15 of 16 held-out mixtures found gives 71.7–98.9%.</w:t>
       </w:r>
     </w:p>
     <w:p>
@@ -18438,7 +18438,7 @@
         <w:spacing w:after="60" w:line="276" w:lineRule="auto"/>
       </w:pPr>
       <w:r>
-        <w:t>The repository report records fingerprint agreement on 2 of 29 true takes inside local final masters and 0 of 33 unrelated controls. Agreement requires at least two votes per algorithm within the larger offset bin and can include votes below either standalone candidate threshold. Its Poisson chance estimate assumes independent backgrounds, although both providers read the same audio. These case counts are not a validated recall or false-positive guarantee.</w:t>
+        <w:t xml:space="preserve">The repository report records fingerprint agreement on 2 of 29 true takes inside local final masters and 0 of 33 unrelated controls. Agreement requires at least two votes per algorithm within the larger offset bin and can include votes below either standalone candidate threshold. Its Poisson chance estimate assumes independent backgrounds, although both providers read the same audio. These case counts are not a validated recall or false-positive guarantee. Their 95% Wilson intervals are 1.9–22.0% and 0–10.4%.</w:t>
       </w:r>
     </w:p>
     <w:p>
@@ -18482,15 +18482,836 @@
         <w:spacing w:line="276" w:lineRule="auto"/>
       </w:pPr>
       <w:r>
-        <w:t>Every audio diagnostic row carries a calibration object read from policies/audio_calibration_status.json: a status, a summary with case counts, the transforms tested and not tested, and false_match_rates. audfprint and music_semantics have status bounded_calibration; SpectroMap, librosa and fingerprint agreement are exploratory_uncalibrated. audio_diagnostic_summary records the SHA-256 of the status file. The frozen audio_calibration_profile.json and its gates are unchanged, so this information explains results without changing them.</w:t>
+        <w:t xml:space="preserve">Every audio diagnostic row carries a calibration object read from policies/audio_calibration_status.json: a status, a summary with case counts, the transforms tested and not tested, and false_match_rates. audfprint and music_semantics have status bounded_calibration; SpectroMap, librosa and fingerprint agreement are exploratory_uncalibrated. audio_diagnostic_summary records the SHA-256 of the status file. The frozen audio_calibration_profile.json and its gates are unchanged, so this information explains results without changing them. case_counts lists each count under development (cases used to choose or revise the gates), held_out (cases evaluated only after the gates were frozen) or real_material (Project Rock, never used for tuning), with measure, count, cases and a 95% Wilson interval wilson_95 (lower, upper) from music_target/case_intervals.py. Wilson stays inside 0–100% and gives a usable upper bound for 0 of n. The development counts set the gates and are optimistic; the held-out counts describe the frozen profile. Cases from one family or one session are not independent, so the real uncertainty is wider than an interval, and no interval is a population rate. The held-out and real-material counts are:</w:t>
       </w:r>
     </w:p>
+    <w:tbl>
+      <w:tblPr>
+        <w:tblW w:w="9638" w:type="dxa"/>
+        <w:tblBorders>
+          <w:top w:val="single" w:sz="4" w:space="0" w:color="D9D9D9"/>
+          <w:left w:val="single" w:sz="4" w:space="0" w:color="D9D9D9"/>
+          <w:bottom w:val="single" w:sz="4" w:space="0" w:color="D9D9D9"/>
+          <w:right w:val="single" w:sz="4" w:space="0" w:color="D9D9D9"/>
+          <w:insideH w:val="single" w:sz="4" w:space="0" w:color="D9D9D9"/>
+          <w:insideV w:val="single" w:sz="4" w:space="0" w:color="D9D9D9"/>
+        </w:tblBorders>
+        <w:tblLayout w:type="fixed"/>
+        <w:tblCellMar>
+          <w:top w:w="75" w:type="dxa"/>
+          <w:left w:w="95" w:type="dxa"/>
+          <w:bottom w:w="75" w:type="dxa"/>
+          <w:right w:w="95" w:type="dxa"/>
+        </w:tblCellMar>
+        <w:tblLook w:val="04A0" w:firstRow="1" w:lastRow="0" w:firstColumn="1" w:lastColumn="0" w:noHBand="0" w:noVBand="1"/>
+      </w:tblPr>
+      <w:tblGrid>
+        <w:gridCol w:w="4438"/>
+        <w:gridCol w:w="1500"/>
+        <w:gridCol w:w="3700"/>
+      </w:tblGrid>
+      <w:tr>
+        <w:trPr>
+          <w:cantSplit/>
+          <w:tblHeader/>
+        </w:trPr>
+        <w:tc>
+          <w:tcPr>
+            <w:tcW w:w="4438" w:type="dxa"/>
+            <w:tcBorders>
+              <w:top w:val="single" w:sz="4" w:space="0" w:color="1F3A5F"/>
+              <w:left w:val="single" w:sz="4" w:space="0" w:color="1F3A5F"/>
+              <w:bottom w:val="single" w:sz="4" w:space="0" w:color="1F3A5F"/>
+              <w:right w:val="single" w:sz="4" w:space="0" w:color="1F3A5F"/>
+            </w:tcBorders>
+            <w:shd w:val="clear" w:color="auto" w:fill="1F3A5F"/>
+            <w:tcMar>
+              <w:top w:w="70" w:type="dxa"/>
+              <w:left w:w="110" w:type="dxa"/>
+              <w:bottom w:w="70" w:type="dxa"/>
+              <w:right w:w="110" w:type="dxa"/>
+            </w:tcMar>
+            <w:vAlign w:val="center"/>
+          </w:tcPr>
+          <w:p>
+            <w:pPr>
+              <w:keepNext/>
+              <w:keepLines/>
+              <w:spacing w:after="40" w:line="254" w:lineRule="auto"/>
+            </w:pPr>
+            <w:r>
+              <w:rPr>
+                <w:b/>
+                <w:bCs/>
+                <w:color w:val="FFFFFF"/>
+                <w:sz w:val="17"/>
+                <w:szCs w:val="18"/>
+              </w:rPr>
+              <w:lastRenderedPageBreak/>
+              <w:t xml:space="preserve">Measure</w:t>
+            </w:r>
+          </w:p>
+        </w:tc>
+        <w:tc>
+          <w:tcPr>
+            <w:tcW w:w="1500" w:type="dxa"/>
+            <w:tcBorders>
+              <w:top w:val="single" w:sz="4" w:space="0" w:color="1F3A5F"/>
+              <w:left w:val="single" w:sz="4" w:space="0" w:color="1F3A5F"/>
+              <w:bottom w:val="single" w:sz="4" w:space="0" w:color="1F3A5F"/>
+              <w:right w:val="single" w:sz="4" w:space="0" w:color="1F3A5F"/>
+            </w:tcBorders>
+            <w:shd w:val="clear" w:color="auto" w:fill="1F3A5F"/>
+            <w:tcMar>
+              <w:top w:w="70" w:type="dxa"/>
+              <w:left w:w="110" w:type="dxa"/>
+              <w:bottom w:w="70" w:type="dxa"/>
+              <w:right w:w="110" w:type="dxa"/>
+            </w:tcMar>
+            <w:vAlign w:val="center"/>
+          </w:tcPr>
+          <w:p>
+            <w:pPr>
+              <w:keepNext/>
+              <w:keepLines/>
+              <w:spacing w:after="40" w:line="254" w:lineRule="auto"/>
+            </w:pPr>
+            <w:r>
+              <w:rPr>
+                <w:b/>
+                <w:bCs/>
+                <w:color w:val="FFFFFF"/>
+                <w:sz w:val="17"/>
+                <w:szCs w:val="18"/>
+              </w:rPr>
+              <w:t xml:space="preserve">Split</w:t>
+            </w:r>
+          </w:p>
+        </w:tc>
+        <w:tc>
+          <w:tcPr>
+            <w:tcW w:w="3700" w:type="dxa"/>
+            <w:tcBorders>
+              <w:top w:val="single" w:sz="4" w:space="0" w:color="1F3A5F"/>
+              <w:left w:val="single" w:sz="4" w:space="0" w:color="1F3A5F"/>
+              <w:bottom w:val="single" w:sz="4" w:space="0" w:color="1F3A5F"/>
+              <w:right w:val="single" w:sz="4" w:space="0" w:color="1F3A5F"/>
+            </w:tcBorders>
+            <w:shd w:val="clear" w:color="auto" w:fill="1F3A5F"/>
+            <w:tcMar>
+              <w:top w:w="70" w:type="dxa"/>
+              <w:left w:w="110" w:type="dxa"/>
+              <w:bottom w:w="70" w:type="dxa"/>
+              <w:right w:w="110" w:type="dxa"/>
+            </w:tcMar>
+            <w:vAlign w:val="center"/>
+          </w:tcPr>
+          <w:p>
+            <w:pPr>
+              <w:keepNext/>
+              <w:keepLines/>
+              <w:spacing w:after="40" w:line="254" w:lineRule="auto"/>
+            </w:pPr>
+            <w:r>
+              <w:rPr>
+                <w:b/>
+                <w:bCs/>
+                <w:color w:val="FFFFFF"/>
+                <w:sz w:val="17"/>
+                <w:szCs w:val="18"/>
+              </w:rPr>
+              <w:t xml:space="preserve">Count; 95% Wilson interval</w:t>
+            </w:r>
+          </w:p>
+        </w:tc>
+      </w:tr>
+      <w:tr>
+        <w:trPr>
+          <w:cantSplit/>
+        </w:trPr>
+        <w:tc>
+          <w:tcPr>
+            <w:tcW w:w="4438" w:type="dxa"/>
+            <w:shd w:val="clear" w:color="auto" w:fill="FFFFFF"/>
+            <w:vAlign w:val="center"/>
+          </w:tcPr>
+          <w:p>
+            <w:pPr>
+              <w:keepNext/>
+              <w:keepLines/>
+              <w:spacing w:after="40" w:line="254" w:lineRule="auto"/>
+            </w:pPr>
+            <w:r>
+              <w:rPr>
+                <w:color w:val="000000"/>
+                <w:sz w:val="17"/>
+              </w:rPr>
+              <w:t xml:space="preserve">music_semantics: known DSP derivatives supported (8 SALAMI families)</w:t>
+            </w:r>
+          </w:p>
+        </w:tc>
+        <w:tc>
+          <w:tcPr>
+            <w:tcW w:w="1500" w:type="dxa"/>
+            <w:shd w:val="clear" w:color="auto" w:fill="FFFFFF"/>
+            <w:vAlign w:val="center"/>
+          </w:tcPr>
+          <w:p>
+            <w:pPr>
+              <w:keepNext/>
+              <w:keepLines/>
+              <w:spacing w:after="40" w:line="254" w:lineRule="auto"/>
+            </w:pPr>
+            <w:r>
+              <w:rPr>
+                <w:color w:val="000000"/>
+                <w:sz w:val="17"/>
+              </w:rPr>
+              <w:t xml:space="preserve">held_out</w:t>
+            </w:r>
+          </w:p>
+        </w:tc>
+        <w:tc>
+          <w:tcPr>
+            <w:tcW w:w="3700" w:type="dxa"/>
+            <w:shd w:val="clear" w:color="auto" w:fill="FFFFFF"/>
+            <w:vAlign w:val="center"/>
+          </w:tcPr>
+          <w:p>
+            <w:pPr>
+              <w:keepNext/>
+              <w:keepLines/>
+              <w:spacing w:after="40" w:line="254" w:lineRule="auto"/>
+            </w:pPr>
+            <w:r>
+              <w:rPr>
+                <w:color w:val="000000"/>
+                <w:sz w:val="17"/>
+              </w:rPr>
+              <w:t xml:space="preserve">57/72; 68.4–86.9%</w:t>
+            </w:r>
+          </w:p>
+        </w:tc>
+      </w:tr>
+      <w:tr>
+        <w:trPr>
+          <w:cantSplit/>
+        </w:trPr>
+        <w:tc>
+          <w:tcPr>
+            <w:tcW w:w="4438" w:type="dxa"/>
+            <w:shd w:val="clear" w:color="auto" w:fill="FFFFFF"/>
+            <w:vAlign w:val="center"/>
+          </w:tcPr>
+          <w:p>
+            <w:pPr>
+              <w:keepNext/>
+              <w:keepLines/>
+              <w:spacing w:after="40" w:line="254" w:lineRule="auto"/>
+            </w:pPr>
+            <w:r>
+              <w:rPr>
+                <w:color w:val="000000"/>
+                <w:sz w:val="17"/>
+              </w:rPr>
+              <w:t xml:space="preserve">music_semantics: supported derivatives with the correct transposition</w:t>
+            </w:r>
+          </w:p>
+        </w:tc>
+        <w:tc>
+          <w:tcPr>
+            <w:tcW w:w="1500" w:type="dxa"/>
+            <w:shd w:val="clear" w:color="auto" w:fill="FFFFFF"/>
+            <w:vAlign w:val="center"/>
+          </w:tcPr>
+          <w:p>
+            <w:pPr>
+              <w:keepNext/>
+              <w:keepLines/>
+              <w:spacing w:after="40" w:line="254" w:lineRule="auto"/>
+            </w:pPr>
+            <w:r>
+              <w:rPr>
+                <w:color w:val="000000"/>
+                <w:sz w:val="17"/>
+              </w:rPr>
+              <w:t xml:space="preserve">held_out</w:t>
+            </w:r>
+          </w:p>
+        </w:tc>
+        <w:tc>
+          <w:tcPr>
+            <w:tcW w:w="3700" w:type="dxa"/>
+            <w:shd w:val="clear" w:color="auto" w:fill="FFFFFF"/>
+            <w:vAlign w:val="center"/>
+          </w:tcPr>
+          <w:p>
+            <w:pPr>
+              <w:keepNext/>
+              <w:keepLines/>
+              <w:spacing w:after="40" w:line="254" w:lineRule="auto"/>
+            </w:pPr>
+            <w:r>
+              <w:rPr>
+                <w:color w:val="000000"/>
+                <w:sz w:val="17"/>
+              </w:rPr>
+              <w:t xml:space="preserve">57/57; 93.7–100%</w:t>
+            </w:r>
+          </w:p>
+        </w:tc>
+      </w:tr>
+      <w:tr>
+        <w:trPr>
+          <w:cantSplit/>
+        </w:trPr>
+        <w:tc>
+          <w:tcPr>
+            <w:tcW w:w="4438" w:type="dxa"/>
+            <w:shd w:val="clear" w:color="auto" w:fill="FFFFFF"/>
+            <w:vAlign w:val="center"/>
+          </w:tcPr>
+          <w:p>
+            <w:pPr>
+              <w:keepNext/>
+              <w:keepLines/>
+              <w:spacing w:after="40" w:line="254" w:lineRule="auto"/>
+            </w:pPr>
+            <w:r>
+              <w:rPr>
+                <w:color w:val="000000"/>
+                <w:sz w:val="17"/>
+              </w:rPr>
+              <w:t xml:space="preserve">music_semantics: distinct-recording controls and a sustained tone supported</w:t>
+            </w:r>
+          </w:p>
+        </w:tc>
+        <w:tc>
+          <w:tcPr>
+            <w:tcW w:w="1500" w:type="dxa"/>
+            <w:shd w:val="clear" w:color="auto" w:fill="FFFFFF"/>
+            <w:vAlign w:val="center"/>
+          </w:tcPr>
+          <w:p>
+            <w:pPr>
+              <w:keepNext/>
+              <w:keepLines/>
+              <w:spacing w:after="40" w:line="254" w:lineRule="auto"/>
+            </w:pPr>
+            <w:r>
+              <w:rPr>
+                <w:color w:val="000000"/>
+                <w:sz w:val="17"/>
+              </w:rPr>
+              <w:t xml:space="preserve">held_out</w:t>
+            </w:r>
+          </w:p>
+        </w:tc>
+        <w:tc>
+          <w:tcPr>
+            <w:tcW w:w="3700" w:type="dxa"/>
+            <w:shd w:val="clear" w:color="auto" w:fill="FFFFFF"/>
+            <w:vAlign w:val="center"/>
+          </w:tcPr>
+          <w:p>
+            <w:pPr>
+              <w:keepNext/>
+              <w:keepLines/>
+              <w:spacing w:after="40" w:line="254" w:lineRule="auto"/>
+            </w:pPr>
+            <w:r>
+              <w:rPr>
+                <w:color w:val="000000"/>
+                <w:sz w:val="17"/>
+              </w:rPr>
+              <w:t xml:space="preserve">0/29; 0–11.7%</w:t>
+            </w:r>
+          </w:p>
+        </w:tc>
+      </w:tr>
+      <w:tr>
+        <w:trPr>
+          <w:cantSplit/>
+        </w:trPr>
+        <w:tc>
+          <w:tcPr>
+            <w:tcW w:w="4438" w:type="dxa"/>
+            <w:shd w:val="clear" w:color="auto" w:fill="FFFFFF"/>
+            <w:vAlign w:val="center"/>
+          </w:tcPr>
+          <w:p>
+            <w:pPr>
+              <w:keepNext/>
+              <w:keepLines/>
+              <w:spacing w:after="40" w:line="254" w:lineRule="auto"/>
+            </w:pPr>
+            <w:r>
+              <w:rPr>
+                <w:color w:val="000000"/>
+                <w:sz w:val="17"/>
+              </w:rPr>
+              <w:t xml:space="preserve">audfprint: mixtures and excerpts found at the correct offset (four Lumina families)</w:t>
+            </w:r>
+          </w:p>
+        </w:tc>
+        <w:tc>
+          <w:tcPr>
+            <w:tcW w:w="1500" w:type="dxa"/>
+            <w:shd w:val="clear" w:color="auto" w:fill="FFFFFF"/>
+            <w:vAlign w:val="center"/>
+          </w:tcPr>
+          <w:p>
+            <w:pPr>
+              <w:keepNext/>
+              <w:keepLines/>
+              <w:spacing w:after="40" w:line="254" w:lineRule="auto"/>
+            </w:pPr>
+            <w:r>
+              <w:rPr>
+                <w:color w:val="000000"/>
+                <w:sz w:val="17"/>
+              </w:rPr>
+              <w:t xml:space="preserve">held_out</w:t>
+            </w:r>
+          </w:p>
+        </w:tc>
+        <w:tc>
+          <w:tcPr>
+            <w:tcW w:w="3700" w:type="dxa"/>
+            <w:shd w:val="clear" w:color="auto" w:fill="FFFFFF"/>
+            <w:vAlign w:val="center"/>
+          </w:tcPr>
+          <w:p>
+            <w:pPr>
+              <w:keepNext/>
+              <w:keepLines/>
+              <w:spacing w:after="40" w:line="254" w:lineRule="auto"/>
+            </w:pPr>
+            <w:r>
+              <w:rPr>
+                <w:color w:val="000000"/>
+                <w:sz w:val="17"/>
+              </w:rPr>
+              <w:t xml:space="preserve">15/16; 71.7–98.9%</w:t>
+            </w:r>
+          </w:p>
+        </w:tc>
+      </w:tr>
+      <w:tr>
+        <w:trPr>
+          <w:cantSplit/>
+        </w:trPr>
+        <w:tc>
+          <w:tcPr>
+            <w:tcW w:w="4438" w:type="dxa"/>
+            <w:shd w:val="clear" w:color="auto" w:fill="FFFFFF"/>
+            <w:vAlign w:val="center"/>
+          </w:tcPr>
+          <w:p>
+            <w:pPr>
+              <w:keepNext/>
+              <w:keepLines/>
+              <w:spacing w:after="40" w:line="254" w:lineRule="auto"/>
+            </w:pPr>
+            <w:r>
+              <w:rPr>
+                <w:color w:val="000000"/>
+                <w:sz w:val="17"/>
+              </w:rPr>
+              <w:t xml:space="preserve">audfprint: distinct-recording controls with a supported offset</w:t>
+            </w:r>
+          </w:p>
+        </w:tc>
+        <w:tc>
+          <w:tcPr>
+            <w:tcW w:w="1500" w:type="dxa"/>
+            <w:shd w:val="clear" w:color="auto" w:fill="FFFFFF"/>
+            <w:vAlign w:val="center"/>
+          </w:tcPr>
+          <w:p>
+            <w:pPr>
+              <w:keepNext/>
+              <w:keepLines/>
+              <w:spacing w:after="40" w:line="254" w:lineRule="auto"/>
+            </w:pPr>
+            <w:r>
+              <w:rPr>
+                <w:color w:val="000000"/>
+                <w:sz w:val="17"/>
+              </w:rPr>
+              <w:t xml:space="preserve">held_out</w:t>
+            </w:r>
+          </w:p>
+        </w:tc>
+        <w:tc>
+          <w:tcPr>
+            <w:tcW w:w="3700" w:type="dxa"/>
+            <w:shd w:val="clear" w:color="auto" w:fill="FFFFFF"/>
+            <w:vAlign w:val="center"/>
+          </w:tcPr>
+          <w:p>
+            <w:pPr>
+              <w:keepNext/>
+              <w:keepLines/>
+              <w:spacing w:after="40" w:line="254" w:lineRule="auto"/>
+            </w:pPr>
+            <w:r>
+              <w:rPr>
+                <w:color w:val="000000"/>
+                <w:sz w:val="17"/>
+              </w:rPr>
+              <w:t xml:space="preserve">0/6; 0–39.0%</w:t>
+            </w:r>
+          </w:p>
+        </w:tc>
+      </w:tr>
+      <w:tr>
+        <w:trPr>
+          <w:cantSplit/>
+        </w:trPr>
+        <w:tc>
+          <w:tcPr>
+            <w:tcW w:w="4438" w:type="dxa"/>
+            <w:shd w:val="clear" w:color="auto" w:fill="FFFFFF"/>
+            <w:vAlign w:val="center"/>
+          </w:tcPr>
+          <w:p>
+            <w:pPr>
+              <w:keepNext/>
+              <w:keepLines/>
+              <w:spacing w:after="40" w:line="254" w:lineRule="auto"/>
+            </w:pPr>
+            <w:r>
+              <w:rPr>
+                <w:color w:val="000000"/>
+                <w:sz w:val="17"/>
+              </w:rPr>
+              <w:t xml:space="preserve">audfprint: Project Rock AAF-used takes with a supported match, whole take</w:t>
+            </w:r>
+          </w:p>
+        </w:tc>
+        <w:tc>
+          <w:tcPr>
+            <w:tcW w:w="1500" w:type="dxa"/>
+            <w:shd w:val="clear" w:color="auto" w:fill="FFFFFF"/>
+            <w:vAlign w:val="center"/>
+          </w:tcPr>
+          <w:p>
+            <w:pPr>
+              <w:keepNext/>
+              <w:keepLines/>
+              <w:spacing w:after="40" w:line="254" w:lineRule="auto"/>
+            </w:pPr>
+            <w:r>
+              <w:rPr>
+                <w:color w:val="000000"/>
+                <w:sz w:val="17"/>
+              </w:rPr>
+              <w:t xml:space="preserve">real_material</w:t>
+            </w:r>
+          </w:p>
+        </w:tc>
+        <w:tc>
+          <w:tcPr>
+            <w:tcW w:w="3700" w:type="dxa"/>
+            <w:shd w:val="clear" w:color="auto" w:fill="FFFFFF"/>
+            <w:vAlign w:val="center"/>
+          </w:tcPr>
+          <w:p>
+            <w:pPr>
+              <w:keepNext/>
+              <w:keepLines/>
+              <w:spacing w:after="40" w:line="254" w:lineRule="auto"/>
+            </w:pPr>
+            <w:r>
+              <w:rPr>
+                <w:color w:val="000000"/>
+                <w:sz w:val="17"/>
+              </w:rPr>
+              <w:t xml:space="preserve">2/13; 4.3–42.2%</w:t>
+            </w:r>
+          </w:p>
+        </w:tc>
+      </w:tr>
+      <w:tr>
+        <w:trPr>
+          <w:cantSplit/>
+        </w:trPr>
+        <w:tc>
+          <w:tcPr>
+            <w:tcW w:w="4438" w:type="dxa"/>
+            <w:shd w:val="clear" w:color="auto" w:fill="FFFFFF"/>
+            <w:vAlign w:val="center"/>
+          </w:tcPr>
+          <w:p>
+            <w:pPr>
+              <w:keepNext/>
+              <w:keepLines/>
+              <w:spacing w:after="40" w:line="254" w:lineRule="auto"/>
+            </w:pPr>
+            <w:r>
+              <w:rPr>
+                <w:color w:val="000000"/>
+                <w:sz w:val="17"/>
+              </w:rPr>
+              <w:t xml:space="preserve">audfprint: Project Rock AAF-range tasks with a supported match in the used range</w:t>
+            </w:r>
+          </w:p>
+        </w:tc>
+        <w:tc>
+          <w:tcPr>
+            <w:tcW w:w="1500" w:type="dxa"/>
+            <w:shd w:val="clear" w:color="auto" w:fill="FFFFFF"/>
+            <w:vAlign w:val="center"/>
+          </w:tcPr>
+          <w:p>
+            <w:pPr>
+              <w:keepNext/>
+              <w:keepLines/>
+              <w:spacing w:after="40" w:line="254" w:lineRule="auto"/>
+            </w:pPr>
+            <w:r>
+              <w:rPr>
+                <w:color w:val="000000"/>
+                <w:sz w:val="17"/>
+              </w:rPr>
+              <w:t xml:space="preserve">real_material</w:t>
+            </w:r>
+          </w:p>
+        </w:tc>
+        <w:tc>
+          <w:tcPr>
+            <w:tcW w:w="3700" w:type="dxa"/>
+            <w:shd w:val="clear" w:color="auto" w:fill="FFFFFF"/>
+            <w:vAlign w:val="center"/>
+          </w:tcPr>
+          <w:p>
+            <w:pPr>
+              <w:keepNext/>
+              <w:keepLines/>
+              <w:spacing w:after="40" w:line="254" w:lineRule="auto"/>
+            </w:pPr>
+            <w:r>
+              <w:rPr>
+                <w:color w:val="000000"/>
+                <w:sz w:val="17"/>
+              </w:rPr>
+              <w:t xml:space="preserve">0/14; 0–21.5%</w:t>
+            </w:r>
+          </w:p>
+        </w:tc>
+      </w:tr>
+      <w:tr>
+        <w:trPr>
+          <w:cantSplit/>
+        </w:trPr>
+        <w:tc>
+          <w:tcPr>
+            <w:tcW w:w="4438" w:type="dxa"/>
+            <w:shd w:val="clear" w:color="auto" w:fill="FFFFFF"/>
+            <w:vAlign w:val="center"/>
+          </w:tcPr>
+          <w:p>
+            <w:pPr>
+              <w:keepNext/>
+              <w:keepLines/>
+              <w:spacing w:after="40" w:line="254" w:lineRule="auto"/>
+            </w:pPr>
+            <w:r>
+              <w:rPr>
+                <w:color w:val="000000"/>
+                <w:sz w:val="17"/>
+              </w:rPr>
+              <w:t xml:space="preserve">SpectroMap (exploratory): Project Rock AAF-range tasks with a correspondence</w:t>
+            </w:r>
+          </w:p>
+        </w:tc>
+        <w:tc>
+          <w:tcPr>
+            <w:tcW w:w="1500" w:type="dxa"/>
+            <w:shd w:val="clear" w:color="auto" w:fill="FFFFFF"/>
+            <w:vAlign w:val="center"/>
+          </w:tcPr>
+          <w:p>
+            <w:pPr>
+              <w:keepNext/>
+              <w:keepLines/>
+              <w:spacing w:after="40" w:line="254" w:lineRule="auto"/>
+            </w:pPr>
+            <w:r>
+              <w:rPr>
+                <w:color w:val="000000"/>
+                <w:sz w:val="17"/>
+              </w:rPr>
+              <w:t xml:space="preserve">real_material</w:t>
+            </w:r>
+          </w:p>
+        </w:tc>
+        <w:tc>
+          <w:tcPr>
+            <w:tcW w:w="3700" w:type="dxa"/>
+            <w:shd w:val="clear" w:color="auto" w:fill="FFFFFF"/>
+            <w:vAlign w:val="center"/>
+          </w:tcPr>
+          <w:p>
+            <w:pPr>
+              <w:keepNext/>
+              <w:keepLines/>
+              <w:spacing w:after="40" w:line="254" w:lineRule="auto"/>
+            </w:pPr>
+            <w:r>
+              <w:rPr>
+                <w:color w:val="000000"/>
+                <w:sz w:val="17"/>
+              </w:rPr>
+              <w:t xml:space="preserve">6/14; 21.4–67.4%</w:t>
+            </w:r>
+          </w:p>
+        </w:tc>
+      </w:tr>
+      <w:tr>
+        <w:trPr>
+          <w:cantSplit/>
+        </w:trPr>
+        <w:tc>
+          <w:tcPr>
+            <w:tcW w:w="4438" w:type="dxa"/>
+            <w:shd w:val="clear" w:color="auto" w:fill="FFFFFF"/>
+            <w:vAlign w:val="center"/>
+          </w:tcPr>
+          <w:p>
+            <w:pPr>
+              <w:keepNext/>
+              <w:keepLines/>
+              <w:spacing w:after="40" w:line="254" w:lineRule="auto"/>
+            </w:pPr>
+            <w:r>
+              <w:rPr>
+                <w:color w:val="000000"/>
+                <w:sz w:val="17"/>
+              </w:rPr>
+              <w:t xml:space="preserve">Fingerprint agreement (exploratory): Project Rock true takes in the final master</w:t>
+            </w:r>
+          </w:p>
+        </w:tc>
+        <w:tc>
+          <w:tcPr>
+            <w:tcW w:w="1500" w:type="dxa"/>
+            <w:shd w:val="clear" w:color="auto" w:fill="FFFFFF"/>
+            <w:vAlign w:val="center"/>
+          </w:tcPr>
+          <w:p>
+            <w:pPr>
+              <w:keepNext/>
+              <w:keepLines/>
+              <w:spacing w:after="40" w:line="254" w:lineRule="auto"/>
+            </w:pPr>
+            <w:r>
+              <w:rPr>
+                <w:color w:val="000000"/>
+                <w:sz w:val="17"/>
+              </w:rPr>
+              <w:t xml:space="preserve">real_material</w:t>
+            </w:r>
+          </w:p>
+        </w:tc>
+        <w:tc>
+          <w:tcPr>
+            <w:tcW w:w="3700" w:type="dxa"/>
+            <w:shd w:val="clear" w:color="auto" w:fill="FFFFFF"/>
+            <w:vAlign w:val="center"/>
+          </w:tcPr>
+          <w:p>
+            <w:pPr>
+              <w:keepNext/>
+              <w:keepLines/>
+              <w:spacing w:after="40" w:line="254" w:lineRule="auto"/>
+            </w:pPr>
+            <w:r>
+              <w:rPr>
+                <w:color w:val="000000"/>
+                <w:sz w:val="17"/>
+              </w:rPr>
+              <w:t xml:space="preserve">2/29; 1.9–22.0%</w:t>
+            </w:r>
+          </w:p>
+        </w:tc>
+      </w:tr>
+      <w:tr>
+        <w:trPr>
+          <w:cantSplit/>
+        </w:trPr>
+        <w:tc>
+          <w:tcPr>
+            <w:tcW w:w="4438" w:type="dxa"/>
+            <w:shd w:val="clear" w:color="auto" w:fill="FFFFFF"/>
+            <w:vAlign w:val="center"/>
+          </w:tcPr>
+          <w:p>
+            <w:pPr>
+              <w:keepNext/>
+              <w:keepLines/>
+              <w:spacing w:after="40" w:line="254" w:lineRule="auto"/>
+            </w:pPr>
+            <w:r>
+              <w:rPr>
+                <w:color w:val="000000"/>
+                <w:sz w:val="17"/>
+              </w:rPr>
+              <w:t xml:space="preserve">Fingerprint agreement (exploratory): Project Rock unrelated controls</w:t>
+            </w:r>
+          </w:p>
+        </w:tc>
+        <w:tc>
+          <w:tcPr>
+            <w:tcW w:w="1500" w:type="dxa"/>
+            <w:shd w:val="clear" w:color="auto" w:fill="FFFFFF"/>
+            <w:vAlign w:val="center"/>
+          </w:tcPr>
+          <w:p>
+            <w:pPr>
+              <w:keepNext/>
+              <w:keepLines/>
+              <w:spacing w:after="40" w:line="254" w:lineRule="auto"/>
+            </w:pPr>
+            <w:r>
+              <w:rPr>
+                <w:color w:val="000000"/>
+                <w:sz w:val="17"/>
+              </w:rPr>
+              <w:t xml:space="preserve">real_material</w:t>
+            </w:r>
+          </w:p>
+        </w:tc>
+        <w:tc>
+          <w:tcPr>
+            <w:tcW w:w="3700" w:type="dxa"/>
+            <w:shd w:val="clear" w:color="auto" w:fill="FFFFFF"/>
+            <w:vAlign w:val="center"/>
+          </w:tcPr>
+          <w:p>
+            <w:pPr>
+              <w:keepNext/>
+              <w:keepLines/>
+              <w:spacing w:after="40" w:line="254" w:lineRule="auto"/>
+            </w:pPr>
+            <w:r>
+              <w:rPr>
+                <w:color w:val="000000"/>
+                <w:sz w:val="17"/>
+              </w:rPr>
+              <w:t xml:space="preserve">0/33; 0–10.4%</w:t>
+            </w:r>
+          </w:p>
+        </w:tc>
+      </w:tr>
+    </w:tbl>
     <w:p>
       <w:pPr>
         <w:spacing w:line="276" w:lineRule="auto"/>
       </w:pPr>
       <w:r>
-        <w:t xml:space="preserve">A provider that ran but could not conclude because the audio offered too little to compare (silent signal, too few landmarks, peaks or spectral frames, or channel cancellation) is reported as AUDIO_INSUFFICIENT_SUPPORT with outcome insufficient_support. AUDIO_DIAGNOSTIC_UNAVAILABLE with outcome not_run remains for providers that did not run. music_semantics reports not_assessed_query_longer_than_source and not_assessed_local_match_failed instead of failing the provider. A fingerprint match in an AAF task is reported as AUDIO_AAF_RANGE_CORRESPONDENCE with the analysed source range and providers: content agreeing with the AAF edit, not provenance. audio_diagnostic_summary counts aaf_range_tasks and aaf_range_tasks_with_correspondence; an AAF task without a match is not reported as disagreement. On Project Rock Ep01, 6 of 14 AAF ranges were found in the WIP mix (SpectroMap for all six, audfprint for one), a whole-take match outside the used range disappeared, and the run took 19 s instead of 29 s.</w:t>
+        <w:t xml:space="preserve">A provider that ran but could not conclude because the audio offered too little to compare (silent signal, too few landmarks, peaks or spectral frames, or channel cancellation) is reported as AUDIO_INSUFFICIENT_SUPPORT with outcome insufficient_support. AUDIO_DIAGNOSTIC_UNAVAILABLE with outcome not_run remains for providers that did not run. music_semantics reports not_assessed_query_longer_than_source and not_assessed_local_match_failed instead of failing the provider. A fingerprint match in an AAF task is reported as AUDIO_AAF_RANGE_CORRESPONDENCE with the analysed source range and providers: content agreeing with the AAF edit, not provenance. audio_diagnostic_summary counts aaf_range_tasks and aaf_range_tasks_with_correspondence; an AAF task without a match is not reported as disagreement. On Project Rock Ep01, 6 of 14 AAF ranges were found in the WIP mix (SpectroMap for all six; audfprint had one candidate, below its support gates), a whole-take match outside the used range disappeared, and the run took 19 s instead of 29 s.</w:t>
       </w:r>
     </w:p>
     <w:p>
@@ -18704,7 +19525,7 @@
                 <w:color w:val="000000"/>
                 <w:sz w:val="17"/>
               </w:rPr>
-              <w:t>No audfprint, fingerprint-agreement or music_semantics match.</w:t>
+              <w:t xml:space="preserve">No audfprint, fingerprint-agreement or music_semantics match. 0/5 false (95% CI 0–43%).</w:t>
             </w:r>
           </w:p>
         </w:tc>
@@ -18772,7 +19593,7 @@
                 <w:color w:val="000000"/>
                 <w:sz w:val="17"/>
               </w:rPr>
-              <w:t>No match from any of the three.</w:t>
+              <w:t xml:space="preserve">No match from any of the three. 0/4 false (95% CI 0–49%).</w:t>
             </w:r>
           </w:p>
         </w:tc>
@@ -18840,7 +19661,7 @@
                 <w:color w:val="000000"/>
                 <w:sz w:val="17"/>
               </w:rPr>
-              <w:t>No fingerprint match; semantics supported 0/6. Left unclassified because the requested melodies were not found in the generated audio.</w:t>
+              <w:t xml:space="preserve">No fingerprint match; semantics supported 0/6. Left unclassified because the requested melodies were not found in the generated audio. 0/6 (95% CI 0–39%).</w:t>
             </w:r>
           </w:p>
         </w:tc>
@@ -18908,7 +19729,7 @@
                 <w:color w:val="000000"/>
                 <w:sz w:val="17"/>
               </w:rPr>
-              <w:t>audfprint and agreement detected the loop in 1/4 at the inserted offset; semantics 0/4.</w:t>
+              <w:t xml:space="preserve">audfprint and agreement detected the loop in 1/4 at the inserted offset; semantics 0/4. Detection 95% CI 5–70%.</w:t>
             </w:r>
           </w:p>
         </w:tc>
@@ -18973,7 +19794,7 @@
                 <w:color w:val="000000"/>
                 <w:sz w:val="17"/>
               </w:rPr>
-              <w:t>audfprint and agreement detected the loop in 4/4 at the inserted offset; semantics 0/4.</w:t>
+              <w:t xml:space="preserve">audfprint and agreement detected the loop in 4/4 at the inserted offset; semantics 0/4. Detection 95% CI 51–100%.</w:t>
             </w:r>
           </w:p>
         </w:tc>
@@ -18984,7 +19805,7 @@
         <w:spacing w:before="120"/>
       </w:pPr>
       <w:r>
-        <w:t>A shared loop is real shared audio, so a fingerprint detection is correct but does not show that one song derives from the other. These are case counts on a small Lumina sample, not population false-positive rates. Real covers, pitch-shifted and time-stretched fingerprint queries remain untested.</w:t>
+        <w:t xml:space="preserve">A shared loop is real shared audio, so a fingerprint detection is correct but does not show that one song derives from the other. These are case counts on a small Lumina sample, not population false-positive rates. Real covers, pitch-shifted and time-stretched fingerprint queries remain untested. The bracketed figures are 95% Wilson intervals: zero false matches in four pairs is still consistent with a false-match rate of up to 49%. The benchmark ran after the gates were frozen, so it is recorded as held-out.</w:t>
       </w:r>
     </w:p>
     <w:p>
@@ -28500,7 +29321,7 @@
                 <w:color w:val="000000"/>
                 <w:sz w:val="17"/>
               </w:rPr>
-              <w:t>music_benchmark.py adapts Slakh/BabySlakh and MUSDB18-HQ to Native requests with true stems and a control from another track; datasets are not bundled. false_match.py runs the false-match benchmark from a SHA-256-pinned manifest (false_match_lumina_2026-10-21.json) and can record its counts in policies/audio_calibration_status.json.</w:t>
+              <w:t xml:space="preserve">music_benchmark.py adapts Slakh/BabySlakh and MUSDB18-HQ to Native requests with true stems and a control from another track; datasets are not bundled. false_match.py runs the false-match benchmark from a SHA-256-pinned manifest (false_match_lumina_2026-10-21.json) and can record its counts in policies/audio_calibration_status.json. Both false_match.py and audio_calibration.py report every case count with its 95% Wilson interval; audio_calibration.py stores them in the summary of its output.</w:t>
             </w:r>
           </w:p>
         </w:tc>
@@ -30538,7 +31359,60 @@
           </w:tcPr>
           <w:p>
             <w:r>
-              <w:t>Per-provider calibration status, case counts, tested and untested transforms and false-match counts attached to every audio row. Does not change scoring.</w:t>
+              <w:t xml:space="preserve">Per-provider calibration status, case counts split into development, held-out and real material, tested and untested transforms and false-match counts, each count with a 95% Wilson interval; attached to every audio row. Does not change scoring.</w:t>
+            </w:r>
+          </w:p>
+        </w:tc>
+      </w:tr>
+      <w:tr>
+        <w:trPr>
+          <w:cantSplit/>
+        </w:trPr>
+        <w:tc>
+          <w:tcPr>
+            <w:tcW w:w="3855" w:type="dxa"/>
+            <w:tcBorders>
+              <w:top w:val="single" w:sz="4" w:space="0" w:color="C9D3DF"/>
+              <w:left w:val="single" w:sz="4" w:space="0" w:color="C9D3DF"/>
+              <w:bottom w:val="single" w:sz="4" w:space="0" w:color="C9D3DF"/>
+              <w:right w:val="single" w:sz="4" w:space="0" w:color="C9D3DF"/>
+            </w:tcBorders>
+            <w:shd w:val="clear" w:color="auto" w:fill="EDF3F9"/>
+            <w:tcMar>
+              <w:top w:w="70" w:type="dxa"/>
+              <w:left w:w="110" w:type="dxa"/>
+              <w:bottom w:w="70" w:type="dxa"/>
+              <w:right w:w="110" w:type="dxa"/>
+            </w:tcMar>
+            <w:vAlign w:val="center"/>
+          </w:tcPr>
+          <w:p>
+            <w:r>
+              <w:t xml:space="preserve">music_target/case_intervals.py</w:t>
+            </w:r>
+          </w:p>
+        </w:tc>
+        <w:tc>
+          <w:tcPr>
+            <w:tcW w:w="5783" w:type="dxa"/>
+            <w:tcBorders>
+              <w:top w:val="single" w:sz="4" w:space="0" w:color="C9D3DF"/>
+              <w:left w:val="single" w:sz="4" w:space="0" w:color="C9D3DF"/>
+              <w:bottom w:val="single" w:sz="4" w:space="0" w:color="C9D3DF"/>
+              <w:right w:val="single" w:sz="4" w:space="0" w:color="C9D3DF"/>
+            </w:tcBorders>
+            <w:shd w:val="clear" w:color="auto" w:fill="EDF3F9"/>
+            <w:tcMar>
+              <w:top w:w="70" w:type="dxa"/>
+              <w:left w:w="110" w:type="dxa"/>
+              <w:bottom w:w="70" w:type="dxa"/>
+              <w:right w:w="110" w:type="dxa"/>
+            </w:tcMar>
+            <w:vAlign w:val="center"/>
+          </w:tcPr>
+          <w:p>
+            <w:r>
+              <w:t xml:space="preserve">95% Wilson score intervals for case counts, used by the calibration status and both benchmark scripts.</w:t>
             </w:r>
           </w:p>
         </w:tc>
@@ -31282,6 +32156,59 @@
           </w:tcPr>
           <w:p>
             <w:r>
+              <w:t xml:space="preserve">tests/test_case_intervals.py</w:t>
+            </w:r>
+          </w:p>
+        </w:tc>
+        <w:tc>
+          <w:tcPr>
+            <w:tcW w:w="5783" w:type="dxa"/>
+            <w:tcBorders>
+              <w:top w:val="single" w:sz="4" w:space="0" w:color="C9D3DF"/>
+              <w:left w:val="single" w:sz="4" w:space="0" w:color="C9D3DF"/>
+              <w:bottom w:val="single" w:sz="4" w:space="0" w:color="C9D3DF"/>
+              <w:right w:val="single" w:sz="4" w:space="0" w:color="C9D3DF"/>
+            </w:tcBorders>
+            <w:shd w:val="clear" w:color="auto" w:fill="FFFFFF"/>
+            <w:tcMar>
+              <w:top w:w="70" w:type="dxa"/>
+              <w:left w:w="110" w:type="dxa"/>
+              <w:bottom w:w="70" w:type="dxa"/>
+              <w:right w:w="110" w:type="dxa"/>
+            </w:tcMar>
+            <w:vAlign w:val="center"/>
+          </w:tcPr>
+          <w:p>
+            <w:r>
+              <w:t xml:space="preserve">10 tests: interval values, bounds and symmetry, every stored interval recomputed from its count, held-out splits, and the benchmark summaries.</w:t>
+            </w:r>
+          </w:p>
+        </w:tc>
+      </w:tr>
+      <w:tr>
+        <w:trPr>
+          <w:cantSplit/>
+        </w:trPr>
+        <w:tc>
+          <w:tcPr>
+            <w:tcW w:w="3855" w:type="dxa"/>
+            <w:tcBorders>
+              <w:top w:val="single" w:sz="4" w:space="0" w:color="C9D3DF"/>
+              <w:left w:val="single" w:sz="4" w:space="0" w:color="C9D3DF"/>
+              <w:bottom w:val="single" w:sz="4" w:space="0" w:color="C9D3DF"/>
+              <w:right w:val="single" w:sz="4" w:space="0" w:color="C9D3DF"/>
+            </w:tcBorders>
+            <w:shd w:val="clear" w:color="auto" w:fill="FFFFFF"/>
+            <w:tcMar>
+              <w:top w:w="70" w:type="dxa"/>
+              <w:left w:w="110" w:type="dxa"/>
+              <w:bottom w:w="70" w:type="dxa"/>
+              <w:right w:w="110" w:type="dxa"/>
+            </w:tcMar>
+            <w:vAlign w:val="center"/>
+          </w:tcPr>
+          <w:p>
+            <w:r>
               <w:t>tests/test_builder.py / test_builder_results.py / test_local_file_references.py</w:t>
             </w:r>
           </w:p>
@@ -31437,7 +32364,7 @@
     </w:p>
     <w:p>
       <w:r>
-        <w:t xml:space="preserve">On 22 October 2026, the 308 non-GUI tests were run against version 0.8.0 with REQUIRE_AUDIO_BACKENDS=1, so every optional backend had to be present: all 308 passed in 26.7 seconds, with no failures, errors or skips. For version 0.8.1 the same procedure ran 328 non-GUI tests in one process (all passed in 31 seconds, no skips) and each of the four test_builder.GuiTests cases in a separate process (all passed); reports/test-results.txt and reports/release.json record the run. The environment included c2pa-python 0.37.10, the audio libraries and the benchmark-only mir_eval 0.8.2 from requirements-benchmark.txt. A writable NUMBA_CACHE_DIR was supplied because the default audio library cache location may not be writable.</w:t>
+        <w:t xml:space="preserve">On 22 October 2026, the 308 non-GUI tests were run against version 0.8.0 with REQUIRE_AUDIO_BACKENDS=1, so every optional backend had to be present: all 308 passed in 26.7 seconds, with no failures, errors or skips. For version 0.8.1 the same procedure ran 328 non-GUI tests in one process (all passed in 31 seconds, no skips). After the Wilson intervals were added on 23 October 2026 it ran 338 non-GUI tests in one process (all passed in 30 seconds, no skips) and each of the four test_builder.GuiTests cases in a separate process (all passed); reports/test-results.txt and reports/release.json record the run. The environment included c2pa-python 0.37.10, the audio libraries and the benchmark-only mir_eval 0.8.2 from requirements-benchmark.txt. A writable NUMBA_CACHE_DIR was supplied because the default audio library cache location may not be writable.</w:t>
       </w:r>
     </w:p>
     <w:p>
@@ -31451,7 +32378,7 @@
     <w:p>
       <w:r>
         <w:lastRenderedPageBreak/>
-        <w:t xml:space="preserve">The current discovery contains 332 cases: 131 core; 41 audio diagnostics; 24 C2PA; 22 remediation; 19 non-GUI builder; 15 builder-result; 14 scoring-remediation; 12 local-file-reference; 27 production-document; 9 audio calibration; 6 DAW-session; 5 structure benchmark; 3 music benchmark; and 4 GUI cases. Run GUI cases in separate processes when investigating macOS Tk lifecycle hangs; do not treat excluded cases as passes or skips.</w:t>
+        <w:t xml:space="preserve">The current discovery contains 342 cases: 131 core; 41 audio diagnostics; 24 C2PA; 22 remediation; 19 non-GUI builder; 15 builder-result; 14 scoring-remediation; 12 local-file-reference; 27 production-document; 9 audio calibration; 10 case-interval; 6 DAW-session; 5 structure benchmark; 3 music benchmark; and 4 GUI cases. Run GUI cases in separate processes when investigating macOS Tk lifecycle hangs; do not treat excluded cases as passes or skips.</w:t>
       </w:r>
     </w:p>
     <w:p>
@@ -31472,7 +32399,7 @@
         <w:spacing w:line="276" w:lineRule="auto"/>
       </w:pPr>
       <w:r>
-        <w:t xml:space="preserve">Version 0.8.1 applies the Project Rock findings: recorder metadata only for files that name their recording, raw takes accepted by mixed_from, AAF take coverage and non-recorder media, contradiction counts in integrity_decision, AAF-range audio diagnostics and the BWF chronology warning. Only the mixed_from change can alter a score. The example responses under examples/ were regenerated with 0.8.1; since their 0.7.0 snapshots, attestation_strength reads 0.0 rather than null for files without a C2PA manifest, as defined in 0.8.0. It also aligns the desktop builder's size limits with the evaluator and removes duplicate builder and relationship_modes modules from music_target/.</w:t>
+        <w:t xml:space="preserve">Version 0.8.1 applies the Project Rock findings: recorder metadata only for files that name their recording, raw takes accepted by mixed_from, AAF take coverage and non-recorder media, contradiction counts in integrity_decision, AAF-range audio diagnostics and the BWF chronology warning. Only the mixed_from change can alter a score. The example responses under examples/ were regenerated with 0.8.1; since their 0.7.0 snapshots, attestation_strength reads 0.0 rather than null for files without a C2PA manifest, as defined in 0.8.0. It also aligns the desktop builder's size limits with the evaluator and removes duplicate builder and relationship_modes modules from music_target/. On 23 October 2026 every audio calibration and false-match count gained a 95% Wilson interval and a development, held-out or real-material split; no score, gate or finding changed, and the example responses were regenerated because the status file is part of source_revision.</w:t>
       </w:r>
     </w:p>
     <w:p>
@@ -31703,7 +32630,7 @@
         <w:spacing w:after="60" w:line="276" w:lineRule="auto"/>
       </w:pPr>
       <w:r>
-        <w:t xml:space="preserve">Calibration figures are case counts on small samples, not population accuracy or false-positive rates. Pitch-shifted and time-stretched fingerprint queries and alternate takes are untested, and SpectroMap, librosa and fingerprint agreement are uncalibrated. AAF-range tasks compare only the seconds an edit used; a few seconds of dialogue give audfprint fewer landmarks, so on Project Rock Ep01 it supported one AAF range where the whole-take run had supported two.</w:t>
+        <w:t xml:space="preserve">Calibration figures are case counts on small samples, not population accuracy or false-positive rates. Pitch-shifted and time-stretched fingerprint queries and alternate takes are untested, and SpectroMap, librosa and fingerprint agreement are uncalibrated. AAF-range tasks compare only the seconds an edit used; a few seconds of dialogue give audfprint fewer landmarks, so on Project Rock Ep01 it supported none of the 14 AAF ranges (one candidate fell below the support gates) where the whole-take run had supported two takes. Every count carries a 95% Wilson interval; the intervals treat cases as independent, which cases from one family or session are not.</w:t>
       </w:r>
     </w:p>
     <w:p>

</xml_diff>

<commit_message>
Add FLAC and MP3 support: content-based detection, FLAC metadata and MD5 check, MP3 frame walking with exact or estimated length, C2PA in ID3 GEOB, diagnostics decoding, public CSEC types, builder probe, docs and 30 tests
</commit_message>
<xml_diff>
--- a/Manual_layout_check.docx
+++ b/Manual_layout_check.docx
@@ -425,7 +425,7 @@
           </w:tcPr>
           <w:p>
             <w:r>
-              <w:t xml:space="preserve">342 tests discovered. All 338 non-GUI tests passed with every optional backend required; the four GUI tests passed when run separately; see Section 9.</w:t>
+              <w:t xml:space="preserve">372 tests discovered. All 368 non-GUI tests passed with every optional backend required; the four GUI tests passed when run separately; see Section 9.</w:t>
             </w:r>
           </w:p>
         </w:tc>
@@ -5675,7 +5675,7 @@
     </w:p>
     <w:p>
       <w:r>
-        <w:t>The desktop summary displays the audio_fingerprint, audio_fingerprint_agreement, audio_structure and audio_semantics rows grouped by file pair, each with its calibration status, together with any C2PA problem state of the final artefact. The importer reads WAV technical fields with wav_probe.py, which accepts the same integer PCM, IEEE float and WAVE_FORMAT_EXTENSIBLE encodings as the core decoder.</w:t>
+        <w:t xml:space="preserve">The desktop summary displays the audio_fingerprint, audio_fingerprint_agreement, audio_structure and audio_semantics rows grouped by file pair, each with its calibration status, together with any C2PA problem state of the final artefact. The importer reads WAV technical fields with wav_probe.py, which accepts the same integer PCM, IEEE float and WAVE_FORMAT_EXTENSIBLE encodings as the core decoder. FLAC and MP3 are read with the evaluator's own parsers (wav_probe.audio_technical), which fill in only the fields each format carries: no MP3 bit depth, and an MP3 duration only when the file states its exact length.</w:t>
       </w:r>
     </w:p>
     <w:p>
@@ -6041,7 +6041,7 @@
     </w:p>
     <w:p>
       <w:r>
-        <w:t>The CSEC adapter maps audio/wav to generic audio and retains the agreed draft-of.audio relationship. It does not invent stems, creation methods or a music workflow. Without a workflow, completeness is the legacy bound-object fraction, reported as partial with confidence null and WORKFLOW_POLICY_NOT_APPLIED.</w:t>
+        <w:t xml:space="preserve">The CSEC adapter maps audio/wav, audio/flac and audio/mpeg to generic audio and retains the agreed draft-of.audio relationship. It does not invent stems, creation methods or a music workflow. Without a workflow, completeness is the legacy bound-object fraction, reported as partial with confidence null and WORKFLOW_POLICY_NOT_APPLIED. The request schema's object-path pattern also accepts .flac and .mp3; this local extension of the supplied candidate schema needs CSEC's agreement.</w:t>
       </w:r>
     </w:p>
     <w:p>
@@ -11749,7 +11749,289 @@
                 <w:color w:val="000000"/>
                 <w:sz w:val="17"/>
               </w:rPr>
-              <w:t>Integer PCM 8/16/24/32-bit and IEEE float 32/64-bit, including supported extensible subformats; 1–32 channels and 1–384000 Hz. Header and chunk inspection is streaming. Complete audio followed by damaged metadata may be retained with a warning. RF64/BW64 and compressed codecs are unsupported.</w:t>
+              <w:t xml:space="preserve">Integer PCM 8/16/24/32-bit and IEEE float 32/64-bit, including supported extensible subformats; 1–32 channels and 1–384000 Hz. Header and chunk inspection is streaming. Complete audio followed by damaged metadata may be retained with a warning. RF64/BW64 and compressed codecs are unsupported. The file content, not the extension, decides the format.</w:t>
+            </w:r>
+          </w:p>
+        </w:tc>
+      </w:tr>
+      <w:tr>
+        <w:trPr>
+          <w:cantSplit/>
+        </w:trPr>
+        <w:tc>
+          <w:tcPr>
+            <w:tcW w:w="1709" w:type="dxa"/>
+            <w:tcBorders>
+              <w:top w:val="single" w:sz="4" w:space="0" w:color="C9D3DF"/>
+              <w:left w:val="single" w:sz="4" w:space="0" w:color="C9D3DF"/>
+              <w:bottom w:val="single" w:sz="4" w:space="0" w:color="C9D3DF"/>
+              <w:right w:val="single" w:sz="4" w:space="0" w:color="C9D3DF"/>
+            </w:tcBorders>
+            <w:shd w:val="clear" w:color="auto" w:fill="FFFFFF"/>
+            <w:tcMar>
+              <w:top w:w="70" w:type="dxa"/>
+              <w:left w:w="110" w:type="dxa"/>
+              <w:bottom w:w="70" w:type="dxa"/>
+              <w:right w:w="110" w:type="dxa"/>
+            </w:tcMar>
+            <w:vAlign w:val="center"/>
+          </w:tcPr>
+          <w:p>
+            <w:pPr>
+              <w:keepNext/>
+              <w:keepLines/>
+              <w:spacing w:after="40" w:line="254" w:lineRule="auto"/>
+            </w:pPr>
+            <w:r>
+              <w:rPr>
+                <w:bCs/>
+                <w:color w:val="000000"/>
+                <w:sz w:val="17"/>
+                <w:szCs w:val="18"/>
+              </w:rPr>
+              <w:t xml:space="preserve">FLAC</w:t>
+            </w:r>
+          </w:p>
+        </w:tc>
+        <w:tc>
+          <w:tcPr>
+            <w:tcW w:w="2098" w:type="dxa"/>
+            <w:tcBorders>
+              <w:top w:val="single" w:sz="4" w:space="0" w:color="C9D3DF"/>
+              <w:left w:val="single" w:sz="4" w:space="0" w:color="C9D3DF"/>
+              <w:bottom w:val="single" w:sz="4" w:space="0" w:color="C9D3DF"/>
+              <w:right w:val="single" w:sz="4" w:space="0" w:color="C9D3DF"/>
+            </w:tcBorders>
+            <w:shd w:val="clear" w:color="auto" w:fill="FFFFFF"/>
+            <w:tcMar>
+              <w:top w:w="70" w:type="dxa"/>
+              <w:left w:w="110" w:type="dxa"/>
+              <w:bottom w:w="70" w:type="dxa"/>
+              <w:right w:w="110" w:type="dxa"/>
+            </w:tcMar>
+            <w:vAlign w:val="center"/>
+          </w:tcPr>
+          <w:p>
+            <w:pPr>
+              <w:keepNext/>
+              <w:keepLines/>
+              <w:spacing w:after="40" w:line="254" w:lineRule="auto"/>
+            </w:pPr>
+            <w:r>
+              <w:rPr>
+                <w:color w:val="000000"/>
+                <w:sz w:val="17"/>
+                <w:szCs w:val="18"/>
+              </w:rPr>
+              <w:t xml:space="preserve">.flac</w:t>
+            </w:r>
+          </w:p>
+        </w:tc>
+        <w:tc>
+          <w:tcPr>
+            <w:tcW w:w="1709" w:type="dxa"/>
+            <w:tcBorders>
+              <w:top w:val="single" w:sz="4" w:space="0" w:color="C9D3DF"/>
+              <w:left w:val="single" w:sz="4" w:space="0" w:color="C9D3DF"/>
+              <w:bottom w:val="single" w:sz="4" w:space="0" w:color="C9D3DF"/>
+              <w:right w:val="single" w:sz="4" w:space="0" w:color="C9D3DF"/>
+            </w:tcBorders>
+            <w:shd w:val="clear" w:color="auto" w:fill="FFFFFF"/>
+            <w:tcMar>
+              <w:top w:w="70" w:type="dxa"/>
+              <w:left w:w="110" w:type="dxa"/>
+              <w:bottom w:w="70" w:type="dxa"/>
+              <w:right w:w="110" w:type="dxa"/>
+            </w:tcMar>
+            <w:vAlign w:val="center"/>
+          </w:tcPr>
+          <w:p>
+            <w:pPr>
+              <w:keepNext/>
+              <w:keepLines/>
+              <w:spacing w:after="40" w:line="254" w:lineRule="auto"/>
+            </w:pPr>
+            <w:r>
+              <w:rPr>
+                <w:color w:val="000000"/>
+                <w:sz w:val="17"/>
+                <w:szCs w:val="18"/>
+              </w:rPr>
+              <w:t xml:space="preserve">Implemented (after 0.8.1)</w:t>
+            </w:r>
+          </w:p>
+        </w:tc>
+        <w:tc>
+          <w:tcPr>
+            <w:tcW w:w="4122" w:type="dxa"/>
+            <w:tcBorders>
+              <w:top w:val="single" w:sz="4" w:space="0" w:color="C9D3DF"/>
+              <w:left w:val="single" w:sz="4" w:space="0" w:color="C9D3DF"/>
+              <w:bottom w:val="single" w:sz="4" w:space="0" w:color="C9D3DF"/>
+              <w:right w:val="single" w:sz="4" w:space="0" w:color="C9D3DF"/>
+            </w:tcBorders>
+            <w:shd w:val="clear" w:color="auto" w:fill="FFFFFF"/>
+            <w:tcMar>
+              <w:top w:w="70" w:type="dxa"/>
+              <w:left w:w="110" w:type="dxa"/>
+              <w:bottom w:w="70" w:type="dxa"/>
+              <w:right w:w="110" w:type="dxa"/>
+            </w:tcMar>
+            <w:vAlign w:val="center"/>
+          </w:tcPr>
+          <w:p>
+            <w:pPr>
+              <w:keepNext/>
+              <w:keepLines/>
+              <w:spacing w:after="40" w:line="254" w:lineRule="auto"/>
+            </w:pPr>
+            <w:r>
+              <w:rPr>
+                <w:color w:val="000000"/>
+                <w:sz w:val="17"/>
+              </w:rPr>
+              <w:t xml:space="preserve">1–8 channels and 1–384000 Hz. Metadata blocks parsed with bounds; WAV chunks kept by flac --keep-foreign-metadata (bext, iXML, LIST) are recorder metadata; the decoded-audio MD5 is checked against STREAMINFO (flac_md5_matches_decoded_audio).</w:t>
+            </w:r>
+          </w:p>
+        </w:tc>
+      </w:tr>
+      <w:tr>
+        <w:trPr>
+          <w:cantSplit/>
+        </w:trPr>
+        <w:tc>
+          <w:tcPr>
+            <w:tcW w:w="1709" w:type="dxa"/>
+            <w:tcBorders>
+              <w:top w:val="single" w:sz="4" w:space="0" w:color="C9D3DF"/>
+              <w:left w:val="single" w:sz="4" w:space="0" w:color="C9D3DF"/>
+              <w:bottom w:val="single" w:sz="4" w:space="0" w:color="C9D3DF"/>
+              <w:right w:val="single" w:sz="4" w:space="0" w:color="C9D3DF"/>
+            </w:tcBorders>
+            <w:shd w:val="clear" w:color="auto" w:fill="FFFFFF"/>
+            <w:tcMar>
+              <w:top w:w="70" w:type="dxa"/>
+              <w:left w:w="110" w:type="dxa"/>
+              <w:bottom w:w="70" w:type="dxa"/>
+              <w:right w:w="110" w:type="dxa"/>
+            </w:tcMar>
+            <w:vAlign w:val="center"/>
+          </w:tcPr>
+          <w:p>
+            <w:pPr>
+              <w:keepNext/>
+              <w:keepLines/>
+              <w:spacing w:after="40" w:line="254" w:lineRule="auto"/>
+            </w:pPr>
+            <w:r>
+              <w:rPr>
+                <w:bCs/>
+                <w:color w:val="000000"/>
+                <w:sz w:val="17"/>
+                <w:szCs w:val="18"/>
+              </w:rPr>
+              <w:t xml:space="preserve">MP3</w:t>
+            </w:r>
+          </w:p>
+        </w:tc>
+        <w:tc>
+          <w:tcPr>
+            <w:tcW w:w="2098" w:type="dxa"/>
+            <w:tcBorders>
+              <w:top w:val="single" w:sz="4" w:space="0" w:color="C9D3DF"/>
+              <w:left w:val="single" w:sz="4" w:space="0" w:color="C9D3DF"/>
+              <w:bottom w:val="single" w:sz="4" w:space="0" w:color="C9D3DF"/>
+              <w:right w:val="single" w:sz="4" w:space="0" w:color="C9D3DF"/>
+            </w:tcBorders>
+            <w:shd w:val="clear" w:color="auto" w:fill="FFFFFF"/>
+            <w:tcMar>
+              <w:top w:w="70" w:type="dxa"/>
+              <w:left w:w="110" w:type="dxa"/>
+              <w:bottom w:w="70" w:type="dxa"/>
+              <w:right w:w="110" w:type="dxa"/>
+            </w:tcMar>
+            <w:vAlign w:val="center"/>
+          </w:tcPr>
+          <w:p>
+            <w:pPr>
+              <w:keepNext/>
+              <w:keepLines/>
+              <w:spacing w:after="40" w:line="254" w:lineRule="auto"/>
+            </w:pPr>
+            <w:r>
+              <w:rPr>
+                <w:color w:val="000000"/>
+                <w:sz w:val="17"/>
+                <w:szCs w:val="18"/>
+              </w:rPr>
+              <w:t xml:space="preserve">.mp3</w:t>
+            </w:r>
+          </w:p>
+        </w:tc>
+        <w:tc>
+          <w:tcPr>
+            <w:tcW w:w="1709" w:type="dxa"/>
+            <w:tcBorders>
+              <w:top w:val="single" w:sz="4" w:space="0" w:color="C9D3DF"/>
+              <w:left w:val="single" w:sz="4" w:space="0" w:color="C9D3DF"/>
+              <w:bottom w:val="single" w:sz="4" w:space="0" w:color="C9D3DF"/>
+              <w:right w:val="single" w:sz="4" w:space="0" w:color="C9D3DF"/>
+            </w:tcBorders>
+            <w:shd w:val="clear" w:color="auto" w:fill="FFFFFF"/>
+            <w:tcMar>
+              <w:top w:w="70" w:type="dxa"/>
+              <w:left w:w="110" w:type="dxa"/>
+              <w:bottom w:w="70" w:type="dxa"/>
+              <w:right w:w="110" w:type="dxa"/>
+            </w:tcMar>
+            <w:vAlign w:val="center"/>
+          </w:tcPr>
+          <w:p>
+            <w:pPr>
+              <w:keepNext/>
+              <w:keepLines/>
+              <w:spacing w:after="40" w:line="254" w:lineRule="auto"/>
+            </w:pPr>
+            <w:r>
+              <w:rPr>
+                <w:color w:val="000000"/>
+                <w:sz w:val="17"/>
+                <w:szCs w:val="18"/>
+              </w:rPr>
+              <w:t xml:space="preserve">Implemented (after 0.8.1)</w:t>
+            </w:r>
+          </w:p>
+        </w:tc>
+        <w:tc>
+          <w:tcPr>
+            <w:tcW w:w="4122" w:type="dxa"/>
+            <w:tcBorders>
+              <w:top w:val="single" w:sz="4" w:space="0" w:color="C9D3DF"/>
+              <w:left w:val="single" w:sz="4" w:space="0" w:color="C9D3DF"/>
+              <w:bottom w:val="single" w:sz="4" w:space="0" w:color="C9D3DF"/>
+              <w:right w:val="single" w:sz="4" w:space="0" w:color="C9D3DF"/>
+            </w:tcBorders>
+            <w:shd w:val="clear" w:color="auto" w:fill="FFFFFF"/>
+            <w:tcMar>
+              <w:top w:w="70" w:type="dxa"/>
+              <w:left w:w="110" w:type="dxa"/>
+              <w:bottom w:w="70" w:type="dxa"/>
+              <w:right w:w="110" w:type="dxa"/>
+            </w:tcMar>
+            <w:vAlign w:val="center"/>
+          </w:tcPr>
+          <w:p>
+            <w:pPr>
+              <w:keepNext/>
+              <w:keepLines/>
+              <w:spacing w:after="40" w:line="254" w:lineRule="auto"/>
+            </w:pPr>
+            <w:r>
+              <w:rPr>
+                <w:color w:val="000000"/>
+                <w:sz w:val="17"/>
+              </w:rPr>
+              <w:t xml:space="preserve">MPEG-1, 2 and 2.5 Layer III. Every frame header is walked; the exact length comes only from a Xing/Info header with encoder delay and padding, otherwise duration_seconds is null and an estimate is given. No bit depth or recorder metadata, so those checks are unavailable (AUDIO_FORMAT_LIMITED_CHECKS). Layer I/II and free-format bitrates are unsupported.</w:t>
             </w:r>
           </w:p>
         </w:tc>
@@ -13059,7 +13341,15 @@
         <w:spacing w:line="276" w:lineRule="auto"/>
       </w:pPr>
       <w:r>
-        <w:t>The core accepts at most 128 artefacts, 512 MiB per object and 1 GiB of bound objects per request. JSON input is limited to 2 MiB. WAV metadata chunks have a 1 MiB read limit, at most 1024 chunks are inspected, and sample decoding reads at most 16 MiB per block. These are separate from the optional workers, which may collect whole selected ranges into memory.</w:t>
+        <w:t xml:space="preserve">FLAC and MP3 are detected by content (music_target/audio_formats.py). ID3v2 tags before the audio are skipped before deciding, because the C2PA SDK writes one before the fLaC marker of a signed FLAC. A FLAC take's kept WAV chunks feed the same recorder-metadata, sound-report, AAF and chronology checks as a WAV take; a FLAC recording (audio/raw-take or audio/raw-track) without them receives the informational FLAC_RECORDER_METADATA_ABSENT. flac_md5_matches_decoded_audio decodes the audio with soundfile and is scored in the file-integrity layer like the WAV technical checks; an MD5 that was not stored, a bit depth libsndfile cannot decode, or the caller's deadline makes it unavailable. Declared MP3 fields that cannot be measured give checks with passed null and status unavailable, never contradictions. FLAC and MP3 observations use AUDIO_OBSERVATION and AUDIO_PARSER_FAILED (rule audio_parser_available) with an audio_format field; WAV keeps WAV_OBSERVATION and WAV_PARSER_FAILED. Scoring follows the existing WAV rules and may change with the scoring update in progress.</w:t>
+      </w:r>
+    </w:p>
+    <w:p>
+      <w:pPr>
+        <w:spacing w:line="276" w:lineRule="auto"/>
+      </w:pPr>
+      <w:r>
+        <w:t xml:space="preserve">The core accepts at most 128 artefacts, 512 MiB per object and 1 GiB of bound objects per request. JSON input is limited to 2 MiB. WAV metadata chunks have a 1 MiB read limit, at most 1024 chunks are inspected, and sample decoding reads at most 16 MiB per block. These are separate from the optional workers, which may collect whole selected ranges into memory. FLAC metadata blocks have the same 1 MiB read limit and at most 1024 are read; ID3v2 text frames are read up to 64 KiB, compressed or encrypted frames are not decoded, and the search for the first MPEG frame covers 64 KiB.</w:t>
       </w:r>
     </w:p>
     <w:p>
@@ -13428,7 +13718,7 @@
                 <w:sz w:val="17"/>
                 <w:szCs w:val="18"/>
               </w:rPr>
-              <w:t xml:space="preserve">RIFF/WAVE structure, technical claims vs measured values, embedded metadata and recorder BWF/iXML fields; non-final failures become </w:t>
+              <w:t xml:space="preserve">RIFF/WAVE, FLAC block and MP3 frame structure (decided by content), technical claims vs measured values, embedded metadata and recorder BWF/iXML fields; non-final failures become parser_failed. FLAC adds the decoded-audio MD5 check.</w:t>
             </w:r>
             <w:r>
               <w:rPr>
@@ -13437,15 +13727,15 @@
                 <w:sz w:val="17"/>
                 <w:szCs w:val="16"/>
               </w:rPr>
-              <w:t>parser_failed</w:t>
-            </w:r>
-            <w:r>
-              <w:rPr>
-                <w:color w:val="000000"/>
-                <w:sz w:val="17"/>
-                <w:szCs w:val="18"/>
-              </w:rPr>
-              <w:t>.</w:t>
+              <w:t/>
+            </w:r>
+            <w:r>
+              <w:rPr>
+                <w:color w:val="000000"/>
+                <w:sz w:val="17"/>
+                <w:szCs w:val="18"/>
+              </w:rPr>
+              <w:t/>
             </w:r>
           </w:p>
         </w:tc>
@@ -25903,7 +26193,7 @@
         <w:spacing w:line="276" w:lineRule="auto"/>
       </w:pPr>
       <w:r>
-        <w:t>A WAV file can carry an embedded manifest only in a RIFF chunk with the identifier C2PA. The WAV parser's embedded_metadata.other_chunks list is therefore a precondition for every reader outcome (_reconcile_with_c2pa_chunk in assessment_passes.py). If the SDK fails on a file with no C2PA chunk, a warning is recorded and the file is treated as having no manifest. If the file has a C2PA chunk but the SDK fails or finds no manifest in it, the manifest is unreadable, not absent. When the WAV parser itself fails, the chunk list is unknown and the SDK result is kept. c2pa_chunk_present records the observation on the parser record.</w:t>
+        <w:t xml:space="preserve">A WAV file can carry an embedded manifest only in a RIFF chunk with the identifier C2PA. The WAV parser's embedded_metadata.other_chunks list is therefore a precondition for every reader outcome (_reconcile_with_c2pa_chunk in assessment_passes.py). If the SDK fails on a file with no C2PA chunk, a warning is recorded and the file is treated as having no manifest. If the file has a C2PA chunk but the SDK fails or finds no manifest in it, the manifest is unreadable, not absent. When the WAV parser itself fails, the chunk list is unknown and the SDK result is kept. c2pa_chunk_present records the observation on the parser record. FLAC and MP3 keep a manifest in an ID3v2 GEOB frame of type application/c2pa, and the same rule uses that frame (embedded_metadata.c2pa_container_present).</w:t>
       </w:r>
     </w:p>
     <w:p>
@@ -29176,7 +29466,7 @@
                 <w:sz w:val="17"/>
                 <w:szCs w:val="18"/>
               </w:rPr>
-              <w:t>Pinned core packages including jsonschema, numpy, pypdf, xmlschema, pyaaf2 and c2pa-python with its dependencies.</w:t>
+              <w:t xml:space="preserve">Pinned core packages including jsonschema, numpy, pypdf, xmlschema, pyaaf2, soundfile (FLAC and MP3 decoding) and c2pa-python with its dependencies.</w:t>
             </w:r>
           </w:p>
         </w:tc>
@@ -29374,7 +29664,7 @@
           </w:tcPr>
           <w:p>
             <w:r>
-              <w:t>Tk desktop builder, background imports and exports, verified full-assessment staging, Native local references and human-readable result summaries. Results show audio summaries grouped by pair, calibration status and C2PA problem states. wav_probe.py reads WAV header fields for import and accepts the same encodings as the core decoder.</w:t>
+              <w:t xml:space="preserve">Tk desktop builder, background imports and exports, verified full-assessment staging, Native local references and human-readable result summaries. Results show audio summaries grouped by pair, calibration status and C2PA problem states. wav_probe.py reads WAV header fields, and FLAC and MP3 through the evaluator's parsers, for import, accepting the same formats as the core.</w:t>
             </w:r>
           </w:p>
         </w:tc>
@@ -31413,6 +31703,59 @@
           <w:p>
             <w:r>
               <w:t xml:space="preserve">95% Wilson score intervals for case counts, used by the calibration status and both benchmark scripts.</w:t>
+            </w:r>
+          </w:p>
+        </w:tc>
+      </w:tr>
+      <w:tr>
+        <w:trPr>
+          <w:cantSplit/>
+        </w:trPr>
+        <w:tc>
+          <w:tcPr>
+            <w:tcW w:w="3855" w:type="dxa"/>
+            <w:tcBorders>
+              <w:top w:val="single" w:sz="4" w:space="0" w:color="C9D3DF"/>
+              <w:left w:val="single" w:sz="4" w:space="0" w:color="C9D3DF"/>
+              <w:bottom w:val="single" w:sz="4" w:space="0" w:color="C9D3DF"/>
+              <w:right w:val="single" w:sz="4" w:space="0" w:color="C9D3DF"/>
+            </w:tcBorders>
+            <w:shd w:val="clear" w:color="auto" w:fill="EDF3F9"/>
+            <w:tcMar>
+              <w:top w:w="70" w:type="dxa"/>
+              <w:left w:w="110" w:type="dxa"/>
+              <w:bottom w:w="70" w:type="dxa"/>
+              <w:right w:w="110" w:type="dxa"/>
+            </w:tcMar>
+            <w:vAlign w:val="center"/>
+          </w:tcPr>
+          <w:p>
+            <w:r>
+              <w:t xml:space="preserve">music_target/audio_formats.py, flac_io.py, mp3_io.py, audio_observations.py</w:t>
+            </w:r>
+          </w:p>
+        </w:tc>
+        <w:tc>
+          <w:tcPr>
+            <w:tcW w:w="5783" w:type="dxa"/>
+            <w:tcBorders>
+              <w:top w:val="single" w:sz="4" w:space="0" w:color="C9D3DF"/>
+              <w:left w:val="single" w:sz="4" w:space="0" w:color="C9D3DF"/>
+              <w:bottom w:val="single" w:sz="4" w:space="0" w:color="C9D3DF"/>
+              <w:right w:val="single" w:sz="4" w:space="0" w:color="C9D3DF"/>
+            </w:tcBorders>
+            <w:shd w:val="clear" w:color="auto" w:fill="EDF3F9"/>
+            <w:tcMar>
+              <w:top w:w="70" w:type="dxa"/>
+              <w:left w:w="110" w:type="dxa"/>
+              <w:bottom w:w="70" w:type="dxa"/>
+              <w:right w:w="110" w:type="dxa"/>
+            </w:tcMar>
+            <w:vAlign w:val="center"/>
+          </w:tcPr>
+          <w:p>
+            <w:r>
+              <w:t xml:space="preserve">Content-based container detection and bounded ID3v2 reading; FLAC metadata blocks, kept WAV chunks and the decoded-audio MD5; MP3 frame walking with exact or estimated length; FLAC and MP3 observations in the WAV result shape.</w:t>
             </w:r>
           </w:p>
         </w:tc>
@@ -31597,7 +31940,7 @@
           </w:tcPr>
           <w:p>
             <w:r>
-              <w:t>131 core tests, including explicit legacy-profile compatibility cases; the shipped default profile is version 4.</w:t>
+              <w:t xml:space="preserve">132 core tests, including explicit legacy-profile compatibility cases; the shipped default profile is version 4.</w:t>
             </w:r>
           </w:p>
         </w:tc>
@@ -32181,6 +32524,59 @@
           <w:p>
             <w:r>
               <w:t xml:space="preserve">10 tests: interval values, bounds and symmetry, every stored interval recomputed from its count, held-out splits, and the benchmark summaries.</w:t>
+            </w:r>
+          </w:p>
+        </w:tc>
+      </w:tr>
+      <w:tr>
+        <w:trPr>
+          <w:cantSplit/>
+        </w:trPr>
+        <w:tc>
+          <w:tcPr>
+            <w:tcW w:w="3855" w:type="dxa"/>
+            <w:tcBorders>
+              <w:top w:val="single" w:sz="4" w:space="0" w:color="C9D3DF"/>
+              <w:left w:val="single" w:sz="4" w:space="0" w:color="C9D3DF"/>
+              <w:bottom w:val="single" w:sz="4" w:space="0" w:color="C9D3DF"/>
+              <w:right w:val="single" w:sz="4" w:space="0" w:color="C9D3DF"/>
+            </w:tcBorders>
+            <w:shd w:val="clear" w:color="auto" w:fill="FFFFFF"/>
+            <w:tcMar>
+              <w:top w:w="70" w:type="dxa"/>
+              <w:left w:w="110" w:type="dxa"/>
+              <w:bottom w:w="70" w:type="dxa"/>
+              <w:right w:w="110" w:type="dxa"/>
+            </w:tcMar>
+            <w:vAlign w:val="center"/>
+          </w:tcPr>
+          <w:p>
+            <w:r>
+              <w:t xml:space="preserve">tests/test_audio_formats.py</w:t>
+            </w:r>
+          </w:p>
+        </w:tc>
+        <w:tc>
+          <w:tcPr>
+            <w:tcW w:w="5783" w:type="dxa"/>
+            <w:tcBorders>
+              <w:top w:val="single" w:sz="4" w:space="0" w:color="C9D3DF"/>
+              <w:left w:val="single" w:sz="4" w:space="0" w:color="C9D3DF"/>
+              <w:bottom w:val="single" w:sz="4" w:space="0" w:color="C9D3DF"/>
+              <w:right w:val="single" w:sz="4" w:space="0" w:color="C9D3DF"/>
+            </w:tcBorders>
+            <w:shd w:val="clear" w:color="auto" w:fill="FFFFFF"/>
+            <w:tcMar>
+              <w:top w:w="70" w:type="dxa"/>
+              <w:left w:w="110" w:type="dxa"/>
+              <w:bottom w:w="70" w:type="dxa"/>
+              <w:right w:w="110" w:type="dxa"/>
+            </w:tcMar>
+            <w:vAlign w:val="center"/>
+          </w:tcPr>
+          <w:p>
+            <w:r>
+              <w:t xml:space="preserve">29 FLAC and MP3 tests: detection, ID3v2, FLAC blocks and MD5, MP3 length, sync loss and tags, evaluator results, C2PA in FLAC and MP3, diagnostics decoding, the public profile and the builder probe.</w:t>
             </w:r>
           </w:p>
         </w:tc>
@@ -32364,7 +32760,7 @@
     </w:p>
     <w:p>
       <w:r>
-        <w:t xml:space="preserve">On 22 October 2026, the 308 non-GUI tests were run against version 0.8.0 with REQUIRE_AUDIO_BACKENDS=1, so every optional backend had to be present: all 308 passed in 26.7 seconds, with no failures, errors or skips. For version 0.8.1 the same procedure ran 328 non-GUI tests in one process (all passed in 31 seconds, no skips). After the Wilson intervals were added on 23 October 2026 it ran 338 non-GUI tests in one process (all passed in 30 seconds, no skips) and each of the four test_builder.GuiTests cases in a separate process (all passed); reports/test-results.txt and reports/release.json record the run. The environment included c2pa-python 0.37.10, the audio libraries and the benchmark-only mir_eval 0.8.2 from requirements-benchmark.txt. A writable NUMBA_CACHE_DIR was supplied because the default audio library cache location may not be writable.</w:t>
+        <w:t xml:space="preserve">On 22 October 2026, the 308 non-GUI tests were run against version 0.8.0 with REQUIRE_AUDIO_BACKENDS=1, so every optional backend had to be present: all 308 passed in 26.7 seconds, with no failures, errors or skips. For version 0.8.1 the same procedure ran 328 non-GUI tests in one process (all passed in 31 seconds, no skips). After the Wilson intervals were added on 23 October 2026 it ran 338 non-GUI tests in one process (all passed in 30 seconds, no skips) and each of the four test_builder.GuiTests cases in a separate process (all passed); reports/test-results.txt and reports/release.json record the run. The environment included c2pa-python 0.37.10, the audio libraries and the benchmark-only mir_eval 0.8.2 from requirements-benchmark.txt. A writable NUMBA_CACHE_DIR was supplied because the default audio library cache location may not be writable. With FLAC and MP3 support the same procedure ran 368 non-GUI tests in one process (all passed in 31 seconds, no skips) and the four GUI cases separately (all passed). soundfile 0.14.0 is now a core requirement.</w:t>
       </w:r>
     </w:p>
     <w:p>
@@ -32378,7 +32774,7 @@
     <w:p>
       <w:r>
         <w:lastRenderedPageBreak/>
-        <w:t xml:space="preserve">The current discovery contains 342 cases: 131 core; 41 audio diagnostics; 24 C2PA; 22 remediation; 19 non-GUI builder; 15 builder-result; 14 scoring-remediation; 12 local-file-reference; 27 production-document; 9 audio calibration; 10 case-interval; 6 DAW-session; 5 structure benchmark; 3 music benchmark; and 4 GUI cases. Run GUI cases in separate processes when investigating macOS Tk lifecycle hangs; do not treat excluded cases as passes or skips.</w:t>
+        <w:t xml:space="preserve">The current discovery contains 372 cases: 132 core; 41 audio diagnostics; 24 C2PA; 22 remediation; 19 non-GUI builder; 15 builder-result; 14 scoring-remediation; 12 local-file-reference; 27 production-document; 9 audio calibration; 10 case-interval; 29 audio-format; 6 DAW-session; 5 structure benchmark; 3 music benchmark; and 4 GUI cases. Run GUI cases in separate processes when investigating macOS Tk lifecycle hangs; do not treat excluded cases as passes or skips.</w:t>
       </w:r>
     </w:p>
     <w:p>
@@ -32681,7 +33077,7 @@
         <w:spacing w:after="60" w:line="276" w:lineRule="auto"/>
       </w:pPr>
       <w:r>
-        <w:t>Audio is limited to WAV: integer PCM, IEEE float and WAVE_FORMAT_EXTENSIBLE. FLAC, AIFF and RF64/BW64 are not supported. Objects are limited to 512 MiB each and 1 GiB per request.</w:t>
+        <w:t xml:space="preserve">Audio is limited to WAV (integer PCM, IEEE float and WAVE_FORMAT_EXTENSIBLE), FLAC and MP3 (MPEG Layer III). AIFF, Ogg, RF64/BW64 and MPEG Layer I/II are not supported. MP3 is lossy: it has no bit depth or recorder metadata, its exact length is known only from a Xing/Info header with encoder delay and padding, and audio diagnostics on MP3 compare an approximation of the original (mp3_encoded_queries is not calibrated). Objects are limited to 512 MiB each and 1 GiB per request.</w:t>
       </w:r>
     </w:p>
     <w:p>
@@ -34246,7 +34642,7 @@
                 <w:sz w:val="17"/>
                 <w:szCs w:val="18"/>
               </w:rPr>
-              <w:t>FLAC, AIFF, RF64/BW64 as needed by real submissions.</w:t>
+              <w:t xml:space="preserve">FLAC and MP3 are implemented (after 0.8.1). AIFF and RF64/BW64 as needed by real submissions.</w:t>
             </w:r>
           </w:p>
         </w:tc>
@@ -34357,7 +34753,7 @@
           </w:tcPr>
           <w:p>
             <w:r>
-              <w:t>Semantics, fingerprint-agreement and calibration summaries, the C2PA problem-state display and UI WAV import through wav_probe.py (matching the core decoder's encodings) are implemented. Remaining: run GUI tests in separate processes, because they can hang in the full macOS suite.</w:t>
+              <w:t xml:space="preserve">Semantics, fingerprint-agreement and calibration summaries, the C2PA problem-state display and UI WAV, FLAC and MP3 import through wav_probe.py (matching the core's formats) are implemented. Remaining: run GUI tests in separate processes, because they can hang in the full macOS suite.</w:t>
             </w:r>
           </w:p>
         </w:tc>
@@ -34381,7 +34777,7 @@
           </w:tcPr>
           <w:p>
             <w:r>
-              <w:t>Saved JSON and UI expose all provider outcomes and uncertainty; core-supported WAVs import consistently.</w:t>
+              <w:t xml:space="preserve">Saved JSON and UI expose all provider outcomes and uncertainty; core-supported WAV, FLAC and MP3 files import consistently.</w:t>
             </w:r>
           </w:p>
         </w:tc>

</xml_diff>

<commit_message>
Add content bandwidth check and real-material FLAC/MP3 results
- New report-only audio_bandwidth provider (per file): measures where the
  decoded audio stops and compares it with the container, sample rate and MP3
  bitrate. Flags fake 320 kbps MP3s, lossless files band-limited like a lossy
  encode and upsampled files. Never scored; uncalibrated.
- MP3 diagnostics decode only MPEG frames; a shortfall of up to two frames is
  accepted when no gapless length exists (constant-bitrate files).
- Runner and builder: per-file bandwidth rows, AUDIO_CONTENT_BAND_LIMITED
  finding, policy version 3.
- Calibration status: bandwidth record, Project Rock and Lumina counts.
- False-match benchmark: free-site MP3s with shared fixed-time bursts
  (offset-0 matches in 6 of 10 pairs), documented; gates unchanged.
- Docs, README, technical manual, red-team known weaknesses and examples
  updated; 386 tests (382 non-GUI in one process, 4 GUI run separately).
</commit_message>
<xml_diff>
--- a/Manual_layout_check.docx
+++ b/Manual_layout_check.docx
@@ -425,7 +425,7 @@
           </w:tcPr>
           <w:p>
             <w:r>
-              <w:t xml:space="preserve">372 tests discovered. All 368 non-GUI tests passed with every optional backend required; the four GUI tests passed when run separately; see Section 9.</w:t>
+              <w:t xml:space="preserve">386 tests discovered. All 382 non-GUI tests passed with every optional backend required; the four GUI tests passed when run separately; see Section 9.</w:t>
             </w:r>
           </w:p>
         </w:tc>
@@ -5675,7 +5675,7 @@
     </w:p>
     <w:p>
       <w:r>
-        <w:t xml:space="preserve">The desktop summary displays the audio_fingerprint, audio_fingerprint_agreement, audio_structure and audio_semantics rows grouped by file pair, each with its calibration status, together with any C2PA problem state of the final artefact. The importer reads WAV technical fields with wav_probe.py, which accepts the same integer PCM, IEEE float and WAVE_FORMAT_EXTENSIBLE encodings as the core decoder. FLAC and MP3 are read with the evaluator's own parsers (wav_probe.audio_technical), which fill in only the fields each format carries: no MP3 bit depth, and an MP3 duration only when the file states its exact length.</w:t>
+        <w:t xml:space="preserve">The desktop summary displays the audio_fingerprint, audio_fingerprint_agreement, audio_structure and audio_semantics rows grouped by file pair, each with its calibration status, then one content-bandwidth line per file (heuristic; uncalibrated), together with any C2PA problem state of the final artefact. The importer reads WAV technical fields with wav_probe.py, which accepts the same integer PCM, IEEE float and WAVE_FORMAT_EXTENSIBLE encodings as the core decoder. FLAC and MP3 are read with the evaluator's own parsers (wav_probe.audio_technical), which fill in only the fields each format carries: no MP3 bit depth, and an MP3 duration only when the file states its exact length.</w:t>
       </w:r>
     </w:p>
     <w:p>
@@ -17150,7 +17150,7 @@
         <w:spacing w:line="276" w:lineRule="auto"/>
       </w:pPr>
       <w:r>
-        <w:t>--audio-analysis enables audfprint, spectromap, librosa and music_semantics from the default local policy. --audio-analysis-policy &lt;file&gt; enables the stage with a supplied policy, optionally selecting fewer providers and overriding permitted analysis parameters. A custom policy alone is sufficient. fingerprint_agreement is generated automatically when both fingerprint providers run; it is not a selectable policy provider. No audio flag means no optional provider imports, snapshots or workers.</w:t>
+        <w:t xml:space="preserve">--audio-analysis enables audfprint, spectromap, librosa, music_semantics and bandwidth from the default local policy. --audio-analysis-policy &amp;amp;lt;file&amp;amp;gt; enables the stage with a supplied policy, optionally selecting fewer providers and overriding permitted analysis parameters. A custom policy alone is sufficient. fingerprint_agreement is generated automatically when both fingerprint providers run; it is not a selectable policy provider. No audio flag means no optional provider imports, snapshots or workers. bandwidth runs once per bound audio file rather than per pair, so it also runs when the graph has no audio-to-audio relationships.</w:t>
       </w:r>
     </w:p>
     <w:p>
@@ -30885,7 +30885,7 @@
                 <w:sz w:val="17"/>
                 <w:szCs w:val="18"/>
               </w:rPr>
-              <w:t xml:space="preserve">Report-only contracts, policy, tasks (including AAF-declared source ranges), snapshots, per-task worker, agreement and providers (audfprint, SpectroMap, librosa, music_semantics). Each row carries its calibration status; insufficient support is reported separately from providers that did not run.</w:t>
+              <w:t xml:space="preserve">Report-only contracts, policy, tasks (including AAF-declared source ranges), snapshots, per-task worker, agreement and providers (audfprint, SpectroMap, librosa, music_semantics, and the per-file bandwidth provider). Each row carries its calibration status; insufficient support is reported separately from providers that did not run.</w:t>
             </w:r>
           </w:p>
         </w:tc>
@@ -32576,7 +32576,60 @@
           </w:tcPr>
           <w:p>
             <w:r>
-              <w:t xml:space="preserve">29 FLAC and MP3 tests: detection, ID3v2, FLAC blocks and MD5, MP3 length, sync loss and tags, evaluator results, C2PA in FLAC and MP3, diagnostics decoding, the public profile and the builder probe.</w:t>
+              <w:t xml:space="preserve">32 FLAC and MP3 tests: detection, ID3v2, FLAC blocks and MD5, MP3 length, sync loss and tags, evaluator results, C2PA in FLAC and MP3, diagnostics decoding (including MP3 without a Xing header), the public profile and the builder probe.</w:t>
+            </w:r>
+          </w:p>
+        </w:tc>
+      </w:tr>
+      <w:tr>
+        <w:trPr>
+          <w:cantSplit/>
+        </w:trPr>
+        <w:tc>
+          <w:tcPr>
+            <w:tcW w:w="3855" w:type="dxa"/>
+            <w:tcBorders>
+              <w:top w:val="single" w:sz="4" w:space="0" w:color="C9D3DF"/>
+              <w:left w:val="single" w:sz="4" w:space="0" w:color="C9D3DF"/>
+              <w:bottom w:val="single" w:sz="4" w:space="0" w:color="C9D3DF"/>
+              <w:right w:val="single" w:sz="4" w:space="0" w:color="C9D3DF"/>
+            </w:tcBorders>
+            <w:shd w:val="clear" w:color="auto" w:fill="FFFFFF"/>
+            <w:tcMar>
+              <w:top w:w="70" w:type="dxa"/>
+              <w:left w:w="110" w:type="dxa"/>
+              <w:bottom w:w="70" w:type="dxa"/>
+              <w:right w:w="110" w:type="dxa"/>
+            </w:tcMar>
+            <w:vAlign w:val="center"/>
+          </w:tcPr>
+          <w:p>
+            <w:r>
+              <w:t xml:space="preserve">tests/test_bandwidth.py</w:t>
+            </w:r>
+          </w:p>
+        </w:tc>
+        <w:tc>
+          <w:tcPr>
+            <w:tcW w:w="5783" w:type="dxa"/>
+            <w:tcBorders>
+              <w:top w:val="single" w:sz="4" w:space="0" w:color="C9D3DF"/>
+              <w:left w:val="single" w:sz="4" w:space="0" w:color="C9D3DF"/>
+              <w:bottom w:val="single" w:sz="4" w:space="0" w:color="C9D3DF"/>
+              <w:right w:val="single" w:sz="4" w:space="0" w:color="C9D3DF"/>
+            </w:tcBorders>
+            <w:shd w:val="clear" w:color="auto" w:fill="FFFFFF"/>
+            <w:tcMar>
+              <w:top w:w="70" w:type="dxa"/>
+              <w:left w:w="110" w:type="dxa"/>
+              <w:bottom w:w="70" w:type="dxa"/>
+              <w:right w:w="110" w:type="dxa"/>
+            </w:tcMar>
+            <w:vAlign w:val="center"/>
+          </w:tcPr>
+          <w:p>
+            <w:r>
+              <w:t xml:space="preserve">9 content-bandwidth tests: assessment rules, the detector on low-passed, noise-floor-masked and upsampled noise, block-size invariance, insufficient signal, and unchanged axes in a full evaluation.</w:t>
             </w:r>
           </w:p>
         </w:tc>
@@ -32760,7 +32813,7 @@
     </w:p>
     <w:p>
       <w:r>
-        <w:t xml:space="preserve">On 22 October 2026, the 308 non-GUI tests were run against version 0.8.0 with REQUIRE_AUDIO_BACKENDS=1, so every optional backend had to be present: all 308 passed in 26.7 seconds, with no failures, errors or skips. For version 0.8.1 the same procedure ran 328 non-GUI tests in one process (all passed in 31 seconds, no skips). After the Wilson intervals were added on 23 October 2026 it ran 338 non-GUI tests in one process (all passed in 30 seconds, no skips) and each of the four test_builder.GuiTests cases in a separate process (all passed); reports/test-results.txt and reports/release.json record the run. The environment included c2pa-python 0.37.10, the audio libraries and the benchmark-only mir_eval 0.8.2 from requirements-benchmark.txt. A writable NUMBA_CACHE_DIR was supplied because the default audio library cache location may not be writable. With FLAC and MP3 support the same procedure ran 368 non-GUI tests in one process (all passed in 31 seconds, no skips) and the four GUI cases separately (all passed). soundfile 0.14.0 is now a core requirement.</w:t>
+        <w:t xml:space="preserve">On 22 October 2026, the 308 non-GUI tests were run against version 0.8.0 with REQUIRE_AUDIO_BACKENDS=1, so every optional backend had to be present: all 308 passed in 26.7 seconds, with no failures, errors or skips. For version 0.8.1 the same procedure ran 328 non-GUI tests in one process (all passed in 31 seconds, no skips). After the Wilson intervals were added on 23 October 2026 it ran 338 non-GUI tests in one process (all passed in 30 seconds, no skips) and each of the four test_builder.GuiTests cases in a separate process (all passed); reports/test-results.txt and reports/release.json record the run. The environment included c2pa-python 0.37.10, the audio libraries and the benchmark-only mir_eval 0.8.2 from requirements-benchmark.txt. A writable NUMBA_CACHE_DIR was supplied because the default audio library cache location may not be writable. With FLAC and MP3 support the same procedure ran 368 non-GUI tests in one process (all passed in 31 seconds, no skips) and the four GUI cases separately (all passed). soundfile 0.14.0 is now a core requirement. With the bandwidth provider (24 October 2026) it ran 382 non-GUI tests in one process (all passed in 32 seconds, no skips) and the four GUI cases separately (all passed).</w:t>
       </w:r>
     </w:p>
     <w:p>
@@ -32774,7 +32827,7 @@
     <w:p>
       <w:r>
         <w:lastRenderedPageBreak/>
-        <w:t xml:space="preserve">The current discovery contains 372 cases: 132 core; 41 audio diagnostics; 24 C2PA; 22 remediation; 19 non-GUI builder; 15 builder-result; 14 scoring-remediation; 12 local-file-reference; 27 production-document; 9 audio calibration; 10 case-interval; 29 audio-format; 6 DAW-session; 5 structure benchmark; 3 music benchmark; and 4 GUI cases. Run GUI cases in separate processes when investigating macOS Tk lifecycle hangs; do not treat excluded cases as passes or skips.</w:t>
+        <w:t xml:space="preserve">The current discovery contains 386 cases: 132 core; 41 audio diagnostics; 24 C2PA; 22 remediation; 19 non-GUI builder; 16 builder-result; 14 scoring-remediation; 12 local-file-reference; 27 production-document; 9 audio calibration; 11 case-interval; 32 audio-format; 9 bandwidth; 6 DAW-session; 5 structure benchmark; 3 music benchmark; and 4 GUI cases. Run GUI cases in separate processes when investigating macOS Tk lifecycle hangs; do not treat excluded cases as passes or skips.</w:t>
       </w:r>
     </w:p>
     <w:p>
@@ -33026,7 +33079,7 @@
         <w:spacing w:after="60" w:line="276" w:lineRule="auto"/>
       </w:pPr>
       <w:r>
-        <w:t xml:space="preserve">Calibration figures are case counts on small samples, not population accuracy or false-positive rates. Pitch-shifted and time-stretched fingerprint queries and alternate takes are untested, and SpectroMap, librosa and fingerprint agreement are uncalibrated. AAF-range tasks compare only the seconds an edit used; a few seconds of dialogue give audfprint fewer landmarks, so on Project Rock Ep01 it supported none of the 14 AAF ranges (one candidate fell below the support gates) where the whole-take run had supported two takes. Every count carries a 95% Wilson interval; the intervals treat cases as independent, which cases from one family or session are not.</w:t>
+        <w:t xml:space="preserve">Calibration figures are case counts on small samples, not population accuracy or false-positive rates. Pitch-shifted and time-stretched fingerprint queries and alternate takes are untested, and SpectroMap, librosa, fingerprint agreement and bandwidth are uncalibrated. A bandwidth flag says where a file's audio stops, not who made it: all 25 Lumina benchmark WAVs stop at 17.4-19.9 kHz and are flagged like a lossy encode. AAF-range tasks compare only the seconds an edit used; a few seconds of dialogue give audfprint fewer landmarks, so on Project Rock Ep01 it supported none of the 14 AAF ranges (one candidate fell below the support gates) where the whole-take run had supported two takes. Every count carries a 95% Wilson interval; the intervals treat cases as independent, which cases from one family or session are not.</w:t>
       </w:r>
     </w:p>
     <w:p>
@@ -33077,7 +33130,7 @@
         <w:spacing w:after="60" w:line="276" w:lineRule="auto"/>
       </w:pPr>
       <w:r>
-        <w:t xml:space="preserve">Audio is limited to WAV (integer PCM, IEEE float and WAVE_FORMAT_EXTENSIBLE), FLAC and MP3 (MPEG Layer III). AIFF, Ogg, RF64/BW64 and MPEG Layer I/II are not supported. MP3 is lossy: it has no bit depth or recorder metadata, its exact length is known only from a Xing/Info header with encoder delay and padding, and audio diagnostics on MP3 compare an approximation of the original (mp3_encoded_queries is not calibrated). Objects are limited to 512 MiB each and 1 GiB per request.</w:t>
+        <w:t xml:space="preserve">Audio is limited to WAV (integer PCM, IEEE float and WAVE_FORMAT_EXTENSIBLE), FLAC and MP3 (MPEG Layer III). AIFF, Ogg, RF64/BW64 and MPEG Layer I/II are not supported. MP3 is lossy: it has no bit depth or recorder metadata, its exact length is known only from a Xing/Info header with encoder delay and padding, and audio diagnostics on MP3 compare an approximation of the original (mp3_encoded_queries is not calibrated). Objects are limited to 512 MiB each and 1 GiB per request. Structural checks cannot see a fake format: a FLAC made from an MP3 has a valid MD5 and a re-encoded 320 kbps MP3 has valid frames; only the report-only bandwidth diagnostic points to them.</w:t>
       </w:r>
     </w:p>
     <w:p>

</xml_diff>

<commit_message>
Revert "Add content bandwidth check and real-material FLAC/MP3 results"
This reverts commit 8253530dcc0782d7cd2a582a3f82c573923eec43.
</commit_message>
<xml_diff>
--- a/Manual_layout_check.docx
+++ b/Manual_layout_check.docx
@@ -425,7 +425,7 @@
           </w:tcPr>
           <w:p>
             <w:r>
-              <w:t xml:space="preserve">386 tests discovered. All 382 non-GUI tests passed with every optional backend required; the four GUI tests passed when run separately; see Section 9.</w:t>
+              <w:t xml:space="preserve">372 tests discovered. All 368 non-GUI tests passed with every optional backend required; the four GUI tests passed when run separately; see Section 9.</w:t>
             </w:r>
           </w:p>
         </w:tc>
@@ -5675,7 +5675,7 @@
     </w:p>
     <w:p>
       <w:r>
-        <w:t xml:space="preserve">The desktop summary displays the audio_fingerprint, audio_fingerprint_agreement, audio_structure and audio_semantics rows grouped by file pair, each with its calibration status, then one content-bandwidth line per file (heuristic; uncalibrated), together with any C2PA problem state of the final artefact. The importer reads WAV technical fields with wav_probe.py, which accepts the same integer PCM, IEEE float and WAVE_FORMAT_EXTENSIBLE encodings as the core decoder. FLAC and MP3 are read with the evaluator's own parsers (wav_probe.audio_technical), which fill in only the fields each format carries: no MP3 bit depth, and an MP3 duration only when the file states its exact length.</w:t>
+        <w:t xml:space="preserve">The desktop summary displays the audio_fingerprint, audio_fingerprint_agreement, audio_structure and audio_semantics rows grouped by file pair, each with its calibration status, together with any C2PA problem state of the final artefact. The importer reads WAV technical fields with wav_probe.py, which accepts the same integer PCM, IEEE float and WAVE_FORMAT_EXTENSIBLE encodings as the core decoder. FLAC and MP3 are read with the evaluator's own parsers (wav_probe.audio_technical), which fill in only the fields each format carries: no MP3 bit depth, and an MP3 duration only when the file states its exact length.</w:t>
       </w:r>
     </w:p>
     <w:p>
@@ -17150,7 +17150,7 @@
         <w:spacing w:line="276" w:lineRule="auto"/>
       </w:pPr>
       <w:r>
-        <w:t xml:space="preserve">--audio-analysis enables audfprint, spectromap, librosa, music_semantics and bandwidth from the default local policy. --audio-analysis-policy &amp;amp;lt;file&amp;amp;gt; enables the stage with a supplied policy, optionally selecting fewer providers and overriding permitted analysis parameters. A custom policy alone is sufficient. fingerprint_agreement is generated automatically when both fingerprint providers run; it is not a selectable policy provider. No audio flag means no optional provider imports, snapshots or workers. bandwidth runs once per bound audio file rather than per pair, so it also runs when the graph has no audio-to-audio relationships.</w:t>
+        <w:t>--audio-analysis enables audfprint, spectromap, librosa and music_semantics from the default local policy. --audio-analysis-policy &lt;file&gt; enables the stage with a supplied policy, optionally selecting fewer providers and overriding permitted analysis parameters. A custom policy alone is sufficient. fingerprint_agreement is generated automatically when both fingerprint providers run; it is not a selectable policy provider. No audio flag means no optional provider imports, snapshots or workers.</w:t>
       </w:r>
     </w:p>
     <w:p>
@@ -30885,7 +30885,7 @@
                 <w:sz w:val="17"/>
                 <w:szCs w:val="18"/>
               </w:rPr>
-              <w:t xml:space="preserve">Report-only contracts, policy, tasks (including AAF-declared source ranges), snapshots, per-task worker, agreement and providers (audfprint, SpectroMap, librosa, music_semantics, and the per-file bandwidth provider). Each row carries its calibration status; insufficient support is reported separately from providers that did not run.</w:t>
+              <w:t xml:space="preserve">Report-only contracts, policy, tasks (including AAF-declared source ranges), snapshots, per-task worker, agreement and providers (audfprint, SpectroMap, librosa, music_semantics). Each row carries its calibration status; insufficient support is reported separately from providers that did not run.</w:t>
             </w:r>
           </w:p>
         </w:tc>
@@ -32576,60 +32576,7 @@
           </w:tcPr>
           <w:p>
             <w:r>
-              <w:t xml:space="preserve">32 FLAC and MP3 tests: detection, ID3v2, FLAC blocks and MD5, MP3 length, sync loss and tags, evaluator results, C2PA in FLAC and MP3, diagnostics decoding (including MP3 without a Xing header), the public profile and the builder probe.</w:t>
-            </w:r>
-          </w:p>
-        </w:tc>
-      </w:tr>
-      <w:tr>
-        <w:trPr>
-          <w:cantSplit/>
-        </w:trPr>
-        <w:tc>
-          <w:tcPr>
-            <w:tcW w:w="3855" w:type="dxa"/>
-            <w:tcBorders>
-              <w:top w:val="single" w:sz="4" w:space="0" w:color="C9D3DF"/>
-              <w:left w:val="single" w:sz="4" w:space="0" w:color="C9D3DF"/>
-              <w:bottom w:val="single" w:sz="4" w:space="0" w:color="C9D3DF"/>
-              <w:right w:val="single" w:sz="4" w:space="0" w:color="C9D3DF"/>
-            </w:tcBorders>
-            <w:shd w:val="clear" w:color="auto" w:fill="FFFFFF"/>
-            <w:tcMar>
-              <w:top w:w="70" w:type="dxa"/>
-              <w:left w:w="110" w:type="dxa"/>
-              <w:bottom w:w="70" w:type="dxa"/>
-              <w:right w:w="110" w:type="dxa"/>
-            </w:tcMar>
-            <w:vAlign w:val="center"/>
-          </w:tcPr>
-          <w:p>
-            <w:r>
-              <w:t xml:space="preserve">tests/test_bandwidth.py</w:t>
-            </w:r>
-          </w:p>
-        </w:tc>
-        <w:tc>
-          <w:tcPr>
-            <w:tcW w:w="5783" w:type="dxa"/>
-            <w:tcBorders>
-              <w:top w:val="single" w:sz="4" w:space="0" w:color="C9D3DF"/>
-              <w:left w:val="single" w:sz="4" w:space="0" w:color="C9D3DF"/>
-              <w:bottom w:val="single" w:sz="4" w:space="0" w:color="C9D3DF"/>
-              <w:right w:val="single" w:sz="4" w:space="0" w:color="C9D3DF"/>
-            </w:tcBorders>
-            <w:shd w:val="clear" w:color="auto" w:fill="FFFFFF"/>
-            <w:tcMar>
-              <w:top w:w="70" w:type="dxa"/>
-              <w:left w:w="110" w:type="dxa"/>
-              <w:bottom w:w="70" w:type="dxa"/>
-              <w:right w:w="110" w:type="dxa"/>
-            </w:tcMar>
-            <w:vAlign w:val="center"/>
-          </w:tcPr>
-          <w:p>
-            <w:r>
-              <w:t xml:space="preserve">9 content-bandwidth tests: assessment rules, the detector on low-passed, noise-floor-masked and upsampled noise, block-size invariance, insufficient signal, and unchanged axes in a full evaluation.</w:t>
+              <w:t xml:space="preserve">29 FLAC and MP3 tests: detection, ID3v2, FLAC blocks and MD5, MP3 length, sync loss and tags, evaluator results, C2PA in FLAC and MP3, diagnostics decoding, the public profile and the builder probe.</w:t>
             </w:r>
           </w:p>
         </w:tc>
@@ -32813,7 +32760,7 @@
     </w:p>
     <w:p>
       <w:r>
-        <w:t xml:space="preserve">On 22 October 2026, the 308 non-GUI tests were run against version 0.8.0 with REQUIRE_AUDIO_BACKENDS=1, so every optional backend had to be present: all 308 passed in 26.7 seconds, with no failures, errors or skips. For version 0.8.1 the same procedure ran 328 non-GUI tests in one process (all passed in 31 seconds, no skips). After the Wilson intervals were added on 23 October 2026 it ran 338 non-GUI tests in one process (all passed in 30 seconds, no skips) and each of the four test_builder.GuiTests cases in a separate process (all passed); reports/test-results.txt and reports/release.json record the run. The environment included c2pa-python 0.37.10, the audio libraries and the benchmark-only mir_eval 0.8.2 from requirements-benchmark.txt. A writable NUMBA_CACHE_DIR was supplied because the default audio library cache location may not be writable. With FLAC and MP3 support the same procedure ran 368 non-GUI tests in one process (all passed in 31 seconds, no skips) and the four GUI cases separately (all passed). soundfile 0.14.0 is now a core requirement. With the bandwidth provider (24 October 2026) it ran 382 non-GUI tests in one process (all passed in 32 seconds, no skips) and the four GUI cases separately (all passed).</w:t>
+        <w:t xml:space="preserve">On 22 October 2026, the 308 non-GUI tests were run against version 0.8.0 with REQUIRE_AUDIO_BACKENDS=1, so every optional backend had to be present: all 308 passed in 26.7 seconds, with no failures, errors or skips. For version 0.8.1 the same procedure ran 328 non-GUI tests in one process (all passed in 31 seconds, no skips). After the Wilson intervals were added on 23 October 2026 it ran 338 non-GUI tests in one process (all passed in 30 seconds, no skips) and each of the four test_builder.GuiTests cases in a separate process (all passed); reports/test-results.txt and reports/release.json record the run. The environment included c2pa-python 0.37.10, the audio libraries and the benchmark-only mir_eval 0.8.2 from requirements-benchmark.txt. A writable NUMBA_CACHE_DIR was supplied because the default audio library cache location may not be writable. With FLAC and MP3 support the same procedure ran 368 non-GUI tests in one process (all passed in 31 seconds, no skips) and the four GUI cases separately (all passed). soundfile 0.14.0 is now a core requirement.</w:t>
       </w:r>
     </w:p>
     <w:p>
@@ -32827,7 +32774,7 @@
     <w:p>
       <w:r>
         <w:lastRenderedPageBreak/>
-        <w:t xml:space="preserve">The current discovery contains 386 cases: 132 core; 41 audio diagnostics; 24 C2PA; 22 remediation; 19 non-GUI builder; 16 builder-result; 14 scoring-remediation; 12 local-file-reference; 27 production-document; 9 audio calibration; 11 case-interval; 32 audio-format; 9 bandwidth; 6 DAW-session; 5 structure benchmark; 3 music benchmark; and 4 GUI cases. Run GUI cases in separate processes when investigating macOS Tk lifecycle hangs; do not treat excluded cases as passes or skips.</w:t>
+        <w:t xml:space="preserve">The current discovery contains 372 cases: 132 core; 41 audio diagnostics; 24 C2PA; 22 remediation; 19 non-GUI builder; 15 builder-result; 14 scoring-remediation; 12 local-file-reference; 27 production-document; 9 audio calibration; 10 case-interval; 29 audio-format; 6 DAW-session; 5 structure benchmark; 3 music benchmark; and 4 GUI cases. Run GUI cases in separate processes when investigating macOS Tk lifecycle hangs; do not treat excluded cases as passes or skips.</w:t>
       </w:r>
     </w:p>
     <w:p>
@@ -33079,7 +33026,7 @@
         <w:spacing w:after="60" w:line="276" w:lineRule="auto"/>
       </w:pPr>
       <w:r>
-        <w:t xml:space="preserve">Calibration figures are case counts on small samples, not population accuracy or false-positive rates. Pitch-shifted and time-stretched fingerprint queries and alternate takes are untested, and SpectroMap, librosa, fingerprint agreement and bandwidth are uncalibrated. A bandwidth flag says where a file's audio stops, not who made it: all 25 Lumina benchmark WAVs stop at 17.4-19.9 kHz and are flagged like a lossy encode. AAF-range tasks compare only the seconds an edit used; a few seconds of dialogue give audfprint fewer landmarks, so on Project Rock Ep01 it supported none of the 14 AAF ranges (one candidate fell below the support gates) where the whole-take run had supported two takes. Every count carries a 95% Wilson interval; the intervals treat cases as independent, which cases from one family or session are not.</w:t>
+        <w:t xml:space="preserve">Calibration figures are case counts on small samples, not population accuracy or false-positive rates. Pitch-shifted and time-stretched fingerprint queries and alternate takes are untested, and SpectroMap, librosa and fingerprint agreement are uncalibrated. AAF-range tasks compare only the seconds an edit used; a few seconds of dialogue give audfprint fewer landmarks, so on Project Rock Ep01 it supported none of the 14 AAF ranges (one candidate fell below the support gates) where the whole-take run had supported two takes. Every count carries a 95% Wilson interval; the intervals treat cases as independent, which cases from one family or session are not.</w:t>
       </w:r>
     </w:p>
     <w:p>
@@ -33130,7 +33077,7 @@
         <w:spacing w:after="60" w:line="276" w:lineRule="auto"/>
       </w:pPr>
       <w:r>
-        <w:t xml:space="preserve">Audio is limited to WAV (integer PCM, IEEE float and WAVE_FORMAT_EXTENSIBLE), FLAC and MP3 (MPEG Layer III). AIFF, Ogg, RF64/BW64 and MPEG Layer I/II are not supported. MP3 is lossy: it has no bit depth or recorder metadata, its exact length is known only from a Xing/Info header with encoder delay and padding, and audio diagnostics on MP3 compare an approximation of the original (mp3_encoded_queries is not calibrated). Objects are limited to 512 MiB each and 1 GiB per request. Structural checks cannot see a fake format: a FLAC made from an MP3 has a valid MD5 and a re-encoded 320 kbps MP3 has valid frames; only the report-only bandwidth diagnostic points to them.</w:t>
+        <w:t xml:space="preserve">Audio is limited to WAV (integer PCM, IEEE float and WAVE_FORMAT_EXTENSIBLE), FLAC and MP3 (MPEG Layer III). AIFF, Ogg, RF64/BW64 and MPEG Layer I/II are not supported. MP3 is lossy: it has no bit depth or recorder metadata, its exact length is known only from a Xing/Info header with encoder delay and padding, and audio diagnostics on MP3 compare an approximation of the original (mp3_encoded_queries is not calibrated). Objects are limited to 512 MiB each and 1 GiB per request.</w:t>
       </w:r>
     </w:p>
     <w:p>

</xml_diff>

<commit_message>
Restore content bandwidth check and real-material FLAC/MP3 results
</commit_message>
<xml_diff>
--- a/Manual_layout_check.docx
+++ b/Manual_layout_check.docx
@@ -425,7 +425,7 @@
           </w:tcPr>
           <w:p>
             <w:r>
-              <w:t xml:space="preserve">372 tests discovered. All 368 non-GUI tests passed with every optional backend required; the four GUI tests passed when run separately; see Section 9.</w:t>
+              <w:t xml:space="preserve">386 tests discovered. All 382 non-GUI tests passed with every optional backend required; the four GUI tests passed when run separately; see Section 9.</w:t>
             </w:r>
           </w:p>
         </w:tc>
@@ -5675,7 +5675,7 @@
     </w:p>
     <w:p>
       <w:r>
-        <w:t xml:space="preserve">The desktop summary displays the audio_fingerprint, audio_fingerprint_agreement, audio_structure and audio_semantics rows grouped by file pair, each with its calibration status, together with any C2PA problem state of the final artefact. The importer reads WAV technical fields with wav_probe.py, which accepts the same integer PCM, IEEE float and WAVE_FORMAT_EXTENSIBLE encodings as the core decoder. FLAC and MP3 are read with the evaluator's own parsers (wav_probe.audio_technical), which fill in only the fields each format carries: no MP3 bit depth, and an MP3 duration only when the file states its exact length.</w:t>
+        <w:t xml:space="preserve">The desktop summary displays the audio_fingerprint, audio_fingerprint_agreement, audio_structure and audio_semantics rows grouped by file pair, each with its calibration status, then one content-bandwidth line per file (heuristic; uncalibrated), together with any C2PA problem state of the final artefact. The importer reads WAV technical fields with wav_probe.py, which accepts the same integer PCM, IEEE float and WAVE_FORMAT_EXTENSIBLE encodings as the core decoder. FLAC and MP3 are read with the evaluator's own parsers (wav_probe.audio_technical), which fill in only the fields each format carries: no MP3 bit depth, and an MP3 duration only when the file states its exact length.</w:t>
       </w:r>
     </w:p>
     <w:p>
@@ -17150,7 +17150,7 @@
         <w:spacing w:line="276" w:lineRule="auto"/>
       </w:pPr>
       <w:r>
-        <w:t>--audio-analysis enables audfprint, spectromap, librosa and music_semantics from the default local policy. --audio-analysis-policy &lt;file&gt; enables the stage with a supplied policy, optionally selecting fewer providers and overriding permitted analysis parameters. A custom policy alone is sufficient. fingerprint_agreement is generated automatically when both fingerprint providers run; it is not a selectable policy provider. No audio flag means no optional provider imports, snapshots or workers.</w:t>
+        <w:t xml:space="preserve">--audio-analysis enables audfprint, spectromap, librosa, music_semantics and bandwidth from the default local policy. --audio-analysis-policy &amp;amp;lt;file&amp;amp;gt; enables the stage with a supplied policy, optionally selecting fewer providers and overriding permitted analysis parameters. A custom policy alone is sufficient. fingerprint_agreement is generated automatically when both fingerprint providers run; it is not a selectable policy provider. No audio flag means no optional provider imports, snapshots or workers. bandwidth runs once per bound audio file rather than per pair, so it also runs when the graph has no audio-to-audio relationships.</w:t>
       </w:r>
     </w:p>
     <w:p>
@@ -30885,7 +30885,7 @@
                 <w:sz w:val="17"/>
                 <w:szCs w:val="18"/>
               </w:rPr>
-              <w:t xml:space="preserve">Report-only contracts, policy, tasks (including AAF-declared source ranges), snapshots, per-task worker, agreement and providers (audfprint, SpectroMap, librosa, music_semantics). Each row carries its calibration status; insufficient support is reported separately from providers that did not run.</w:t>
+              <w:t xml:space="preserve">Report-only contracts, policy, tasks (including AAF-declared source ranges), snapshots, per-task worker, agreement and providers (audfprint, SpectroMap, librosa, music_semantics, and the per-file bandwidth provider). Each row carries its calibration status; insufficient support is reported separately from providers that did not run.</w:t>
             </w:r>
           </w:p>
         </w:tc>
@@ -32576,7 +32576,60 @@
           </w:tcPr>
           <w:p>
             <w:r>
-              <w:t xml:space="preserve">29 FLAC and MP3 tests: detection, ID3v2, FLAC blocks and MD5, MP3 length, sync loss and tags, evaluator results, C2PA in FLAC and MP3, diagnostics decoding, the public profile and the builder probe.</w:t>
+              <w:t xml:space="preserve">32 FLAC and MP3 tests: detection, ID3v2, FLAC blocks and MD5, MP3 length, sync loss and tags, evaluator results, C2PA in FLAC and MP3, diagnostics decoding (including MP3 without a Xing header), the public profile and the builder probe.</w:t>
+            </w:r>
+          </w:p>
+        </w:tc>
+      </w:tr>
+      <w:tr>
+        <w:trPr>
+          <w:cantSplit/>
+        </w:trPr>
+        <w:tc>
+          <w:tcPr>
+            <w:tcW w:w="3855" w:type="dxa"/>
+            <w:tcBorders>
+              <w:top w:val="single" w:sz="4" w:space="0" w:color="C9D3DF"/>
+              <w:left w:val="single" w:sz="4" w:space="0" w:color="C9D3DF"/>
+              <w:bottom w:val="single" w:sz="4" w:space="0" w:color="C9D3DF"/>
+              <w:right w:val="single" w:sz="4" w:space="0" w:color="C9D3DF"/>
+            </w:tcBorders>
+            <w:shd w:val="clear" w:color="auto" w:fill="FFFFFF"/>
+            <w:tcMar>
+              <w:top w:w="70" w:type="dxa"/>
+              <w:left w:w="110" w:type="dxa"/>
+              <w:bottom w:w="70" w:type="dxa"/>
+              <w:right w:w="110" w:type="dxa"/>
+            </w:tcMar>
+            <w:vAlign w:val="center"/>
+          </w:tcPr>
+          <w:p>
+            <w:r>
+              <w:t xml:space="preserve">tests/test_bandwidth.py</w:t>
+            </w:r>
+          </w:p>
+        </w:tc>
+        <w:tc>
+          <w:tcPr>
+            <w:tcW w:w="5783" w:type="dxa"/>
+            <w:tcBorders>
+              <w:top w:val="single" w:sz="4" w:space="0" w:color="C9D3DF"/>
+              <w:left w:val="single" w:sz="4" w:space="0" w:color="C9D3DF"/>
+              <w:bottom w:val="single" w:sz="4" w:space="0" w:color="C9D3DF"/>
+              <w:right w:val="single" w:sz="4" w:space="0" w:color="C9D3DF"/>
+            </w:tcBorders>
+            <w:shd w:val="clear" w:color="auto" w:fill="FFFFFF"/>
+            <w:tcMar>
+              <w:top w:w="70" w:type="dxa"/>
+              <w:left w:w="110" w:type="dxa"/>
+              <w:bottom w:w="70" w:type="dxa"/>
+              <w:right w:w="110" w:type="dxa"/>
+            </w:tcMar>
+            <w:vAlign w:val="center"/>
+          </w:tcPr>
+          <w:p>
+            <w:r>
+              <w:t xml:space="preserve">9 content-bandwidth tests: assessment rules, the detector on low-passed, noise-floor-masked and upsampled noise, block-size invariance, insufficient signal, and unchanged axes in a full evaluation.</w:t>
             </w:r>
           </w:p>
         </w:tc>
@@ -32760,7 +32813,7 @@
     </w:p>
     <w:p>
       <w:r>
-        <w:t xml:space="preserve">On 22 October 2026, the 308 non-GUI tests were run against version 0.8.0 with REQUIRE_AUDIO_BACKENDS=1, so every optional backend had to be present: all 308 passed in 26.7 seconds, with no failures, errors or skips. For version 0.8.1 the same procedure ran 328 non-GUI tests in one process (all passed in 31 seconds, no skips). After the Wilson intervals were added on 23 October 2026 it ran 338 non-GUI tests in one process (all passed in 30 seconds, no skips) and each of the four test_builder.GuiTests cases in a separate process (all passed); reports/test-results.txt and reports/release.json record the run. The environment included c2pa-python 0.37.10, the audio libraries and the benchmark-only mir_eval 0.8.2 from requirements-benchmark.txt. A writable NUMBA_CACHE_DIR was supplied because the default audio library cache location may not be writable. With FLAC and MP3 support the same procedure ran 368 non-GUI tests in one process (all passed in 31 seconds, no skips) and the four GUI cases separately (all passed). soundfile 0.14.0 is now a core requirement.</w:t>
+        <w:t xml:space="preserve">On 22 October 2026, the 308 non-GUI tests were run against version 0.8.0 with REQUIRE_AUDIO_BACKENDS=1, so every optional backend had to be present: all 308 passed in 26.7 seconds, with no failures, errors or skips. For version 0.8.1 the same procedure ran 328 non-GUI tests in one process (all passed in 31 seconds, no skips). After the Wilson intervals were added on 23 October 2026 it ran 338 non-GUI tests in one process (all passed in 30 seconds, no skips) and each of the four test_builder.GuiTests cases in a separate process (all passed); reports/test-results.txt and reports/release.json record the run. The environment included c2pa-python 0.37.10, the audio libraries and the benchmark-only mir_eval 0.8.2 from requirements-benchmark.txt. A writable NUMBA_CACHE_DIR was supplied because the default audio library cache location may not be writable. With FLAC and MP3 support the same procedure ran 368 non-GUI tests in one process (all passed in 31 seconds, no skips) and the four GUI cases separately (all passed). soundfile 0.14.0 is now a core requirement. With the bandwidth provider (24 October 2026) it ran 382 non-GUI tests in one process (all passed in 32 seconds, no skips) and the four GUI cases separately (all passed).</w:t>
       </w:r>
     </w:p>
     <w:p>
@@ -32774,7 +32827,7 @@
     <w:p>
       <w:r>
         <w:lastRenderedPageBreak/>
-        <w:t xml:space="preserve">The current discovery contains 372 cases: 132 core; 41 audio diagnostics; 24 C2PA; 22 remediation; 19 non-GUI builder; 15 builder-result; 14 scoring-remediation; 12 local-file-reference; 27 production-document; 9 audio calibration; 10 case-interval; 29 audio-format; 6 DAW-session; 5 structure benchmark; 3 music benchmark; and 4 GUI cases. Run GUI cases in separate processes when investigating macOS Tk lifecycle hangs; do not treat excluded cases as passes or skips.</w:t>
+        <w:t xml:space="preserve">The current discovery contains 386 cases: 132 core; 41 audio diagnostics; 24 C2PA; 22 remediation; 19 non-GUI builder; 16 builder-result; 14 scoring-remediation; 12 local-file-reference; 27 production-document; 9 audio calibration; 11 case-interval; 32 audio-format; 9 bandwidth; 6 DAW-session; 5 structure benchmark; 3 music benchmark; and 4 GUI cases. Run GUI cases in separate processes when investigating macOS Tk lifecycle hangs; do not treat excluded cases as passes or skips.</w:t>
       </w:r>
     </w:p>
     <w:p>
@@ -33026,7 +33079,7 @@
         <w:spacing w:after="60" w:line="276" w:lineRule="auto"/>
       </w:pPr>
       <w:r>
-        <w:t xml:space="preserve">Calibration figures are case counts on small samples, not population accuracy or false-positive rates. Pitch-shifted and time-stretched fingerprint queries and alternate takes are untested, and SpectroMap, librosa and fingerprint agreement are uncalibrated. AAF-range tasks compare only the seconds an edit used; a few seconds of dialogue give audfprint fewer landmarks, so on Project Rock Ep01 it supported none of the 14 AAF ranges (one candidate fell below the support gates) where the whole-take run had supported two takes. Every count carries a 95% Wilson interval; the intervals treat cases as independent, which cases from one family or session are not.</w:t>
+        <w:t xml:space="preserve">Calibration figures are case counts on small samples, not population accuracy or false-positive rates. Pitch-shifted and time-stretched fingerprint queries and alternate takes are untested, and SpectroMap, librosa, fingerprint agreement and bandwidth are uncalibrated. A bandwidth flag says where a file's audio stops, not who made it: all 25 Lumina benchmark WAVs stop at 17.4-19.9 kHz and are flagged like a lossy encode. AAF-range tasks compare only the seconds an edit used; a few seconds of dialogue give audfprint fewer landmarks, so on Project Rock Ep01 it supported none of the 14 AAF ranges (one candidate fell below the support gates) where the whole-take run had supported two takes. Every count carries a 95% Wilson interval; the intervals treat cases as independent, which cases from one family or session are not.</w:t>
       </w:r>
     </w:p>
     <w:p>
@@ -33077,7 +33130,7 @@
         <w:spacing w:after="60" w:line="276" w:lineRule="auto"/>
       </w:pPr>
       <w:r>
-        <w:t xml:space="preserve">Audio is limited to WAV (integer PCM, IEEE float and WAVE_FORMAT_EXTENSIBLE), FLAC and MP3 (MPEG Layer III). AIFF, Ogg, RF64/BW64 and MPEG Layer I/II are not supported. MP3 is lossy: it has no bit depth or recorder metadata, its exact length is known only from a Xing/Info header with encoder delay and padding, and audio diagnostics on MP3 compare an approximation of the original (mp3_encoded_queries is not calibrated). Objects are limited to 512 MiB each and 1 GiB per request.</w:t>
+        <w:t xml:space="preserve">Audio is limited to WAV (integer PCM, IEEE float and WAVE_FORMAT_EXTENSIBLE), FLAC and MP3 (MPEG Layer III). AIFF, Ogg, RF64/BW64 and MPEG Layer I/II are not supported. MP3 is lossy: it has no bit depth or recorder metadata, its exact length is known only from a Xing/Info header with encoder delay and padding, and audio diagnostics on MP3 compare an approximation of the original (mp3_encoded_queries is not calibrated). Objects are limited to 512 MiB each and 1 GiB per request. Structural checks cannot see a fake format: a FLAC made from an MP3 has a valid MD5 and a re-encoded 320 kbps MP3 has valid frames; only the report-only bandwidth diagnostic points to them.</w:t>
       </w:r>
     </w:p>
     <w:p>

</xml_diff>

<commit_message>
added per file origin auth reporting + updated readme and tech doc
</commit_message>
<xml_diff>
--- a/Manual_layout_check.docx
+++ b/Manual_layout_check.docx
@@ -231,7 +231,7 @@
           </w:tcPr>
           <w:p>
             <w:r>
-              <w:t>22 October 2026</w:t>
+              <w:t xml:space="preserve">24 October 2026</w:t>
             </w:r>
           </w:p>
         </w:tc>
@@ -305,7 +305,7 @@
           </w:tcPr>
           <w:p>
             <w:r>
-              <w:t xml:space="preserve">1161380 (version 0.8.0 release) plus the version 0.8.1 changes described in this revision</w:t>
+              <w:t xml:space="preserve">1161380 (version 0.8.0 release) plus the version 0.8.1 changes and the 23–24 October 2026 scoring review described in this revision</w:t>
             </w:r>
           </w:p>
         </w:tc>
@@ -387,7 +387,7 @@
           </w:tcPr>
           <w:p>
             <w:r>
-              <w:t>default-v4, version 4</w:t>
+              <w:t xml:space="preserve">default-v6, version 6</w:t>
             </w:r>
           </w:p>
         </w:tc>
@@ -425,7 +425,7 @@
           </w:tcPr>
           <w:p>
             <w:r>
-              <w:t xml:space="preserve">332 tests discovered. All 328 non-GUI tests passed with every optional backend required; the four GUI tests passed when run separately; see Section 9.</w:t>
+              <w:t xml:space="preserve">356 tests discovered. With the core requirements and scipy, 334 ran and passed and 13 were skipped because optional audio backends were absent; see Section 9.</w:t>
             </w:r>
           </w:p>
         </w:tc>
@@ -1358,7 +1358,15 @@
         <w:spacing w:line="276" w:lineRule="auto"/>
       </w:pPr>
       <w:r>
-        <w:t>The default-v4 Integrity profile combines three populated layers using configured weights. Numeric release normally needs at least two populated layers and an assessed cross-evidence fact from a permitted tier. An ordinary contradiction is reported but does not release an otherwise withheld value. A configured severe contradiction can release min(weighted mean, 0.25) without qualifying support. Cross-evidence is scored once per rule and subject, with any assessed failure keeping that fact failed. Missing or unassessable checks are excluded rather than assigned zero; legacy signal and exact reconstruction remain disabled.</w:t>
+        <w:t xml:space="preserve">The default-v6 Integrity profile combines three populated layers using configured weights. Numeric release normally needs at least two populated layers and an assessed cross-evidence fact from a permitted tier. An ordinary contradiction is reported but does not release an otherwise withheld value. A configured severe contradiction can release min(weighted mean, 0.25) without qualifying support. File integrity holds only hash binding and parser readability; every submitted claim compared with a measured property is scored in declaration consistency, once per declared file property. Cross-evidence is scored once per rule and subject, with any assessed failure keeping that fact failed, and the same claim about one recording in a sound report and an AAF counts once. Missing or unassessable checks are excluded rather than assigned zero; legacy signal and exact reconstruction remain disabled.</w:t>
+      </w:r>
+    </w:p>
+    <w:p>
+      <w:pPr>
+        <w:spacing w:line="276" w:lineRule="auto"/>
+      </w:pPr>
+      <w:r>
+        <w:t xml:space="preserve">Three report-only sections accompany Integrity. evidence_sources separates document, fact and source counts and records that every document was uploaded by the same user, leaving independence unknown. support_breadth shows, for each recording the workflow requires, whether qualifying evidence was checked and agreed, checked and disagreed, or was not found. origin_authentication gives every file an origin status from embedded C2PA manifests. None of them changes a score; an optional min_supported_asset_share, absent by default, can make support breadth a release condition.</w:t>
       </w:r>
     </w:p>
     <w:p>
@@ -13122,7 +13130,7 @@
         <w:t>BoundFileIntegrityPass</w:t>
       </w:r>
       <w:r>
-        <w:t xml:space="preserve"> reuses their cached checks. Type-specific parsing feeds cross-evidence, C2PA, AI disclosure and workflow completeness. </w:t>
+        <w:t xml:space="preserve"> reuses their cached binding and parser checks; technical-claim checks are scored in declaration consistency. Type-specific parsing feeds cross-evidence, C2PA, AI disclosure and workflow completeness. </w:t>
       </w:r>
       <w:r>
         <w:rPr>
@@ -13730,7 +13738,7 @@
                 <w:sz w:val="17"/>
                 <w:szCs w:val="18"/>
               </w:rPr>
-              <w:t>Object binding, parser failures and cached WAV checks; unavailable checks excluded.</w:t>
+              <w:t xml:space="preserve">Object binding and parser failures; cached WAV technical-claim checks go to declaration consistency; unavailable checks excluded.</w:t>
             </w:r>
           </w:p>
         </w:tc>
@@ -19477,7 +19485,7 @@
                 <w:sz w:val="17"/>
                 <w:szCs w:val="18"/>
               </w:rPr>
-              <w:t>Coverage or evidence availability, not a probability bound.</w:t>
+              <w:t xml:space="preserve">Coverage or evidence availability, not a probability bound. For Integrity, how many evidence layers were checked, not whether their checks passed.</w:t>
             </w:r>
           </w:p>
         </w:tc>
@@ -20708,7 +20716,7 @@
                 <w:sz w:val="17"/>
                 <w:szCs w:val="18"/>
               </w:rPr>
-              <w:t>SHA-256 binding, technical claims, parser status.</w:t>
+              <w:t xml:space="preserve">SHA-256 binding and parser status; no submitter claims.</w:t>
             </w:r>
           </w:p>
         </w:tc>
@@ -20782,7 +20790,7 @@
                 <w:sz w:val="17"/>
                 <w:szCs w:val="18"/>
               </w:rPr>
-              <w:t>Passed / assessed checks</w:t>
+              <w:t xml:space="preserve">Passed / assessed facts, one per declared file property</w:t>
             </w:r>
           </w:p>
         </w:tc>
@@ -20806,7 +20814,7 @@
           </w:tcPr>
           <w:p>
             <w:r>
-              <w:t>Source and target time validity, order and bounds, plus input/output sample rate or bit depth. Extra successful validation-only checks do not add votes.</w:t>
+              <w:t xml:space="preserve">File technical claims (sample rate, channels, bit depth, duration); source and target time validity, order and bounds; input/output sample rate or bit depth. A property claimed on a file and on its relationships is one fact. Extra successful validation-only checks do not add votes.</w:t>
             </w:r>
           </w:p>
         </w:tc>
@@ -20870,7 +20878,7 @@
           </w:tcPr>
           <w:p>
             <w:r>
-              <w:t>Passed / assessed scored facts, one per rule and subject</w:t>
+              <w:t xml:space="preserve">Passed / assessed scored facts, one per rule and subject; a claim repeated across documents counts once</w:t>
             </w:r>
           </w:p>
         </w:tc>
@@ -21143,17 +21151,17 @@
         <w:spacing w:line="276" w:lineRule="auto"/>
       </w:pPr>
       <w:r>
-        <w:t>policies/scoring_profile.json supplies explicit configuration; weights are not learned or changed automatically from the submitted audio. The default-v4 profile uses weight 1.0 for each eligible layer. File and declaration values are their passed Boolean checks divided by assessed Boolean checks. Cross-evidence uses passed scored facts divided by assessed scored facts. passed=null or a missing Boolean is excluded. A layer with no assessed inputs has value null; any failed scored input marks that layer contradicted.</w:t>
+        <w:t xml:space="preserve">policies/scoring_profile.json supplies explicit configuration; weights are not learned or changed automatically from the submitted audio. The default-v6 profile uses weight 1.0 for each eligible layer. File values are their passed Boolean checks divided by assessed Boolean checks. Declaration values use declaration_scored_facts: passed facts divided by assessed facts, one per declared file property. Cross-evidence uses passed scored facts divided by assessed scored facts. passed=null or a missing Boolean is excluded. A layer with no assessed inputs has value null; any failed scored input marks that layer contradicted.</w:t>
       </w:r>
     </w:p>
     <w:p>
       <w:r>
-        <w:t>aggregate_cross_evidence groups observations by rule and available subject identity, such as audio, asset, source or target hashes. Document hashes, cue/selection labels and AAF mob names do not create extra votes for the same subject. One failed observation makes the grouped fact false even if correct copies outnumber it. For example, one sound report has a wrong timecode and 30 cosmetically different copies have the correct timecode: that recording/timecode fact still fails once. Raw observations remain in cross_evidence; cross_evidence_scored_facts records fact_id, observation indices, assessed tiers, conflicting outcomes and the representative check. Unidentified subjects remain separate unless the rule explicitly uses a collection scope.</w:t>
+        <w:t xml:space="preserve">aggregate_cross_evidence groups observations by rule and available subject identity, such as audio, asset, source or target hashes. Document hashes, cue/selection labels and AAF mob names do not create extra votes for the same subject. One failed observation makes the grouped fact false even if correct copies outnumber it. For example, one sound report has a wrong timecode and 30 cosmetically different copies have the correct timecode: that recording/timecode fact still fails once. Raw observations remain in cross_evidence; cross_evidence_scored_facts records fact_id, observation indices, assessed tiers, conflicting outcomes and the representative check. Unidentified subjects remain separate unless the rule explicitly uses a collection scope. With one_vote_per_claim (true in default-v6), the scene/take and track-name checks of a sound report and an AAF about the same recording form one fact identified by claim, because both documents were uploaded by the same user and their independence is unknown; other rules keep their rule identity. Each scored fact records document_count and delivered_by.</w:t>
       </w:r>
     </w:p>
     <w:p>
       <w:r>
-        <w:t>Hash binding confirms that submitted bytes match the declared digest, not who created them or when. A submitter can alter a WAV and compute a new matching hash. Equal layer weights therefore describe a consistency policy, not equal or calibrated probabilities of authenticity. The file-layer rationale in the current policy is explanatory text and does not authenticate origin.</w:t>
+        <w:t xml:space="preserve">Hash binding confirms that submitted bytes match the declared digest, not who created them or when. A submitter can alter a WAV and compute a new matching hash. Equal layer weights therefore describe a consistency policy, not equal or calibrated probabilities of authenticity. The file-layer rationale in the current policy is explanatory text and does not authenticate origin. Origin is reported separately for every file in origin_authentication (Section 8).</w:t>
       </w:r>
     </w:p>
     <w:p>
@@ -21163,12 +21171,12 @@
     </w:p>
     <w:p>
       <w:r>
-        <w:t>With the shipped withholding rule, a numeric value normally requires at least two populated contributing layers and an assessed cross-evidence fact whose assessed_evidence_tiers includes signed_attestation or recorder_metadata. Such a fact qualifies whether it passes or fails, because the gate concerns available comparisons, not a positive authenticity verdict. An ordinary failure alone never bypasses the gate. With release_capped_value_on_severe_contradiction=true, an assessed failure of a configured severe rule releases min(M, 0.25), even when layer count or qualifying support would otherwise withhold the value.</w:t>
+        <w:t xml:space="preserve">With the shipped withholding rule, a numeric value normally requires at least two populated contributing layers and an assessed cross-evidence fact whose assessed_evidence_tiers includes signed_attestation or recorder_metadata. Such a fact qualifies whether it passes or fails, because the gate concerns available comparisons, not a positive authenticity verdict. An ordinary failure alone never bypasses the gate. With release_capped_value_on_severe_contradiction=true, an assessed failure of a configured severe rule releases min(M, 0.25), even when layer count or qualifying support would otherwise withhold the value. An optional min_supported_asset_share, absent by default, also requires qualifying evidence to have been checked for that share of the workflow's required recordings (audio/raw-take, audio/raw-track); otherwise the value is withheld with release_reason insufficient_support_breadth. A recording whose qualifying evidence disagrees counts as checked, so withholding never hides a contradiction.</w:t>
       </w:r>
     </w:p>
     <w:p>
       <w:r>
-        <w:t>Confidence is round(0.8 × number of populated contributing layers / 3, 3), giving 0.267, 0.533 or 0.800. Availability is available for three populated layers, partial for one or two, and unavailable for none, before input-error adjustments. Withholding can therefore leave value null while availability is available and confidence is 0.800. Neither weights nor a cap change this confidence formula.</w:t>
+        <w:t xml:space="preserve">Confidence is round(0.8 × number of populated contributing layers / 3, 3), giving 0.267, 0.533 or 0.800. Availability is available for three populated layers, partial for one or two, and unavailable for none, before input-error adjustments. Withholding can therefore leave value null while availability is available and confidence is 0.800. Neither weights nor a cap change this confidence formula. It reflects how many of the three layers were checked, not whether their checks passed; the value and integrity_layers show that.</w:t>
       </w:r>
     </w:p>
     <w:tbl>
@@ -21675,6 +21683,88 @@
           <w:p>
             <w:r>
               <w:t>An assessed severe failure can release min(M, cap) without qualifying support. Optional; false when omitted.</w:t>
+            </w:r>
+          </w:p>
+        </w:tc>
+      </w:tr>
+      <w:tr>
+        <w:trPr>
+          <w:cantSplit/>
+        </w:trPr>
+        <w:tc>
+          <w:tcPr>
+            <w:tcW w:w="4032" w:type="dxa"/>
+            <w:shd w:val="clear" w:color="auto" w:fill="EDF3F9"/>
+            <w:vAlign w:val="center"/>
+          </w:tcPr>
+          <w:p>
+            <w:r>
+              <w:t xml:space="preserve">one_vote_per_claim</w:t>
+            </w:r>
+          </w:p>
+        </w:tc>
+        <w:tc>
+          <w:tcPr>
+            <w:tcW w:w="2016" w:type="dxa"/>
+            <w:shd w:val="clear" w:color="auto" w:fill="EDF3F9"/>
+            <w:vAlign w:val="center"/>
+          </w:tcPr>
+          <w:p>
+            <w:r>
+              <w:t xml:space="preserve">true</w:t>
+            </w:r>
+          </w:p>
+        </w:tc>
+        <w:tc>
+          <w:tcPr>
+            <w:tcW w:w="3586" w:type="dxa"/>
+            <w:shd w:val="clear" w:color="auto" w:fill="EDF3F9"/>
+            <w:vAlign w:val="center"/>
+          </w:tcPr>
+          <w:p>
+            <w:r>
+              <w:t xml:space="preserve">Optional Boolean; false when omitted. The same claim about one recording in several documents is one fact.</w:t>
+            </w:r>
+          </w:p>
+        </w:tc>
+      </w:tr>
+      <w:tr>
+        <w:trPr>
+          <w:cantSplit/>
+        </w:trPr>
+        <w:tc>
+          <w:tcPr>
+            <w:tcW w:w="4032" w:type="dxa"/>
+            <w:shd w:val="clear" w:color="auto" w:fill="EDF3F9"/>
+            <w:vAlign w:val="center"/>
+          </w:tcPr>
+          <w:p>
+            <w:r>
+              <w:t xml:space="preserve">min_supported_asset_share</w:t>
+            </w:r>
+          </w:p>
+        </w:tc>
+        <w:tc>
+          <w:tcPr>
+            <w:tcW w:w="2016" w:type="dxa"/>
+            <w:shd w:val="clear" w:color="auto" w:fill="EDF3F9"/>
+            <w:vAlign w:val="center"/>
+          </w:tcPr>
+          <w:p>
+            <w:r>
+              <w:t xml:space="preserve">not set</w:t>
+            </w:r>
+          </w:p>
+        </w:tc>
+        <w:tc>
+          <w:tcPr>
+            <w:tcW w:w="3586" w:type="dxa"/>
+            <w:shd w:val="clear" w:color="auto" w:fill="EDF3F9"/>
+            <w:vAlign w:val="center"/>
+          </w:tcPr>
+          <w:p>
+            <w:r>
+              <w:t xml:space="preserve">Optional number in (0, 1]. Share of the workflow's recordings that must have qualifying evidence checked; absent means support_breadth is report-only.</w:t>
             </w:r>
           </w:p>
         </w:tc>
@@ -21822,7 +21912,7 @@
           </w:tcPr>
           <w:p>
             <w:r>
-              <w:t>Effect under default-v4</w:t>
+              <w:t xml:space="preserve">Effect under default-v6</w:t>
             </w:r>
           </w:p>
         </w:tc>
@@ -22057,7 +22147,7 @@
         <w:spacing w:line="276" w:lineRule="auto"/>
       </w:pPr>
       <w:r>
-        <w:t>When an assessed failure matches severe_contradiction_rules, the default-v4 profile releases Integrity=min(M, 0.25), including when qualifying support or the minimum populated-layer count is absent. The cap never raises a lower mean, changes confidence or forces other axes to zero. A missing non-final mapping has object_hash_bound passed=null; a non-final hash or path rejection can produce passed=false. A final binding failure stops assessment instead of returning a capped successful score.</w:t>
+        <w:t xml:space="preserve">When an assessed failure matches severe_contradiction_rules, the default-v6 profile releases Integrity=min(M, 0.25), including when qualifying support or the minimum populated-layer count is absent. The cap never raises a lower mean, changes confidence or forces other axes to zero. A missing non-final mapping has object_hash_bound passed=null; a non-final hash or path rejection can produce passed=false. A final binding failure stops assessment instead of returning a capped successful score.</w:t>
       </w:r>
     </w:p>
     <w:tbl>
@@ -22451,7 +22541,7 @@
     </w:p>
     <w:p>
       <w:r>
-        <w:t>The examples below apply default-v4 with equal weights and no later input-coverage downgrade. F, D and X denote the file, declaration and cross-evidence values; X uses scored facts. A dash is an unpopulated layer. These are arithmetic examples, not measured provenance cases.</w:t>
+        <w:t xml:space="preserve">The examples below apply default-v6 with equal weights and no later input-coverage downgrade. F, D and X denote the file, declaration and cross-evidence values; X uses scored facts. A dash is an unpopulated layer. These are arithmetic examples, not measured provenance cases.</w:t>
       </w:r>
     </w:p>
     <w:tbl>
@@ -24381,7 +24471,7 @@
           </w:tcPr>
           <w:p>
             <w:r>
-              <w:t>Core checks, scored facts and audit groups, Integrity decision, disclosure coverage, layers, cap, explanations, C2PA records and optional audio arrays.</w:t>
+              <w:t xml:space="preserve">Core checks, scored facts and audit groups, Integrity decision, disclosure coverage, layers, cap, explanations, C2PA records, evidence sources, support breadth, origin authentication and optional audio arrays.</w:t>
             </w:r>
           </w:p>
         </w:tc>
@@ -24939,6 +25029,314 @@
           <w:p>
             <w:r>
               <w:t>Only scored facts determine the cross-evidence fraction; audit groups are diagnostic.</w:t>
+            </w:r>
+          </w:p>
+        </w:tc>
+      </w:tr>
+      <w:tr>
+        <w:trPr>
+          <w:cantSplit/>
+        </w:trPr>
+        <w:tc>
+          <w:tcPr>
+            <w:tcW w:w="2409" w:type="dxa"/>
+            <w:tcBorders>
+              <w:top w:val="single" w:sz="4" w:space="0" w:color="C9D3DF"/>
+              <w:left w:val="single" w:sz="4" w:space="0" w:color="C9D3DF"/>
+              <w:bottom w:val="single" w:sz="4" w:space="0" w:color="C9D3DF"/>
+              <w:right w:val="single" w:sz="4" w:space="0" w:color="C9D3DF"/>
+            </w:tcBorders>
+            <w:shd w:val="clear" w:color="auto" w:fill="EDF3F9"/>
+            <w:tcMar>
+              <w:top w:w="70" w:type="dxa"/>
+              <w:left w:w="110" w:type="dxa"/>
+              <w:bottom w:w="70" w:type="dxa"/>
+              <w:right w:w="110" w:type="dxa"/>
+            </w:tcMar>
+            <w:vAlign w:val="center"/>
+          </w:tcPr>
+          <w:p>
+            <w:r>
+              <w:t xml:space="preserve">declared_file_properties / declaration_scored_facts</w:t>
+            </w:r>
+          </w:p>
+        </w:tc>
+        <w:tc>
+          <w:tcPr>
+            <w:tcW w:w="4015" w:type="dxa"/>
+            <w:tcBorders>
+              <w:top w:val="single" w:sz="4" w:space="0" w:color="C9D3DF"/>
+              <w:left w:val="single" w:sz="4" w:space="0" w:color="C9D3DF"/>
+              <w:bottom w:val="single" w:sz="4" w:space="0" w:color="C9D3DF"/>
+              <w:right w:val="single" w:sz="4" w:space="0" w:color="C9D3DF"/>
+            </w:tcBorders>
+            <w:shd w:val="clear" w:color="auto" w:fill="EDF3F9"/>
+            <w:tcMar>
+              <w:top w:w="70" w:type="dxa"/>
+              <w:left w:w="110" w:type="dxa"/>
+              <w:bottom w:w="70" w:type="dxa"/>
+              <w:right w:w="110" w:type="dxa"/>
+            </w:tcMar>
+            <w:vAlign w:val="center"/>
+          </w:tcPr>
+          <w:p>
+            <w:r>
+              <w:t xml:space="preserve">File technical-claim checks and declaration facts, one per declared file property</w:t>
+            </w:r>
+          </w:p>
+        </w:tc>
+        <w:tc>
+          <w:tcPr>
+            <w:tcW w:w="3214" w:type="dxa"/>
+            <w:tcBorders>
+              <w:top w:val="single" w:sz="4" w:space="0" w:color="C9D3DF"/>
+              <w:left w:val="single" w:sz="4" w:space="0" w:color="C9D3DF"/>
+              <w:bottom w:val="single" w:sz="4" w:space="0" w:color="C9D3DF"/>
+              <w:right w:val="single" w:sz="4" w:space="0" w:color="C9D3DF"/>
+            </w:tcBorders>
+            <w:shd w:val="clear" w:color="auto" w:fill="EDF3F9"/>
+            <w:tcMar>
+              <w:top w:w="70" w:type="dxa"/>
+              <w:left w:w="110" w:type="dxa"/>
+              <w:bottom w:w="70" w:type="dxa"/>
+              <w:right w:w="110" w:type="dxa"/>
+            </w:tcMar>
+            <w:vAlign w:val="center"/>
+          </w:tcPr>
+          <w:p>
+            <w:r>
+              <w:t xml:space="preserve">Only scored facts determine the declaration fraction.</w:t>
+            </w:r>
+          </w:p>
+        </w:tc>
+      </w:tr>
+      <w:tr>
+        <w:trPr>
+          <w:cantSplit/>
+        </w:trPr>
+        <w:tc>
+          <w:tcPr>
+            <w:tcW w:w="2409" w:type="dxa"/>
+            <w:tcBorders>
+              <w:top w:val="single" w:sz="4" w:space="0" w:color="C9D3DF"/>
+              <w:left w:val="single" w:sz="4" w:space="0" w:color="C9D3DF"/>
+              <w:bottom w:val="single" w:sz="4" w:space="0" w:color="C9D3DF"/>
+              <w:right w:val="single" w:sz="4" w:space="0" w:color="C9D3DF"/>
+            </w:tcBorders>
+            <w:shd w:val="clear" w:color="auto" w:fill="EDF3F9"/>
+            <w:tcMar>
+              <w:top w:w="70" w:type="dxa"/>
+              <w:left w:w="110" w:type="dxa"/>
+              <w:bottom w:w="70" w:type="dxa"/>
+              <w:right w:w="110" w:type="dxa"/>
+            </w:tcMar>
+            <w:vAlign w:val="center"/>
+          </w:tcPr>
+          <w:p>
+            <w:r>
+              <w:t xml:space="preserve">evidence_sources</w:t>
+            </w:r>
+          </w:p>
+        </w:tc>
+        <w:tc>
+          <w:tcPr>
+            <w:tcW w:w="4015" w:type="dxa"/>
+            <w:tcBorders>
+              <w:top w:val="single" w:sz="4" w:space="0" w:color="C9D3DF"/>
+              <w:left w:val="single" w:sz="4" w:space="0" w:color="C9D3DF"/>
+              <w:bottom w:val="single" w:sz="4" w:space="0" w:color="C9D3DF"/>
+              <w:right w:val="single" w:sz="4" w:space="0" w:color="C9D3DF"/>
+            </w:tcBorders>
+            <w:shd w:val="clear" w:color="auto" w:fill="EDF3F9"/>
+            <w:tcMar>
+              <w:top w:w="70" w:type="dxa"/>
+              <w:left w:w="110" w:type="dxa"/>
+              <w:bottom w:w="70" w:type="dxa"/>
+              <w:right w:w="110" w:type="dxa"/>
+            </w:tcMar>
+            <w:vAlign w:val="center"/>
+          </w:tcPr>
+          <w:p>
+            <w:r>
+              <w:t xml:space="preserve">Document, fact and known-source counts, trusted signers, recordings several documents agree about, parsed creator and software fields; independence unknown</w:t>
+            </w:r>
+          </w:p>
+        </w:tc>
+        <w:tc>
+          <w:tcPr>
+            <w:tcW w:w="3214" w:type="dxa"/>
+            <w:tcBorders>
+              <w:top w:val="single" w:sz="4" w:space="0" w:color="C9D3DF"/>
+              <w:left w:val="single" w:sz="4" w:space="0" w:color="C9D3DF"/>
+              <w:bottom w:val="single" w:sz="4" w:space="0" w:color="C9D3DF"/>
+              <w:right w:val="single" w:sz="4" w:space="0" w:color="C9D3DF"/>
+            </w:tcBorders>
+            <w:shd w:val="clear" w:color="auto" w:fill="EDF3F9"/>
+            <w:tcMar>
+              <w:top w:w="70" w:type="dxa"/>
+              <w:left w:w="110" w:type="dxa"/>
+              <w:bottom w:w="70" w:type="dxa"/>
+              <w:right w:w="110" w:type="dxa"/>
+            </w:tcMar>
+            <w:vAlign w:val="center"/>
+          </w:tcPr>
+          <w:p>
+            <w:r>
+              <w:t xml:space="preserve">Separates documents from facts and sources; never changes a score.</w:t>
+            </w:r>
+          </w:p>
+        </w:tc>
+      </w:tr>
+      <w:tr>
+        <w:trPr>
+          <w:cantSplit/>
+        </w:trPr>
+        <w:tc>
+          <w:tcPr>
+            <w:tcW w:w="2409" w:type="dxa"/>
+            <w:tcBorders>
+              <w:top w:val="single" w:sz="4" w:space="0" w:color="C9D3DF"/>
+              <w:left w:val="single" w:sz="4" w:space="0" w:color="C9D3DF"/>
+              <w:bottom w:val="single" w:sz="4" w:space="0" w:color="C9D3DF"/>
+              <w:right w:val="single" w:sz="4" w:space="0" w:color="C9D3DF"/>
+            </w:tcBorders>
+            <w:shd w:val="clear" w:color="auto" w:fill="EDF3F9"/>
+            <w:tcMar>
+              <w:top w:w="70" w:type="dxa"/>
+              <w:left w:w="110" w:type="dxa"/>
+              <w:bottom w:w="70" w:type="dxa"/>
+              <w:right w:w="110" w:type="dxa"/>
+            </w:tcMar>
+            <w:vAlign w:val="center"/>
+          </w:tcPr>
+          <w:p>
+            <w:r>
+              <w:t xml:space="preserve">support_breadth</w:t>
+            </w:r>
+          </w:p>
+        </w:tc>
+        <w:tc>
+          <w:tcPr>
+            <w:tcW w:w="4015" w:type="dxa"/>
+            <w:tcBorders>
+              <w:top w:val="single" w:sz="4" w:space="0" w:color="C9D3DF"/>
+              <w:left w:val="single" w:sz="4" w:space="0" w:color="C9D3DF"/>
+              <w:bottom w:val="single" w:sz="4" w:space="0" w:color="C9D3DF"/>
+              <w:right w:val="single" w:sz="4" w:space="0" w:color="C9D3DF"/>
+            </w:tcBorders>
+            <w:shd w:val="clear" w:color="auto" w:fill="EDF3F9"/>
+            <w:tcMar>
+              <w:top w:w="70" w:type="dxa"/>
+              <w:left w:w="110" w:type="dxa"/>
+              <w:bottom w:w="70" w:type="dxa"/>
+              <w:right w:w="110" w:type="dxa"/>
+            </w:tcMar>
+            <w:vAlign w:val="center"/>
+          </w:tcPr>
+          <w:p>
+            <w:r>
+              <w:t xml:space="preserve">Supported, contradicted or no qualifying evidence for each recording the workflow requires</w:t>
+            </w:r>
+          </w:p>
+        </w:tc>
+        <w:tc>
+          <w:tcPr>
+            <w:tcW w:w="3214" w:type="dxa"/>
+            <w:tcBorders>
+              <w:top w:val="single" w:sz="4" w:space="0" w:color="C9D3DF"/>
+              <w:left w:val="single" w:sz="4" w:space="0" w:color="C9D3DF"/>
+              <w:bottom w:val="single" w:sz="4" w:space="0" w:color="C9D3DF"/>
+              <w:right w:val="single" w:sz="4" w:space="0" w:color="C9D3DF"/>
+            </w:tcBorders>
+            <w:shd w:val="clear" w:color="auto" w:fill="EDF3F9"/>
+            <w:tcMar>
+              <w:top w:w="70" w:type="dxa"/>
+              <w:left w:w="110" w:type="dxa"/>
+              <w:bottom w:w="70" w:type="dxa"/>
+              <w:right w:w="110" w:type="dxa"/>
+            </w:tcMar>
+            <w:vAlign w:val="center"/>
+          </w:tcPr>
+          <w:p>
+            <w:r>
+              <w:t xml:space="preserve">Shows how much of the workflow the release evidence covers; gates release only with min_supported_asset_share.</w:t>
+            </w:r>
+          </w:p>
+        </w:tc>
+      </w:tr>
+      <w:tr>
+        <w:trPr>
+          <w:cantSplit/>
+        </w:trPr>
+        <w:tc>
+          <w:tcPr>
+            <w:tcW w:w="2409" w:type="dxa"/>
+            <w:tcBorders>
+              <w:top w:val="single" w:sz="4" w:space="0" w:color="C9D3DF"/>
+              <w:left w:val="single" w:sz="4" w:space="0" w:color="C9D3DF"/>
+              <w:bottom w:val="single" w:sz="4" w:space="0" w:color="C9D3DF"/>
+              <w:right w:val="single" w:sz="4" w:space="0" w:color="C9D3DF"/>
+            </w:tcBorders>
+            <w:shd w:val="clear" w:color="auto" w:fill="EDF3F9"/>
+            <w:tcMar>
+              <w:top w:w="70" w:type="dxa"/>
+              <w:left w:w="110" w:type="dxa"/>
+              <w:bottom w:w="70" w:type="dxa"/>
+              <w:right w:w="110" w:type="dxa"/>
+            </w:tcMar>
+            <w:vAlign w:val="center"/>
+          </w:tcPr>
+          <w:p>
+            <w:r>
+              <w:t xml:space="preserve">origin_authentication</w:t>
+            </w:r>
+          </w:p>
+        </w:tc>
+        <w:tc>
+          <w:tcPr>
+            <w:tcW w:w="4015" w:type="dxa"/>
+            <w:tcBorders>
+              <w:top w:val="single" w:sz="4" w:space="0" w:color="C9D3DF"/>
+              <w:left w:val="single" w:sz="4" w:space="0" w:color="C9D3DF"/>
+              <w:bottom w:val="single" w:sz="4" w:space="0" w:color="C9D3DF"/>
+              <w:right w:val="single" w:sz="4" w:space="0" w:color="C9D3DF"/>
+            </w:tcBorders>
+            <w:shd w:val="clear" w:color="auto" w:fill="EDF3F9"/>
+            <w:tcMar>
+              <w:top w:w="70" w:type="dxa"/>
+              <w:left w:w="110" w:type="dxa"/>
+              <w:bottom w:w="70" w:type="dxa"/>
+              <w:right w:w="110" w:type="dxa"/>
+            </w:tcMar>
+            <w:vAlign w:val="center"/>
+          </w:tcPr>
+          <w:p>
+            <w:r>
+              <w:t xml:space="preserve">Origin status and signer for every submitted file</w:t>
+            </w:r>
+          </w:p>
+        </w:tc>
+        <w:tc>
+          <w:tcPr>
+            <w:tcW w:w="3214" w:type="dxa"/>
+            <w:tcBorders>
+              <w:top w:val="single" w:sz="4" w:space="0" w:color="C9D3DF"/>
+              <w:left w:val="single" w:sz="4" w:space="0" w:color="C9D3DF"/>
+              <w:bottom w:val="single" w:sz="4" w:space="0" w:color="C9D3DF"/>
+              <w:right w:val="single" w:sz="4" w:space="0" w:color="C9D3DF"/>
+            </w:tcBorders>
+            <w:shd w:val="clear" w:color="auto" w:fill="EDF3F9"/>
+            <w:tcMar>
+              <w:top w:w="70" w:type="dxa"/>
+              <w:left w:w="110" w:type="dxa"/>
+              <w:bottom w:w="70" w:type="dxa"/>
+              <w:right w:w="110" w:type="dxa"/>
+            </w:tcMar>
+            <w:vAlign w:val="center"/>
+          </w:tcPr>
+          <w:p>
+            <w:r>
+              <w:t xml:space="preserve">Reports origin separately from consistency; never changes a score.</w:t>
             </w:r>
           </w:p>
         </w:tc>
@@ -27886,6 +28284,14 @@
     </w:p>
     <w:p>
       <w:pPr>
+        <w:spacing w:line="276" w:lineRule="auto"/>
+      </w:pPr>
+      <w:r>
+        <w:t xml:space="preserve">assessment_checks.origin_authentication gives every submitted file one origin status: signed_by_trusted_signer, signed_by_known_ai_signer, signed_untrusted, signature_not_verified, signature_invalid, linked_manifest_not_verified, not_checked or not_authenticated. Only a manifest embedded in the file and checked against its bytes can identify who signed it. A standalone manifest is linked to an asset only through the declared graph, so it is reported as linked_manifest_not_verified. An invalid manifest outranks a trusted one, and a missing SDK or an unreadable manifest is not_checked rather than absent. Files whose type is never read for C2PA carry c2pa_checked=false. The section never changes a score.</w:t>
+      </w:r>
+    </w:p>
+    <w:p>
+      <w:pPr>
         <w:pStyle w:val="Heading2"/>
         <w:keepNext/>
         <w:keepLines/>
@@ -27909,7 +28315,7 @@
         <w:spacing w:line="276" w:lineRule="auto"/>
       </w:pPr>
       <w:r>
-        <w:t>tests/test_c2pa_integrity.py has 24 offline cases covering pinned-list hash checks, trust status, asymmetric trust, known AI signer matching, the C2PA chunk precondition and every final state. Its fixtures are signed at runtime with throwaway certificates, so they test failure handling, not a production signer.</w:t>
+        <w:t xml:space="preserve">tests/test_c2pa_integrity.py has 31 offline cases covering pinned-list hash checks, trust status, asymmetric trust, known AI signer matching, the C2PA chunk precondition, every final state and the per-file origin status. Its fixtures are signed at runtime with throwaway certificates, so they test failure handling, not a production signer.</w:t>
       </w:r>
     </w:p>
     <w:p>
@@ -28963,7 +29369,7 @@
                 <w:sz w:val="17"/>
                 <w:szCs w:val="18"/>
               </w:rPr>
-              <w:t>File, declaration and cross-evidence aggregation, C2PA attestation with pinned trust, the C2PA chunk precondition and final-state findings, AI disclosure, tier-aware Integrity, cap and contradiction reasoning.</w:t>
+              <w:t xml:space="preserve">File, declaration and cross-evidence aggregation, C2PA attestation with pinned trust, the C2PA chunk precondition and final-state findings, AI disclosure, per-file origin authentication, support breadth, tier-aware Integrity, cap and contradiction reasoning.</w:t>
             </w:r>
           </w:p>
         </w:tc>
@@ -29412,7 +29818,7 @@
                 <w:color w:val="000000"/>
                 <w:sz w:val="17"/>
               </w:rPr>
-              <w:t>Validates configurable weights, permitted support tiers, withholding, confidence and severe-rule configuration; CLI loads the shipped profile.</w:t>
+              <w:t xml:space="preserve">Validates configurable weights, permitted support tiers, withholding (including the optional min_supported_asset_share), confidence, one_vote_per_claim and severe-rule configuration; CLI loads the shipped profile.</w:t>
             </w:r>
           </w:p>
         </w:tc>
@@ -29484,7 +29890,7 @@
                 <w:sz w:val="17"/>
                 <w:szCs w:val="18"/>
               </w:rPr>
-              <w:t>Workflow triggers, completeness and out-of-policy evidence.</w:t>
+              <w:t xml:space="preserve">Workflow triggers, completeness, out-of-policy evidence and the recording types each workflow requires.</w:t>
             </w:r>
           </w:p>
         </w:tc>
@@ -29827,7 +30233,7 @@
           </w:tcPr>
           <w:p>
             <w:r>
-              <w:t>Conservative cross-evidence fact aggregation and audit groups; shared symmetric endpoint validation with one-sample EOF tolerance.</w:t>
+              <w:t xml:space="preserve">Conservative cross-evidence fact aggregation with optional one vote per claim, declaration facts per file property, evidence-source and support-breadth summaries, and audit groups; shared symmetric endpoint validation with one-sample EOF tolerance.</w:t>
             </w:r>
           </w:p>
         </w:tc>
@@ -30159,7 +30565,7 @@
           </w:tcPr>
           <w:p>
             <w:r>
-              <w:t>default-v4: equal layer weights, fact aggregation, qualifying-support gate, severe-release exception, confidence ceiling 0.8 and cap 0.25.</w:t>
+              <w:t xml:space="preserve">default-v6: equal layer weights, technical claims in declaration consistency, fact aggregation with one vote per claim, qualifying-support gate, severe-release exception, confidence ceiling 0.8 and cap 0.25.</w:t>
             </w:r>
           </w:p>
         </w:tc>
@@ -30723,7 +31129,7 @@
           </w:tcPr>
           <w:p>
             <w:r>
-              <w:t>131 core tests, including explicit legacy-profile compatibility cases; the shipped default profile is version 4.</w:t>
+              <w:t xml:space="preserve">132 core tests, including explicit legacy-profile compatibility cases; the shipped default profile is version 6.</w:t>
             </w:r>
           </w:p>
         </w:tc>
@@ -31200,7 +31606,7 @@
           </w:tcPr>
           <w:p>
             <w:r>
-              <w:t>24 tests: required SDK; runtime-signed valid, post-signing edit, corrupted certificate and supporting-manifest cases; pinned-list hashes; trust status; asymmetric trust; known AI signer; the C2PA chunk precondition; and every final state.</w:t>
+              <w:t xml:space="preserve">31 tests: required SDK; runtime-signed valid, post-signing edit, corrupted certificate and supporting-manifest cases; pinned-list hashes; trust status; asymmetric trust; known AI signer; the C2PA chunk precondition; every final state and per-file origin status.</w:t>
             </w:r>
           </w:p>
         </w:tc>
@@ -31359,7 +31765,7 @@
           </w:tcPr>
           <w:p>
             <w:r>
-              <w:t>Input isolation, audio regressions and scoring-policy regression cases.</w:t>
+              <w:t xml:space="preserve">Input isolation, audio regressions and scoring-policy regression cases, including one vote per claim, evidence sources and support breadth.</w:t>
             </w:r>
           </w:p>
         </w:tc>
@@ -31451,7 +31857,7 @@
     <w:p>
       <w:r>
         <w:lastRenderedPageBreak/>
-        <w:t xml:space="preserve">The current discovery contains 332 cases: 131 core; 41 audio diagnostics; 24 C2PA; 22 remediation; 19 non-GUI builder; 15 builder-result; 14 scoring-remediation; 12 local-file-reference; 27 production-document; 9 audio calibration; 6 DAW-session; 5 structure benchmark; 3 music benchmark; and 4 GUI cases. Run GUI cases in separate processes when investigating macOS Tk lifecycle hangs; do not treat excluded cases as passes or skips.</w:t>
+        <w:t xml:space="preserve">The current discovery contains 356 cases: 132 core; 41 audio diagnostics; 31 C2PA; 22 remediation; 19 non-GUI builder; 15 builder-result; 30 scoring-remediation; 12 local-file-reference; 27 production-document; 9 audio calibration; 6 DAW-session; 5 structure benchmark; 3 music benchmark; and 4 GUI cases. Run GUI cases in separate processes when investigating macOS Tk lifecycle hangs; do not treat excluded cases as passes or skips.</w:t>
       </w:r>
     </w:p>
     <w:p>
@@ -31476,6 +31882,14 @@
       </w:r>
     </w:p>
     <w:p>
+      <w:pPr>
+        <w:spacing w:line="276" w:lineRule="auto"/>
+      </w:pPr>
+      <w:r>
+        <w:t xml:space="preserve">The scoring review of 23–24 October 2026 moves file technical claims to declaration consistency (profile version 5), counts a claim repeated across a sound report and an AAF once (version 6), relabels Integrity confidence as layers checked, states that consistency does not authenticate origin, and adds the report-only evidence_sources, support_breadth and origin_authentication sections with the optional min_supported_asset_share gate. Only the first two changes can alter a score. For this revision the suite was run with the core requirements and scipy but without the optional audio backends: 334 tests ran and passed, and 13 were skipped (a test class that needs a missing backend counts once). The REQUIRE_AUDIO_BACKENDS=1 run has not been repeated for these changes. The example responses under examples/, except audio-diagnostics, were regenerated.</w:t>
+      </w:r>
+    </w:p>
+    <w:p>
       <w:r>
         <w:t>Stored examples and reports are snapshots rather than fresh evidence of the current runtime. Regenerate response files when comparing a modified program or policy, and retain system.source_revision together with the Git commit and scoring-profile ID/version.</w:t>
       </w:r>
@@ -31497,7 +31911,7 @@
         <w:spacing w:line="276" w:lineRule="auto"/>
       </w:pPr>
       <w:r>
-        <w:t>This chapter collects the known limitations of version 0.8.1 in one place. Each one is a deliberate boundary or a dependency on outside parties, not an undetected defect; the results remain valid within these limits. Work that would remove a limitation is listed in Section 11.</w:t>
+        <w:t xml:space="preserve">This chapter collects the known limitations of version 0.8.1, with the scoring review, in one place. Each one is a deliberate boundary or a dependency on outside parties, not an undetected defect; the results remain valid within these limits. Work that would remove a limitation is listed in Section 11.</w:t>
       </w:r>
     </w:p>
     <w:p>
@@ -31574,7 +31988,7 @@
         <w:spacing w:after="60" w:line="276" w:lineRule="auto"/>
       </w:pPr>
       <w:r>
-        <w:t>A trusted signature identifies who signed a manifest, not that its claims are true. A standalone manifest linked to the final artefact only by graph adjacency is not content-bound to it.</w:t>
+        <w:t xml:space="preserve">A trusted signature identifies who signed a manifest, not that its claims are true. A standalone manifest linked to the final artefact only by graph adjacency is not content-bound to it, yet attestation strength still uses its trust status, so a trusted standalone manifest gives 1.0. origin_authentication reports such files as linked_manifest_not_verified; the scoring fix is listed in Section 11.</w:t>
       </w:r>
     </w:p>
     <w:p>
@@ -31613,7 +32027,7 @@
         <w:spacing w:after="60" w:line="276" w:lineRule="auto"/>
       </w:pPr>
       <w:r>
-        <w:t>Layer weights, permitted support tiers and severe rules in default-v4 are reviewed policy choices, not calibrated probabilities. Integrity measures consistency between assessed evidence, not authenticity.</w:t>
+        <w:t xml:space="preserve">Layer weights, permitted support tiers and severe rules in default-v6 are reviewed policy choices, not calibrated probabilities. Integrity measures consistency between assessed evidence, not authenticity.</w:t>
       </w:r>
     </w:p>
     <w:p>
@@ -31639,7 +32053,7 @@
         <w:spacing w:after="60" w:line="276" w:lineRule="auto"/>
       </w:pPr>
       <w:r>
-        <w:t>Submitter documents such as RIN, ERN, AAF, DAW sessions and sound reports are declarations in another format; agreement with the graph shows consistency, not independent origin.</w:t>
+        <w:t xml:space="preserve">Submitter documents such as RIN, ERN, AAF, DAW sessions and sound reports are declarations in another format; agreement with the graph shows consistency, not independent origin. evidence_sources records the uploader as the known common source and leaves independence unknown; documents that share a creator or software are not yet grouped.</w:t>
       </w:r>
     </w:p>
     <w:p>
@@ -32116,7 +32530,7 @@
           </w:tcPr>
           <w:p>
             <w:r>
-              <w:t>Review default-v4 weights, fact identities, permitted tiers and severe rules; retain explicit consistency-only semantics and test sensitivity.</w:t>
+              <w:t xml:space="preserve">Review default-v6 weights, fact identities, permitted tiers, severe rules and whether to set min_supported_asset_share; retain explicit consistency-only semantics and test sensitivity.</w:t>
             </w:r>
           </w:p>
         </w:tc>
@@ -32150,6 +32564,268 @@
                 <w:sz w:val="17"/>
               </w:rPr>
               <w:t>Versioned policy and registry with reviewed rationale and sensitivity results.</w:t>
+            </w:r>
+          </w:p>
+        </w:tc>
+      </w:tr>
+      <w:tr>
+        <w:trPr>
+          <w:cantSplit/>
+        </w:trPr>
+        <w:tc>
+          <w:tcPr>
+            <w:tcW w:w="963" w:type="dxa"/>
+            <w:tcBorders>
+              <w:top w:val="single" w:sz="4" w:space="0" w:color="C9D3DF"/>
+              <w:left w:val="single" w:sz="4" w:space="0" w:color="C9D3DF"/>
+              <w:bottom w:val="single" w:sz="4" w:space="0" w:color="C9D3DF"/>
+              <w:right w:val="single" w:sz="4" w:space="0" w:color="C9D3DF"/>
+            </w:tcBorders>
+            <w:shd w:val="clear" w:color="auto" w:fill="FFFFFF"/>
+            <w:tcMar>
+              <w:top w:w="70" w:type="dxa"/>
+              <w:left w:w="110" w:type="dxa"/>
+              <w:bottom w:w="70" w:type="dxa"/>
+              <w:right w:w="110" w:type="dxa"/>
+            </w:tcMar>
+            <w:vAlign w:val="center"/>
+          </w:tcPr>
+          <w:p>
+            <w:pPr>
+              <w:keepNext/>
+              <w:keepLines/>
+              <w:spacing w:after="40" w:line="254" w:lineRule="auto"/>
+              <w:jc w:val="center"/>
+            </w:pPr>
+            <w:r>
+              <w:rPr>
+                <w:color w:val="000000"/>
+                <w:sz w:val="17"/>
+                <w:szCs w:val="18"/>
+              </w:rPr>
+              <w:t xml:space="preserve">P0</w:t>
+            </w:r>
+          </w:p>
+        </w:tc>
+        <w:tc>
+          <w:tcPr>
+            <w:tcW w:w="2001" w:type="dxa"/>
+            <w:tcBorders>
+              <w:top w:val="single" w:sz="4" w:space="0" w:color="C9D3DF"/>
+              <w:left w:val="single" w:sz="4" w:space="0" w:color="C9D3DF"/>
+              <w:bottom w:val="single" w:sz="4" w:space="0" w:color="C9D3DF"/>
+              <w:right w:val="single" w:sz="4" w:space="0" w:color="C9D3DF"/>
+            </w:tcBorders>
+            <w:shd w:val="clear" w:color="auto" w:fill="FFFFFF"/>
+            <w:tcMar>
+              <w:top w:w="70" w:type="dxa"/>
+              <w:left w:w="110" w:type="dxa"/>
+              <w:bottom w:w="70" w:type="dxa"/>
+              <w:right w:w="110" w:type="dxa"/>
+            </w:tcMar>
+            <w:vAlign w:val="center"/>
+          </w:tcPr>
+          <w:p>
+            <w:pPr>
+              <w:keepNext/>
+              <w:keepLines/>
+              <w:spacing w:after="40" w:line="254" w:lineRule="auto"/>
+            </w:pPr>
+            <w:r>
+              <w:rPr>
+                <w:color w:val="000000"/>
+                <w:sz w:val="17"/>
+                <w:szCs w:val="18"/>
+              </w:rPr>
+              <w:t xml:space="preserve">Standalone C2PA attestation</w:t>
+            </w:r>
+          </w:p>
+        </w:tc>
+        <w:tc>
+          <w:tcPr>
+            <w:tcW w:w="3706" w:type="dxa"/>
+            <w:tcBorders>
+              <w:top w:val="single" w:sz="4" w:space="0" w:color="C9D3DF"/>
+              <w:left w:val="single" w:sz="4" w:space="0" w:color="C9D3DF"/>
+              <w:bottom w:val="single" w:sz="4" w:space="0" w:color="C9D3DF"/>
+              <w:right w:val="single" w:sz="4" w:space="0" w:color="C9D3DF"/>
+            </w:tcBorders>
+            <w:shd w:val="clear" w:color="auto" w:fill="FFFFFF"/>
+            <w:tcMar>
+              <w:top w:w="70" w:type="dxa"/>
+              <w:left w:w="110" w:type="dxa"/>
+              <w:bottom w:w="70" w:type="dxa"/>
+              <w:right w:w="110" w:type="dxa"/>
+            </w:tcMar>
+            <w:vAlign w:val="center"/>
+          </w:tcPr>
+          <w:p>
+            <w:r>
+              <w:t xml:space="preserve">Validate a standalone manifest against the asset's bytes, or cap it as unverified, before it can raise attestation strength.</w:t>
+            </w:r>
+          </w:p>
+        </w:tc>
+        <w:tc>
+          <w:tcPr>
+            <w:tcW w:w="2968" w:type="dxa"/>
+            <w:tcBorders>
+              <w:top w:val="single" w:sz="4" w:space="0" w:color="C9D3DF"/>
+              <w:left w:val="single" w:sz="4" w:space="0" w:color="C9D3DF"/>
+              <w:bottom w:val="single" w:sz="4" w:space="0" w:color="C9D3DF"/>
+              <w:right w:val="single" w:sz="4" w:space="0" w:color="C9D3DF"/>
+            </w:tcBorders>
+            <w:shd w:val="clear" w:color="auto" w:fill="FFFFFF"/>
+            <w:tcMar>
+              <w:top w:w="70" w:type="dxa"/>
+              <w:left w:w="110" w:type="dxa"/>
+              <w:bottom w:w="70" w:type="dxa"/>
+              <w:right w:w="110" w:type="dxa"/>
+            </w:tcMar>
+            <w:vAlign w:val="center"/>
+          </w:tcPr>
+          <w:p>
+            <w:pPr>
+              <w:keepNext/>
+              <w:keepLines/>
+              <w:spacing w:after="40" w:line="254" w:lineRule="auto"/>
+            </w:pPr>
+            <w:r>
+              <w:rPr>
+                <w:color w:val="000000"/>
+                <w:sz w:val="17"/>
+              </w:rPr>
+              <w:t xml:space="preserve">A trusted standalone manifest linked only through the graph no longer gives 1.0; tests cover both cases.</w:t>
+            </w:r>
+          </w:p>
+        </w:tc>
+      </w:tr>
+      <w:tr>
+        <w:trPr>
+          <w:cantSplit/>
+        </w:trPr>
+        <w:tc>
+          <w:tcPr>
+            <w:tcW w:w="963" w:type="dxa"/>
+            <w:tcBorders>
+              <w:top w:val="single" w:sz="4" w:space="0" w:color="C9D3DF"/>
+              <w:left w:val="single" w:sz="4" w:space="0" w:color="C9D3DF"/>
+              <w:bottom w:val="single" w:sz="4" w:space="0" w:color="C9D3DF"/>
+              <w:right w:val="single" w:sz="4" w:space="0" w:color="C9D3DF"/>
+            </w:tcBorders>
+            <w:shd w:val="clear" w:color="auto" w:fill="FFFFFF"/>
+            <w:tcMar>
+              <w:top w:w="70" w:type="dxa"/>
+              <w:left w:w="110" w:type="dxa"/>
+              <w:bottom w:w="70" w:type="dxa"/>
+              <w:right w:w="110" w:type="dxa"/>
+            </w:tcMar>
+            <w:vAlign w:val="center"/>
+          </w:tcPr>
+          <w:p>
+            <w:pPr>
+              <w:keepNext/>
+              <w:keepLines/>
+              <w:spacing w:after="40" w:line="254" w:lineRule="auto"/>
+              <w:jc w:val="center"/>
+            </w:pPr>
+            <w:r>
+              <w:rPr>
+                <w:color w:val="000000"/>
+                <w:sz w:val="17"/>
+                <w:szCs w:val="18"/>
+              </w:rPr>
+              <w:t xml:space="preserve">P0</w:t>
+            </w:r>
+          </w:p>
+        </w:tc>
+        <w:tc>
+          <w:tcPr>
+            <w:tcW w:w="2001" w:type="dxa"/>
+            <w:tcBorders>
+              <w:top w:val="single" w:sz="4" w:space="0" w:color="C9D3DF"/>
+              <w:left w:val="single" w:sz="4" w:space="0" w:color="C9D3DF"/>
+              <w:bottom w:val="single" w:sz="4" w:space="0" w:color="C9D3DF"/>
+              <w:right w:val="single" w:sz="4" w:space="0" w:color="C9D3DF"/>
+            </w:tcBorders>
+            <w:shd w:val="clear" w:color="auto" w:fill="FFFFFF"/>
+            <w:tcMar>
+              <w:top w:w="70" w:type="dxa"/>
+              <w:left w:w="110" w:type="dxa"/>
+              <w:bottom w:w="70" w:type="dxa"/>
+              <w:right w:w="110" w:type="dxa"/>
+            </w:tcMar>
+            <w:vAlign w:val="center"/>
+          </w:tcPr>
+          <w:p>
+            <w:pPr>
+              <w:keepNext/>
+              <w:keepLines/>
+              <w:spacing w:after="40" w:line="254" w:lineRule="auto"/>
+            </w:pPr>
+            <w:r>
+              <w:rPr>
+                <w:color w:val="000000"/>
+                <w:sz w:val="17"/>
+                <w:szCs w:val="18"/>
+              </w:rPr>
+              <w:t xml:space="preserve">Layer-score dilution</w:t>
+            </w:r>
+          </w:p>
+        </w:tc>
+        <w:tc>
+          <w:tcPr>
+            <w:tcW w:w="3706" w:type="dxa"/>
+            <w:tcBorders>
+              <w:top w:val="single" w:sz="4" w:space="0" w:color="C9D3DF"/>
+              <w:left w:val="single" w:sz="4" w:space="0" w:color="C9D3DF"/>
+              <w:bottom w:val="single" w:sz="4" w:space="0" w:color="C9D3DF"/>
+              <w:right w:val="single" w:sz="4" w:space="0" w:color="C9D3DF"/>
+            </w:tcBorders>
+            <w:shd w:val="clear" w:color="auto" w:fill="FFFFFF"/>
+            <w:tcMar>
+              <w:top w:w="70" w:type="dxa"/>
+              <w:left w:w="110" w:type="dxa"/>
+              <w:bottom w:w="70" w:type="dxa"/>
+              <w:right w:w="110" w:type="dxa"/>
+            </w:tcMar>
+            <w:vAlign w:val="center"/>
+          </w:tcPr>
+          <w:p>
+            <w:r>
+              <w:t xml:space="preserve">Score each layer by fixed check categories so many passing checks cannot dilute one failure.</w:t>
+            </w:r>
+          </w:p>
+        </w:tc>
+        <w:tc>
+          <w:tcPr>
+            <w:tcW w:w="2968" w:type="dxa"/>
+            <w:tcBorders>
+              <w:top w:val="single" w:sz="4" w:space="0" w:color="C9D3DF"/>
+              <w:left w:val="single" w:sz="4" w:space="0" w:color="C9D3DF"/>
+              <w:bottom w:val="single" w:sz="4" w:space="0" w:color="C9D3DF"/>
+              <w:right w:val="single" w:sz="4" w:space="0" w:color="C9D3DF"/>
+            </w:tcBorders>
+            <w:shd w:val="clear" w:color="auto" w:fill="FFFFFF"/>
+            <w:tcMar>
+              <w:top w:w="70" w:type="dxa"/>
+              <w:left w:w="110" w:type="dxa"/>
+              <w:bottom w:w="70" w:type="dxa"/>
+              <w:right w:w="110" w:type="dxa"/>
+            </w:tcMar>
+            <w:vAlign w:val="center"/>
+          </w:tcPr>
+          <w:p>
+            <w:pPr>
+              <w:keepNext/>
+              <w:keepLines/>
+              <w:spacing w:after="40" w:line="254" w:lineRule="auto"/>
+            </w:pPr>
+            <w:r>
+              <w:rPr>
+                <w:color w:val="000000"/>
+                <w:sz w:val="17"/>
+              </w:rPr>
+              <w:t xml:space="preserve">Adding correct declarations no longer raises a layer that contains a contradiction.</w:t>
             </w:r>
           </w:p>
         </w:tc>

</xml_diff>

<commit_message>
Mixed-format evidence and WAV focus: format capabilities and conversions, sample identity, FORMAT_SCOPE limited checks for FLAC/MP3; docs and tests
</commit_message>
<xml_diff>
--- a/Manual_layout_check.docx
+++ b/Manual_layout_check.docx
@@ -425,7 +425,7 @@
           </w:tcPr>
           <w:p>
             <w:r>
-              <w:t xml:space="preserve">409 tests discovered. All 405 non-GUI tests passed with every optional backend required; the four GUI tests passed when run separately; see Section 9.</w:t>
+              <w:t xml:space="preserve">425 tests discovered. All 421 non-GUI tests passed with every optional backend required; the four GUI tests passed when run separately; see Section 9.</w:t>
             </w:r>
           </w:p>
         </w:tc>
@@ -11353,6 +11353,111 @@
         <w:tc>
           <w:tcPr>
             <w:tcW w:w="2088" w:type="dxa"/>
+            <w:tcBorders>
+              <w:top w:val="single" w:sz="4" w:space="0" w:color="C9D3DF"/>
+              <w:left w:val="single" w:sz="4" w:space="0" w:color="C9D3DF"/>
+              <w:bottom w:val="single" w:sz="4" w:space="0" w:color="C9D3DF"/>
+              <w:right w:val="single" w:sz="4" w:space="0" w:color="C9D3DF"/>
+            </w:tcBorders>
+            <w:shd w:val="clear" w:color="auto" w:fill="FFFFFF"/>
+            <w:tcMar>
+              <w:top w:w="70" w:type="dxa"/>
+              <w:left w:w="110" w:type="dxa"/>
+              <w:bottom w:w="70" w:type="dxa"/>
+              <w:right w:w="110" w:type="dxa"/>
+            </w:tcMar>
+            <w:vAlign w:val="center"/>
+          </w:tcPr>
+          <w:p>
+            <w:pPr>
+              <w:keepNext/>
+              <w:keepLines/>
+              <w:spacing w:after="40" w:line="254" w:lineRule="auto"/>
+            </w:pPr>
+            <w:r>
+              <w:rPr>
+                <w:color w:val="000000"/>
+                <w:sz w:val="17"/>
+                <w:szCs w:val="18"/>
+              </w:rPr>
+              <w:t xml:space="preserve">Format conversion</w:t>
+            </w:r>
+          </w:p>
+        </w:tc>
+        <w:tc>
+          <w:tcPr>
+            <w:tcW w:w="3533" w:type="dxa"/>
+            <w:tcBorders>
+              <w:top w:val="single" w:sz="4" w:space="0" w:color="C9D3DF"/>
+              <w:left w:val="single" w:sz="4" w:space="0" w:color="C9D3DF"/>
+              <w:bottom w:val="single" w:sz="4" w:space="0" w:color="C9D3DF"/>
+              <w:right w:val="single" w:sz="4" w:space="0" w:color="C9D3DF"/>
+            </w:tcBorders>
+            <w:shd w:val="clear" w:color="auto" w:fill="FFFFFF"/>
+            <w:tcMar>
+              <w:top w:w="70" w:type="dxa"/>
+              <w:left w:w="110" w:type="dxa"/>
+              <w:bottom w:w="70" w:type="dxa"/>
+              <w:right w:w="110" w:type="dxa"/>
+            </w:tcMar>
+            <w:vAlign w:val="center"/>
+          </w:tcPr>
+          <w:p>
+            <w:pPr>
+              <w:keepNext/>
+              <w:keepLines/>
+              <w:spacing w:after="40" w:line="254" w:lineRule="auto"/>
+            </w:pPr>
+            <w:r>
+              <w:rPr>
+                <w:color w:val="000000"/>
+                <w:sz w:val="17"/>
+              </w:rPr>
+              <w:t xml:space="preserve">transformation: format_conversion (derived_from only)</w:t>
+            </w:r>
+          </w:p>
+        </w:tc>
+        <w:tc>
+          <w:tcPr>
+            <w:tcW w:w="4017" w:type="dxa"/>
+            <w:tcBorders>
+              <w:top w:val="single" w:sz="4" w:space="0" w:color="C9D3DF"/>
+              <w:left w:val="single" w:sz="4" w:space="0" w:color="C9D3DF"/>
+              <w:bottom w:val="single" w:sz="4" w:space="0" w:color="C9D3DF"/>
+              <w:right w:val="single" w:sz="4" w:space="0" w:color="C9D3DF"/>
+            </w:tcBorders>
+            <w:shd w:val="clear" w:color="auto" w:fill="FFFFFF"/>
+            <w:tcMar>
+              <w:top w:w="70" w:type="dxa"/>
+              <w:left w:w="110" w:type="dxa"/>
+              <w:bottom w:w="70" w:type="dxa"/>
+              <w:right w:w="110" w:type="dxa"/>
+            </w:tcMar>
+            <w:vAlign w:val="center"/>
+          </w:tcPr>
+          <w:p>
+            <w:pPr>
+              <w:keepNext/>
+              <w:keepLines/>
+              <w:spacing w:after="40" w:line="254" w:lineRule="auto"/>
+            </w:pPr>
+            <w:r>
+              <w:rPr>
+                <w:color w:val="000000"/>
+                <w:sz w:val="17"/>
+              </w:rPr>
+              <w:t xml:space="preserve">The target is the same audio in another file format. Sample rate, channels, bit depth (between lossless files) and length (one sample for lossless files, one MPEG frame for MP3) are compared and scored in declaration consistency; lossless integer pairs also get an exact sample comparison, report-only. Any other value is an input error.</w:t>
+            </w:r>
+          </w:p>
+        </w:tc>
+      </w:tr>
+      <w:tr>
+        <w:trPr>
+          <w:cantSplit/>
+        </w:trPr>
+        <w:tc>
+          <w:tcPr>
+            <w:tcW w:w="2088" w:type="dxa"/>
             <w:shd w:val="clear" w:color="auto" w:fill="EDF3F9"/>
             <w:vAlign w:val="center"/>
           </w:tcPr>
@@ -13342,6 +13447,22 @@
       </w:pPr>
       <w:r>
         <w:t xml:space="preserve">FLAC and MP3 are detected by content (music_target/audio_formats.py). ID3v2 tags before the audio are skipped before deciding, because the C2PA SDK writes one before the fLaC marker of a signed FLAC. A FLAC take's kept WAV chunks feed the same recorder-metadata, sound-report, AAF and chronology checks as a WAV take; a FLAC recording (audio/raw-take or audio/raw-track) without them receives the informational FLAC_RECORDER_METADATA_ABSENT. flac_md5_matches_decoded_audio decodes the audio with soundfile and is scored in the file-integrity layer like the WAV technical checks; an MD5 that was not stored, a bit depth libsndfile cannot decode, or the caller's deadline makes it unavailable. Declared MP3 fields that cannot be measured give checks with passed null and status unavailable, never contradictions. FLAC and MP3 observations use AUDIO_OBSERVATION and AUDIO_PARSER_FAILED (rule audio_parser_available) with an audio_format field; WAV keeps WAV_OBSERVATION and WAV_PARSER_FAILED. Scoring follows the existing WAV rules and may change with the scoring update in progress.</w:t>
+      </w:r>
+    </w:p>
+    <w:p>
+      <w:pPr>
+        <w:spacing w:line="276" w:lineRule="auto"/>
+      </w:pPr>
+      <w:r>
+        <w:t xml:space="preserve">Every role accepts WAV, FLAC and MP3; the format never lowers a score, it decides which checks can run. assessment_checks.format_capabilities lists for each audio file whether it carries recorder metadata (present, not_kept for a plain FLAC, not_supported_by_format for MP3, absent), an exact length, a bit depth, a BWF date and an embedded C2PA manifest, with advice for recordings that lost their recorder evidence; it is report-only. A submitter can add the original file and declare the delivered file derived_from it with transformation=format_conversion. format_conversions then records the direction, the scored parameter checks and sample_identity: a canonical SHA-256 over signed little-endian interleaved integer samples (pcm-int-le-interleaved-sha256-v1, as FLAC defines its MD5) gives identical or different for lossless integer pairs with equal parameters, and not_comparable for float WAV, lossy files or differing parameters. FORMAT_CONVERSION_SAMPLES_DIFFER is report-only. With audio analysis enabled, audio_format_conversion adds whether audfprint supports alignment at 0 s and the target's bandwidth assessment.</w:t>
+      </w:r>
+    </w:p>
+    <w:p>
+      <w:pPr>
+        <w:spacing w:line="276" w:lineRule="auto"/>
+      </w:pPr>
+      <w:r>
+        <w:t xml:space="preserve">Scope: the evaluator is designed and calibrated for WAV/BWF. FLAC and MP3 keep the checks implemented on 24 October 2026, and work on them is frozen. The table FORMAT_SCOPE in music_target/audio_observations.py states, for every check family, whether FLAC and MP3 implement it. Implemented for both: hash binding, structure, declared sample rate, channels, size, format and codec, and embedded C2PA. Implemented when the file carries the information: declared duration (FLAC with a total sample count, MP3 with a Xing/LAME header), FLAC decoded-sample integrity (an MD5 in STREAMINFO), and FLAC recorder metadata and BWF chronology (WAV chunks kept with --keep-foreign-metadata). Not assessed because the format cannot carry it: MP3 bit depth, recorder metadata, BWF chronology and exact content. Not assessed because only WAV is implemented: dates in ID3 or Vorbis tags, and MP3 decoded-sample integrity. Each FLAC or MP3 file lists the families not made in limited_checks (also in AUDIO_FORMAT_LIMITED_CHECKS and format_capabilities, whose check_scope is limited; WAV is full), each unavailable with limitation program_scope, format or file. Audio diagnostics rows on FLAC or MP3 carry format_scope calibrated_on_wav_only.</w:t>
       </w:r>
     </w:p>
     <w:p>
@@ -31193,6 +31314,59 @@
           </w:p>
         </w:tc>
       </w:tr>
+      <w:tr>
+        <w:trPr>
+          <w:cantSplit/>
+        </w:trPr>
+        <w:tc>
+          <w:tcPr>
+            <w:tcW w:w="3855" w:type="dxa"/>
+            <w:tcBorders>
+              <w:top w:val="single" w:sz="4" w:space="0" w:color="C9D3DF"/>
+              <w:left w:val="single" w:sz="4" w:space="0" w:color="C9D3DF"/>
+              <w:bottom w:val="single" w:sz="4" w:space="0" w:color="C9D3DF"/>
+              <w:right w:val="single" w:sz="4" w:space="0" w:color="C9D3DF"/>
+            </w:tcBorders>
+            <w:shd w:val="clear" w:color="auto" w:fill="FFFFFF"/>
+            <w:tcMar>
+              <w:top w:w="70" w:type="dxa"/>
+              <w:left w:w="110" w:type="dxa"/>
+              <w:bottom w:w="70" w:type="dxa"/>
+              <w:right w:w="110" w:type="dxa"/>
+            </w:tcMar>
+            <w:vAlign w:val="center"/>
+          </w:tcPr>
+          <w:p>
+            <w:r>
+              <w:t xml:space="preserve">format_conversion.py / sample_identity.py</w:t>
+            </w:r>
+          </w:p>
+        </w:tc>
+        <w:tc>
+          <w:tcPr>
+            <w:tcW w:w="5783" w:type="dxa"/>
+            <w:tcBorders>
+              <w:top w:val="single" w:sz="4" w:space="0" w:color="C9D3DF"/>
+              <w:left w:val="single" w:sz="4" w:space="0" w:color="C9D3DF"/>
+              <w:bottom w:val="single" w:sz="4" w:space="0" w:color="C9D3DF"/>
+              <w:right w:val="single" w:sz="4" w:space="0" w:color="C9D3DF"/>
+            </w:tcBorders>
+            <w:shd w:val="clear" w:color="auto" w:fill="FFFFFF"/>
+            <w:tcMar>
+              <w:top w:w="70" w:type="dxa"/>
+              <w:left w:w="110" w:type="dxa"/>
+              <w:bottom w:w="70" w:type="dxa"/>
+              <w:right w:w="110" w:type="dxa"/>
+            </w:tcMar>
+            <w:vAlign w:val="center"/>
+          </w:tcPr>
+          <w:p>
+            <w:r>
+              <w:t xml:space="preserve">Declared format-conversion checks and the canonical lossless sample digest used to compare WAV and FLAC files.</w:t>
+            </w:r>
+          </w:p>
+        </w:tc>
+      </w:tr>
     </w:tbl>
     <w:p>
       <w:pPr>
@@ -32908,6 +33082,59 @@
           </w:tcPr>
           <w:p>
             <w:r>
+              <w:t xml:space="preserve">tests/test_format_conversion.py</w:t>
+            </w:r>
+          </w:p>
+        </w:tc>
+        <w:tc>
+          <w:tcPr>
+            <w:tcW w:w="5783" w:type="dxa"/>
+            <w:tcBorders>
+              <w:top w:val="single" w:sz="4" w:space="0" w:color="C9D3DF"/>
+              <w:left w:val="single" w:sz="4" w:space="0" w:color="C9D3DF"/>
+              <w:bottom w:val="single" w:sz="4" w:space="0" w:color="C9D3DF"/>
+              <w:right w:val="single" w:sz="4" w:space="0" w:color="C9D3DF"/>
+            </w:tcBorders>
+            <w:shd w:val="clear" w:color="auto" w:fill="FFFFFF"/>
+            <w:tcMar>
+              <w:top w:w="70" w:type="dxa"/>
+              <w:left w:w="110" w:type="dxa"/>
+              <w:bottom w:w="70" w:type="dxa"/>
+              <w:right w:w="110" w:type="dxa"/>
+            </w:tcMar>
+            <w:vAlign w:val="center"/>
+          </w:tcPr>
+          <w:p>
+            <w:r>
+              <w:t xml:space="preserve">16 tests: one sample digest for WAV and FLAC of the same samples, conversion checks (lossless, resampled, lossy, wrong relationship, invalid value), capability advice, the diagnostics alignment summary, the builder probe and conversion option, and the format scope: every check family and technical field has a status for FLAC and MP3, limited checks per file, and the WAV calibration note on diagnostics rows.</w:t>
+            </w:r>
+          </w:p>
+        </w:tc>
+      </w:tr>
+      <w:tr>
+        <w:trPr>
+          <w:cantSplit/>
+        </w:trPr>
+        <w:tc>
+          <w:tcPr>
+            <w:tcW w:w="3855" w:type="dxa"/>
+            <w:tcBorders>
+              <w:top w:val="single" w:sz="4" w:space="0" w:color="C9D3DF"/>
+              <w:left w:val="single" w:sz="4" w:space="0" w:color="C9D3DF"/>
+              <w:bottom w:val="single" w:sz="4" w:space="0" w:color="C9D3DF"/>
+              <w:right w:val="single" w:sz="4" w:space="0" w:color="C9D3DF"/>
+            </w:tcBorders>
+            <w:shd w:val="clear" w:color="auto" w:fill="FFFFFF"/>
+            <w:tcMar>
+              <w:top w:w="70" w:type="dxa"/>
+              <w:left w:w="110" w:type="dxa"/>
+              <w:bottom w:w="70" w:type="dxa"/>
+              <w:right w:w="110" w:type="dxa"/>
+            </w:tcMar>
+            <w:vAlign w:val="center"/>
+          </w:tcPr>
+          <w:p>
+            <w:r>
               <w:t>tests/test_builder.py / test_builder_results.py / test_local_file_references.py</w:t>
             </w:r>
           </w:p>
@@ -33063,7 +33290,7 @@
     </w:p>
     <w:p>
       <w:r>
-        <w:t xml:space="preserve">On 22 October 2026, the 308 non-GUI tests were run against version 0.8.0 with REQUIRE_AUDIO_BACKENDS=1, so every optional backend had to be present: all 308 passed in 26.7 seconds, with no failures, errors or skips. For version 0.8.1 the same procedure ran 328 non-GUI tests in one process (all passed in 31 seconds, no skips). After the Wilson intervals were added on 23 October 2026 it ran 338 non-GUI tests in one process (all passed in 30 seconds, no skips) and each of the four test_builder.GuiTests cases in a separate process (all passed); reports/test-results.txt and reports/release.json record the run. The environment included c2pa-python 0.37.10, the audio libraries and the benchmark-only mir_eval 0.8.2 from requirements-benchmark.txt. A writable NUMBA_CACHE_DIR was supplied because the default audio library cache location may not be writable. With FLAC and MP3 support the same procedure ran 368 non-GUI tests in one process (all passed in 31 seconds, no skips) and the four GUI cases separately (all passed). soundfile 0.14.0 is now a core requirement. With the bandwidth provider (24 October 2026) it ran 382 non-GUI tests in one process (all passed in 32 seconds, no skips) and the four GUI cases separately (all passed). After merging the default-v6 scoring update with FLAC and MP3 support (24 October 2026) it ran 399 non-GUI tests in one process (all passed in 32 seconds, no skips) and the four GUI cases separately (all passed). After the cross-format review changes it ran 405 non-GUI tests in one process (all passed in 33 seconds, no skips) and the four GUI cases separately (all passed).</w:t>
+        <w:t xml:space="preserve">On 22 October 2026, the 308 non-GUI tests were run against version 0.8.0 with REQUIRE_AUDIO_BACKENDS=1, so every optional backend had to be present: all 308 passed in 26.7 seconds, with no failures, errors or skips. For version 0.8.1 the same procedure ran 328 non-GUI tests in one process (all passed in 31 seconds, no skips). After the Wilson intervals were added on 23 October 2026 it ran 338 non-GUI tests in one process (all passed in 30 seconds, no skips) and each of the four test_builder.GuiTests cases in a separate process (all passed); reports/test-results.txt and reports/release.json record the run. The environment included c2pa-python 0.37.10, the audio libraries and the benchmark-only mir_eval 0.8.2 from requirements-benchmark.txt. A writable NUMBA_CACHE_DIR was supplied because the default audio library cache location may not be writable. With FLAC and MP3 support the same procedure ran 368 non-GUI tests in one process (all passed in 31 seconds, no skips) and the four GUI cases separately (all passed). soundfile 0.14.0 is now a core requirement. With the bandwidth provider (24 October 2026) it ran 382 non-GUI tests in one process (all passed in 32 seconds, no skips) and the four GUI cases separately (all passed). After merging the default-v6 scoring update with FLAC and MP3 support (24 October 2026) it ran 399 non-GUI tests in one process (all passed in 32 seconds, no skips) and the four GUI cases separately (all passed). After the cross-format review changes it ran 405 non-GUI tests in one process (all passed in 33 seconds, no skips) and the four GUI cases separately (all passed). With mixed-format evidence it ran 418 non-GUI tests in one process (all passed in 35 seconds, no skips) and the four GUI cases separately (all passed). After the WAV-focus scope change it ran 421 non-GUI tests in one process (all passed, no skips) and the four GUI cases separately (all passed).</w:t>
       </w:r>
     </w:p>
     <w:p>
@@ -33077,7 +33304,7 @@
     <w:p>
       <w:r>
         <w:lastRenderedPageBreak/>
-        <w:t xml:space="preserve">The current discovery contains 409 cases: 133 core; 41 audio diagnostics; 24 C2PA; 22 remediation; 19 non-GUI builder; 16 builder-result; 34 scoring-remediation; 12 local-file-reference; 27 production-document; 9 audio calibration; 11 case-interval; 34 audio-format; 9 bandwidth; 6 DAW-session; 5 structure benchmark; 3 music benchmark; and 4 GUI cases. Run GUI cases in separate processes when investigating macOS Tk lifecycle hangs; do not treat excluded cases as passes or skips.</w:t>
+        <w:t xml:space="preserve">The current discovery contains 425 cases: 133 core; 41 audio diagnostics; 24 C2PA; 22 remediation; 19 non-GUI builder; 16 builder-result; 34 scoring-remediation; 12 local-file-reference; 27 production-document; 9 audio calibration; 11 case-interval; 34 audio-format; 9 bandwidth; 16 format-conversion; 6 DAW-session; 5 structure benchmark; 3 music benchmark; and 4 GUI cases. Run GUI cases in separate processes when investigating macOS Tk lifecycle hangs; do not treat excluded cases as passes or skips.</w:t>
       </w:r>
     </w:p>
     <w:p>
@@ -33380,7 +33607,7 @@
         <w:spacing w:after="60" w:line="276" w:lineRule="auto"/>
       </w:pPr>
       <w:r>
-        <w:t xml:space="preserve">Audio is limited to WAV (integer PCM, IEEE float and WAVE_FORMAT_EXTENSIBLE), FLAC and MP3 (MPEG Layer III). AIFF, Ogg, RF64/BW64 and MPEG Layer I/II are not supported. MP3 is lossy: it has no bit depth or recorder metadata, its exact length is known only from a Xing/Info header with encoder delay and padding, and audio diagnostics on MP3 compare an approximation of the original (mp3_encoded_queries is not calibrated). Objects are limited to 512 MiB each and 1 GiB per request. Structural checks cannot see a fake format: a FLAC made from an MP3 has a valid MD5 and a re-encoded 320 kbps MP3 has valid frames; only the report-only bandwidth diagnostic points to them.</w:t>
+        <w:t xml:space="preserve">Audio is limited to WAV (integer PCM, IEEE float and WAVE_FORMAT_EXTENSIBLE), FLAC and MP3 (MPEG Layer III). AIFF, Ogg, RF64/BW64 and MPEG Layer I/II are not supported. MP3 is lossy: it has no bit depth or recorder metadata, its exact length is known only from a Xing/Info header with encoder delay and padding, and audio diagnostics on MP3 compare an approximation of the original (mp3_encoded_queries is not calibrated). Objects are limited to 512 MiB each and 1 GiB per request. Structural checks cannot see a fake format: a FLAC made from an MP3 has a valid MD5 and a re-encoded 320 kbps MP3 has valid frames; only the report-only bandwidth diagnostic points to them. Identical samples between a declared original and its conversion show the same content, not that the original is authentic: a fabricated WAV and its own FLAC are identical too. FLAC and MP3 receive only the checks implemented today; every other check is reported as not assessed, never as a contradiction and never in a score, with the reason: a limitation of this program (program_scope), of the format, or of the file. Audio diagnostics on them use thresholds calibrated on WAV only. For a full assessment, submit WAV; a delivered FLAC or MP3 can be declared derived_from its WAV original as a format conversion. No further FLAC or MP3 checks are planned.</w:t>
       </w:r>
     </w:p>
     <w:p>

</xml_diff>

<commit_message>
Document C2PA checks of five AI music generators
</commit_message>
<xml_diff>
--- a/Manual_layout_check.docx
+++ b/Manual_layout_check.docx
@@ -1116,7 +1116,7 @@
       </w:pPr>
       <w:hyperlink w:anchor="ManualSection52">
         <w:r>
-          <w:t>Testing with Lumina output</w:t>
+          <w:t>Testing with real AI generator output</w:t>
         </w:r>
       </w:hyperlink>
       <w:r>
@@ -26972,7 +26972,7 @@
                 <w:color w:val="000000"/>
                 <w:sz w:val="17"/>
               </w:rPr>
-              <w:t>known_ai_signers.json: the BytePlus Lumina (Seed Audio) signing certificate, valid until 16 March 2028, as a base64 SHA-256 fingerprint</w:t>
+              <w:t>known_ai_signers.json: two signing certificates as base64 SHA-256 fingerprints, BytePlus Lumina (Seed Audio), valid until 16 March 2028, and Suno, valid 23 July 2026 to 25 October 2028</w:t>
             </w:r>
           </w:p>
         </w:tc>
@@ -29374,7 +29374,7 @@
       </w:pPr>
       <w:bookmarkStart w:id="44" w:name="ManualSection52"/>
       <w:r>
-        <w:t>Testing with Lumina output</w:t>
+        <w:t>Testing with real AI generator output</w:t>
       </w:r>
       <w:bookmarkEnd w:id="44"/>
     </w:p>
@@ -29391,7 +29391,633 @@
         <w:spacing w:line="276" w:lineRule="auto"/>
       </w:pPr>
       <w:r>
-        <w:t>tests/test_c2pa_integrity.py has 24 offline cases covering pinned-list hash checks, trust status, asymmetric trust, known AI signer matching, the C2PA chunk precondition and every final state. Its fixtures are signed at runtime with throwaway certificates, so they test failure handling, not a production signer.</w:t>
+        <w:t xml:space="preserve">Suno signs its MP3 downloads with a C2PA manifest stored in an ID3 GEOB frame. Two downloads from separate generations (24 October 2026) are valid, declare trainedAlgorithmicMedia, carry a DigiCert time-stamp and are signed by the same certificate (CN=Suno Content Credentials, O=Suno Inc, issued by Suno's private CN=Suno C2PA Root CA, valid 23 July 2026 to 25 October 2028). The root is on no pinned list, so the files stay untrusted (0.3). The certificate's fingerprint is on the known AI signer list, so they are recognised as Suno and declaring them recorded is a contradiction. Matching uses the exact fingerprint only: a certificate that copies Suno's name or serial number is not recognised.</w:t>
+      </w:r>
+    </w:p>
+    <w:p>
+      <w:pPr>
+        <w:spacing w:line="276" w:lineRule="auto"/>
+      </w:pPr>
+      <w:r>
+        <w:t xml:space="preserve">On 24 October 2026 the output of five AI music generators was checked to decide which need an entry on the known AI signer list. A fingerprint is added only when it was verified on real output and changes the result, because an unverified or unnecessary entry could label human or AI audio wrongly.</w:t>
+      </w:r>
+    </w:p>
+    <w:tbl>
+      <w:tblPr>
+        <w:tblW w:w="9638" w:type="dxa"/>
+        <w:tblBorders>
+          <w:top w:val="single" w:sz="4" w:space="0" w:color="D9D9D9"/>
+          <w:left w:val="single" w:sz="4" w:space="0" w:color="D9D9D9"/>
+          <w:bottom w:val="single" w:sz="4" w:space="0" w:color="D9D9D9"/>
+          <w:right w:val="single" w:sz="4" w:space="0" w:color="D9D9D9"/>
+          <w:insideH w:val="single" w:sz="4" w:space="0" w:color="D9D9D9"/>
+          <w:insideV w:val="single" w:sz="4" w:space="0" w:color="D9D9D9"/>
+        </w:tblBorders>
+        <w:tblLayout w:type="fixed"/>
+        <w:tblCellMar>
+          <w:top w:w="75" w:type="dxa"/>
+          <w:left w:w="95" w:type="dxa"/>
+          <w:bottom w:w="75" w:type="dxa"/>
+          <w:right w:w="95" w:type="dxa"/>
+        </w:tblCellMar>
+        <w:tblLook w:val="04A0" w:firstRow="1" w:lastRow="0" w:firstColumn="1" w:lastColumn="0" w:noHBand="0" w:noVBand="1"/>
+      </w:tblPr>
+      <w:tblGrid>
+        <w:gridCol w:w="1500"/>
+        <w:gridCol w:w="2900"/>
+        <w:gridCol w:w="3438"/>
+        <w:gridCol w:w="1800"/>
+      </w:tblGrid>
+      <w:tr>
+        <w:trPr>
+          <w:cantSplit/>
+          <w:tblHeader/>
+        </w:trPr>
+        <w:tc>
+          <w:tcPr>
+            <w:tcW w:w="1500" w:type="dxa"/>
+            <w:tcBorders>
+              <w:top w:val="single" w:sz="4" w:space="0" w:color="1F3A5F"/>
+              <w:left w:val="single" w:sz="4" w:space="0" w:color="1F3A5F"/>
+              <w:bottom w:val="single" w:sz="4" w:space="0" w:color="1F3A5F"/>
+              <w:right w:val="single" w:sz="4" w:space="0" w:color="1F3A5F"/>
+            </w:tcBorders>
+            <w:shd w:val="clear" w:color="auto" w:fill="1F3A5F"/>
+            <w:tcMar>
+              <w:top w:w="70" w:type="dxa"/>
+              <w:left w:w="110" w:type="dxa"/>
+              <w:bottom w:w="70" w:type="dxa"/>
+              <w:right w:w="110" w:type="dxa"/>
+            </w:tcMar>
+            <w:vAlign w:val="center"/>
+          </w:tcPr>
+          <w:p>
+            <w:pPr>
+              <w:keepNext/>
+              <w:keepLines/>
+              <w:spacing w:after="40" w:line="254" w:lineRule="auto"/>
+            </w:pPr>
+            <w:r>
+              <w:rPr>
+                <w:b/>
+                <w:bCs/>
+                <w:color w:val="FFFFFF"/>
+                <w:sz w:val="17"/>
+                <w:szCs w:val="18"/>
+              </w:rPr>
+              <w:t xml:space="preserve">Generator</w:t>
+            </w:r>
+          </w:p>
+        </w:tc>
+        <w:tc>
+          <w:tcPr>
+            <w:tcW w:w="2900" w:type="dxa"/>
+            <w:tcBorders>
+              <w:top w:val="single" w:sz="4" w:space="0" w:color="1F3A5F"/>
+              <w:left w:val="single" w:sz="4" w:space="0" w:color="1F3A5F"/>
+              <w:bottom w:val="single" w:sz="4" w:space="0" w:color="1F3A5F"/>
+              <w:right w:val="single" w:sz="4" w:space="0" w:color="1F3A5F"/>
+            </w:tcBorders>
+            <w:shd w:val="clear" w:color="auto" w:fill="1F3A5F"/>
+            <w:tcMar>
+              <w:top w:w="70" w:type="dxa"/>
+              <w:left w:w="110" w:type="dxa"/>
+              <w:bottom w:w="70" w:type="dxa"/>
+              <w:right w:w="110" w:type="dxa"/>
+            </w:tcMar>
+            <w:vAlign w:val="center"/>
+          </w:tcPr>
+          <w:p>
+            <w:pPr>
+              <w:keepNext/>
+              <w:keepLines/>
+              <w:spacing w:after="40" w:line="254" w:lineRule="auto"/>
+            </w:pPr>
+            <w:r>
+              <w:rPr>
+                <w:b/>
+                <w:bCs/>
+                <w:color w:val="FFFFFF"/>
+                <w:sz w:val="17"/>
+                <w:szCs w:val="18"/>
+              </w:rPr>
+              <w:t xml:space="preserve">Output checked and what was found</w:t>
+            </w:r>
+          </w:p>
+        </w:tc>
+        <w:tc>
+          <w:tcPr>
+            <w:tcW w:w="3438" w:type="dxa"/>
+            <w:tcBorders>
+              <w:top w:val="single" w:sz="4" w:space="0" w:color="1F3A5F"/>
+              <w:left w:val="single" w:sz="4" w:space="0" w:color="1F3A5F"/>
+              <w:bottom w:val="single" w:sz="4" w:space="0" w:color="1F3A5F"/>
+              <w:right w:val="single" w:sz="4" w:space="0" w:color="1F3A5F"/>
+            </w:tcBorders>
+            <w:shd w:val="clear" w:color="auto" w:fill="1F3A5F"/>
+            <w:tcMar>
+              <w:top w:w="70" w:type="dxa"/>
+              <w:left w:w="110" w:type="dxa"/>
+              <w:bottom w:w="70" w:type="dxa"/>
+              <w:right w:w="110" w:type="dxa"/>
+            </w:tcMar>
+            <w:vAlign w:val="center"/>
+          </w:tcPr>
+          <w:p>
+            <w:pPr>
+              <w:keepNext/>
+              <w:keepLines/>
+              <w:spacing w:after="40" w:line="254" w:lineRule="auto"/>
+            </w:pPr>
+            <w:r>
+              <w:rPr>
+                <w:b/>
+                <w:bCs/>
+                <w:color w:val="FFFFFF"/>
+                <w:sz w:val="17"/>
+                <w:szCs w:val="18"/>
+              </w:rPr>
+              <w:t xml:space="preserve">How the evaluator treats it</w:t>
+            </w:r>
+          </w:p>
+        </w:tc>
+        <w:tc>
+          <w:tcPr>
+            <w:tcW w:w="1800" w:type="dxa"/>
+            <w:tcBorders>
+              <w:top w:val="single" w:sz="4" w:space="0" w:color="1F3A5F"/>
+              <w:left w:val="single" w:sz="4" w:space="0" w:color="1F3A5F"/>
+              <w:bottom w:val="single" w:sz="4" w:space="0" w:color="1F3A5F"/>
+              <w:right w:val="single" w:sz="4" w:space="0" w:color="1F3A5F"/>
+            </w:tcBorders>
+            <w:shd w:val="clear" w:color="auto" w:fill="1F3A5F"/>
+            <w:tcMar>
+              <w:top w:w="70" w:type="dxa"/>
+              <w:left w:w="110" w:type="dxa"/>
+              <w:bottom w:w="70" w:type="dxa"/>
+              <w:right w:w="110" w:type="dxa"/>
+            </w:tcMar>
+            <w:vAlign w:val="center"/>
+          </w:tcPr>
+          <w:p>
+            <w:pPr>
+              <w:keepNext/>
+              <w:keepLines/>
+              <w:spacing w:after="40" w:line="254" w:lineRule="auto"/>
+            </w:pPr>
+            <w:r>
+              <w:rPr>
+                <w:b/>
+                <w:bCs/>
+                <w:color w:val="FFFFFF"/>
+                <w:sz w:val="17"/>
+                <w:szCs w:val="18"/>
+              </w:rPr>
+              <w:t xml:space="preserve">Fingerprint added</w:t>
+            </w:r>
+          </w:p>
+        </w:tc>
+      </w:tr>
+      <w:tr>
+        <w:trPr>
+          <w:cantSplit/>
+        </w:trPr>
+        <w:tc>
+          <w:tcPr>
+            <w:tcW w:w="1500" w:type="dxa"/>
+            <w:shd w:val="clear" w:color="auto" w:fill="FFFFFF"/>
+            <w:vAlign w:val="center"/>
+          </w:tcPr>
+          <w:p>
+            <w:pPr>
+              <w:keepLines/>
+              <w:spacing w:after="40" w:line="254" w:lineRule="auto"/>
+            </w:pPr>
+            <w:r>
+              <w:rPr>
+                <w:color w:val="000000"/>
+                <w:sz w:val="17"/>
+              </w:rPr>
+              <w:t xml:space="preserve">Suno</w:t>
+            </w:r>
+          </w:p>
+        </w:tc>
+        <w:tc>
+          <w:tcPr>
+            <w:tcW w:w="2900" w:type="dxa"/>
+            <w:shd w:val="clear" w:color="auto" w:fill="FFFFFF"/>
+            <w:vAlign w:val="center"/>
+          </w:tcPr>
+          <w:p>
+            <w:pPr>
+              <w:keepLines/>
+              <w:spacing w:after="40" w:line="254" w:lineRule="auto"/>
+            </w:pPr>
+            <w:r>
+              <w:rPr>
+                <w:color w:val="000000"/>
+                <w:sz w:val="17"/>
+              </w:rPr>
+              <w:t xml:space="preserve">Two MP3s from separate generations: valid manifest declaring trainedAlgorithmicMedia, signed by Suno's own certificate (private root)</w:t>
+            </w:r>
+          </w:p>
+        </w:tc>
+        <w:tc>
+          <w:tcPr>
+            <w:tcW w:w="3438" w:type="dxa"/>
+            <w:shd w:val="clear" w:color="auto" w:fill="FFFFFF"/>
+            <w:vAlign w:val="center"/>
+          </w:tcPr>
+          <w:p>
+            <w:pPr>
+              <w:keepLines/>
+              <w:spacing w:after="40" w:line="254" w:lineRule="auto"/>
+            </w:pPr>
+            <w:r>
+              <w:rPr>
+                <w:color w:val="000000"/>
+                <w:sz w:val="17"/>
+              </w:rPr>
+              <w:t xml:space="preserve">Recognised as Suno through the known AI signer list; untrusted (0.3); AI label accepted</w:t>
+            </w:r>
+          </w:p>
+        </w:tc>
+        <w:tc>
+          <w:tcPr>
+            <w:tcW w:w="1800" w:type="dxa"/>
+            <w:shd w:val="clear" w:color="auto" w:fill="FFFFFF"/>
+            <w:vAlign w:val="center"/>
+          </w:tcPr>
+          <w:p>
+            <w:pPr>
+              <w:keepLines/>
+              <w:spacing w:after="40" w:line="254" w:lineRule="auto"/>
+            </w:pPr>
+            <w:r>
+              <w:rPr>
+                <w:color w:val="000000"/>
+                <w:sz w:val="17"/>
+              </w:rPr>
+              <w:t xml:space="preserve">Yes</w:t>
+            </w:r>
+          </w:p>
+        </w:tc>
+      </w:tr>
+      <w:tr>
+        <w:trPr>
+          <w:cantSplit/>
+        </w:trPr>
+        <w:tc>
+          <w:tcPr>
+            <w:tcW w:w="1500" w:type="dxa"/>
+            <w:shd w:val="clear" w:color="auto" w:fill="FFFFFF"/>
+            <w:vAlign w:val="center"/>
+          </w:tcPr>
+          <w:p>
+            <w:pPr>
+              <w:keepLines/>
+              <w:spacing w:after="40" w:line="254" w:lineRule="auto"/>
+            </w:pPr>
+            <w:r>
+              <w:rPr>
+                <w:color w:val="000000"/>
+                <w:sz w:val="17"/>
+              </w:rPr>
+              <w:t xml:space="preserve">Stability AI</w:t>
+            </w:r>
+          </w:p>
+        </w:tc>
+        <w:tc>
+          <w:tcPr>
+            <w:tcW w:w="2900" w:type="dxa"/>
+            <w:shd w:val="clear" w:color="auto" w:fill="FFFFFF"/>
+            <w:vAlign w:val="center"/>
+          </w:tcPr>
+          <w:p>
+            <w:pPr>
+              <w:keepLines/>
+              <w:spacing w:after="40" w:line="254" w:lineRule="auto"/>
+            </w:pPr>
+            <w:r>
+              <w:rPr>
+                <w:color w:val="000000"/>
+                <w:sz w:val="17"/>
+              </w:rPr>
+              <w:t xml:space="preserve">One WAV: valid manifest with an explicit AI-generation declaration, trusted certificate</w:t>
+            </w:r>
+          </w:p>
+        </w:tc>
+        <w:tc>
+          <w:tcPr>
+            <w:tcW w:w="3438" w:type="dxa"/>
+            <w:shd w:val="clear" w:color="auto" w:fill="FFFFFF"/>
+            <w:vAlign w:val="center"/>
+          </w:tcPr>
+          <w:p>
+            <w:pPr>
+              <w:keepLines/>
+              <w:spacing w:after="40" w:line="254" w:lineRule="auto"/>
+            </w:pPr>
+            <w:r>
+              <w:rPr>
+                <w:color w:val="000000"/>
+                <w:sz w:val="17"/>
+              </w:rPr>
+              <w:t xml:space="preserve">Trusted signer; AI label accepted through ordinary trust validation</w:t>
+            </w:r>
+          </w:p>
+        </w:tc>
+        <w:tc>
+          <w:tcPr>
+            <w:tcW w:w="1800" w:type="dxa"/>
+            <w:shd w:val="clear" w:color="auto" w:fill="FFFFFF"/>
+            <w:vAlign w:val="center"/>
+          </w:tcPr>
+          <w:p>
+            <w:pPr>
+              <w:keepLines/>
+              <w:spacing w:after="40" w:line="254" w:lineRule="auto"/>
+            </w:pPr>
+            <w:r>
+              <w:rPr>
+                <w:color w:val="000000"/>
+                <w:sz w:val="17"/>
+              </w:rPr>
+              <w:t xml:space="preserve">No, not needed</w:t>
+            </w:r>
+          </w:p>
+        </w:tc>
+      </w:tr>
+      <w:tr>
+        <w:trPr>
+          <w:cantSplit/>
+        </w:trPr>
+        <w:tc>
+          <w:tcPr>
+            <w:tcW w:w="1500" w:type="dxa"/>
+            <w:shd w:val="clear" w:color="auto" w:fill="FFFFFF"/>
+            <w:vAlign w:val="center"/>
+          </w:tcPr>
+          <w:p>
+            <w:pPr>
+              <w:keepLines/>
+              <w:spacing w:after="40" w:line="254" w:lineRule="auto"/>
+            </w:pPr>
+            <w:r>
+              <w:rPr>
+                <w:color w:val="000000"/>
+                <w:sz w:val="17"/>
+              </w:rPr>
+              <w:t xml:space="preserve">Google Lyria</w:t>
+            </w:r>
+          </w:p>
+        </w:tc>
+        <w:tc>
+          <w:tcPr>
+            <w:tcW w:w="2900" w:type="dxa"/>
+            <w:shd w:val="clear" w:color="auto" w:fill="FFFFFF"/>
+            <w:vAlign w:val="center"/>
+          </w:tcPr>
+          <w:p>
+            <w:pPr>
+              <w:keepLines/>
+              <w:spacing w:after="40" w:line="254" w:lineRule="auto"/>
+            </w:pPr>
+            <w:r>
+              <w:rPr>
+                <w:color w:val="000000"/>
+                <w:sz w:val="17"/>
+              </w:rPr>
+              <w:t xml:space="preserve">One MP3: valid manifest signed by Google, trusted, with explicit AI-generation metadata</w:t>
+            </w:r>
+          </w:p>
+        </w:tc>
+        <w:tc>
+          <w:tcPr>
+            <w:tcW w:w="3438" w:type="dxa"/>
+            <w:shd w:val="clear" w:color="auto" w:fill="FFFFFF"/>
+            <w:vAlign w:val="center"/>
+          </w:tcPr>
+          <w:p>
+            <w:pPr>
+              <w:keepLines/>
+              <w:spacing w:after="40" w:line="254" w:lineRule="auto"/>
+            </w:pPr>
+            <w:r>
+              <w:rPr>
+                <w:color w:val="000000"/>
+                <w:sz w:val="17"/>
+              </w:rPr>
+              <w:t xml:space="preserve">Trusted signer; AI label accepted through ordinary trust validation</w:t>
+            </w:r>
+          </w:p>
+        </w:tc>
+        <w:tc>
+          <w:tcPr>
+            <w:tcW w:w="1800" w:type="dxa"/>
+            <w:shd w:val="clear" w:color="auto" w:fill="FFFFFF"/>
+            <w:vAlign w:val="center"/>
+          </w:tcPr>
+          <w:p>
+            <w:pPr>
+              <w:keepLines/>
+              <w:spacing w:after="40" w:line="254" w:lineRule="auto"/>
+            </w:pPr>
+            <w:r>
+              <w:rPr>
+                <w:color w:val="000000"/>
+                <w:sz w:val="17"/>
+              </w:rPr>
+              <w:t xml:space="preserve">No, not needed</w:t>
+            </w:r>
+          </w:p>
+        </w:tc>
+      </w:tr>
+      <w:tr>
+        <w:trPr>
+          <w:cantSplit/>
+        </w:trPr>
+        <w:tc>
+          <w:tcPr>
+            <w:tcW w:w="1500" w:type="dxa"/>
+            <w:shd w:val="clear" w:color="auto" w:fill="FFFFFF"/>
+            <w:vAlign w:val="center"/>
+          </w:tcPr>
+          <w:p>
+            <w:pPr>
+              <w:keepLines/>
+              <w:spacing w:after="40" w:line="254" w:lineRule="auto"/>
+            </w:pPr>
+            <w:r>
+              <w:rPr>
+                <w:color w:val="000000"/>
+                <w:sz w:val="17"/>
+              </w:rPr>
+              <w:t xml:space="preserve">ElevenLabs</w:t>
+            </w:r>
+          </w:p>
+        </w:tc>
+        <w:tc>
+          <w:tcPr>
+            <w:tcW w:w="2900" w:type="dxa"/>
+            <w:shd w:val="clear" w:color="auto" w:fill="FFFFFF"/>
+            <w:vAlign w:val="center"/>
+          </w:tcPr>
+          <w:p>
+            <w:pPr>
+              <w:keepLines/>
+              <w:spacing w:after="40" w:line="254" w:lineRule="auto"/>
+            </w:pPr>
+            <w:r>
+              <w:rPr>
+                <w:color w:val="000000"/>
+                <w:sz w:val="17"/>
+              </w:rPr>
+              <w:t xml:space="preserve">One WAV: no C2PA manifest. ElevenLabs documents C2PA signing only for MP3 output from its API, when the caller opts in</w:t>
+            </w:r>
+          </w:p>
+        </w:tc>
+        <w:tc>
+          <w:tcPr>
+            <w:tcW w:w="3438" w:type="dxa"/>
+            <w:shd w:val="clear" w:color="auto" w:fill="FFFFFF"/>
+            <w:vAlign w:val="center"/>
+          </w:tcPr>
+          <w:p>
+            <w:pPr>
+              <w:keepLines/>
+              <w:spacing w:after="40" w:line="254" w:lineRule="auto"/>
+            </w:pPr>
+            <w:r>
+              <w:rPr>
+                <w:color w:val="000000"/>
+                <w:sz w:val="17"/>
+              </w:rPr>
+              <w:t xml:space="preserve">absent (0.0, not evidence against the file); nothing identifies the file as AI</w:t>
+            </w:r>
+          </w:p>
+        </w:tc>
+        <w:tc>
+          <w:tcPr>
+            <w:tcW w:w="1800" w:type="dxa"/>
+            <w:shd w:val="clear" w:color="auto" w:fill="FFFFFF"/>
+            <w:vAlign w:val="center"/>
+          </w:tcPr>
+          <w:p>
+            <w:pPr>
+              <w:keepLines/>
+              <w:spacing w:after="40" w:line="254" w:lineRule="auto"/>
+            </w:pPr>
+            <w:r>
+              <w:rPr>
+                <w:color w:val="000000"/>
+                <w:sz w:val="17"/>
+              </w:rPr>
+              <w:t xml:space="preserve">No, no current certificate could be verified</w:t>
+            </w:r>
+          </w:p>
+        </w:tc>
+      </w:tr>
+      <w:tr>
+        <w:trPr>
+          <w:cantSplit/>
+        </w:trPr>
+        <w:tc>
+          <w:tcPr>
+            <w:tcW w:w="1500" w:type="dxa"/>
+            <w:shd w:val="clear" w:color="auto" w:fill="FFFFFF"/>
+            <w:vAlign w:val="center"/>
+          </w:tcPr>
+          <w:p>
+            <w:pPr>
+              <w:keepLines/>
+              <w:spacing w:after="40" w:line="254" w:lineRule="auto"/>
+            </w:pPr>
+            <w:r>
+              <w:rPr>
+                <w:color w:val="000000"/>
+                <w:sz w:val="17"/>
+              </w:rPr>
+              <w:t xml:space="preserve">Adobe Firefly</w:t>
+            </w:r>
+          </w:p>
+        </w:tc>
+        <w:tc>
+          <w:tcPr>
+            <w:tcW w:w="2900" w:type="dxa"/>
+            <w:shd w:val="clear" w:color="auto" w:fill="FFFFFF"/>
+            <w:vAlign w:val="center"/>
+          </w:tcPr>
+          <w:p>
+            <w:pPr>
+              <w:keepLines/>
+              <w:spacing w:after="40" w:line="254" w:lineRule="auto"/>
+            </w:pPr>
+            <w:r>
+              <w:rPr>
+                <w:color w:val="000000"/>
+                <w:sz w:val="17"/>
+              </w:rPr>
+              <w:t xml:space="preserve">One WAV: no embedded manifest; the file references a valid manifest hosted remotely by Adobe</w:t>
+            </w:r>
+          </w:p>
+        </w:tc>
+        <w:tc>
+          <w:tcPr>
+            <w:tcW w:w="3438" w:type="dxa"/>
+            <w:shd w:val="clear" w:color="auto" w:fill="FFFFFF"/>
+            <w:vAlign w:val="center"/>
+          </w:tcPr>
+          <w:p>
+            <w:pPr>
+              <w:keepLines/>
+              <w:spacing w:after="40" w:line="254" w:lineRule="auto"/>
+            </w:pPr>
+            <w:r>
+              <w:rPr>
+                <w:color w:val="000000"/>
+                <w:sz w:val="17"/>
+              </w:rPr>
+              <w:t xml:space="preserve">absent: validation runs offline with remote manifest fetching switched off, so the manifest is never read</w:t>
+            </w:r>
+          </w:p>
+        </w:tc>
+        <w:tc>
+          <w:tcPr>
+            <w:tcW w:w="1800" w:type="dxa"/>
+            <w:shd w:val="clear" w:color="auto" w:fill="FFFFFF"/>
+            <w:vAlign w:val="center"/>
+          </w:tcPr>
+          <w:p>
+            <w:pPr>
+              <w:keepLines/>
+              <w:spacing w:after="40" w:line="254" w:lineRule="auto"/>
+            </w:pPr>
+            <w:r>
+              <w:rPr>
+                <w:color w:val="000000"/>
+                <w:sz w:val="17"/>
+              </w:rPr>
+              <w:t xml:space="preserve">No, a fingerprint would not change the result</w:t>
+            </w:r>
+          </w:p>
+        </w:tc>
+      </w:tr>
+    </w:tbl>
+    <w:p>
+      <w:pPr>
+        <w:spacing w:before="120"/>
+      </w:pPr>
+      <w:r>
+        <w:t xml:space="preserve">ElevenLabs and Adobe Firefly expose two limitations, AI audio without an embedded manifest and remotely hosted manifests; Section 10 describes both with possible solutions. The Stability AI, Google Lyria, ElevenLabs and Firefly samples are not stored in the repository, and their SHA-256 hashes and certificate details were not recorded.</w:t>
+      </w:r>
+    </w:p>
+    <w:p>
+      <w:pPr>
+        <w:spacing w:line="276" w:lineRule="auto"/>
+      </w:pPr>
+      <w:r>
+        <w:t>tests/test_c2pa_integrity.py has 33 cases covering pinned-list hash checks, trust status, asymmetric trust, known AI signer matching (including Suno, recognised by fingerprint only), the C2PA chunk precondition and every final state. Thirty run offline with fixtures signed at runtime with throwaway certificates, so they test failure handling, not a production signer. The other three check the real Suno downloads, matched by SHA-256, and run only when C2PA_SUNO_SAMPLE_DIR points to them; the audio is not stored in the repository.</w:t>
       </w:r>
     </w:p>
     <w:p>
@@ -32841,7 +33467,7 @@
           </w:tcPr>
           <w:p>
             <w:r>
-              <w:t>24 tests: required SDK; runtime-signed valid, post-signing edit, corrupted certificate and supporting-manifest cases; pinned-list hashes; trust status; asymmetric trust; known AI signer; the C2PA chunk precondition; and every final state.</w:t>
+              <w:t>33 tests: required SDK; runtime-signed valid, post-signing edit, corrupted certificate and supporting-manifest cases; pinned-list hashes; trust status; asymmetric trust; known AI signers, including Suno matched by fingerprint only; the C2PA chunk precondition; every final state; and three checks of the real Suno downloads that run only when C2PA_SUNO_SAMPLE_DIR is set.</w:t>
             </w:r>
           </w:p>
         </w:tc>
@@ -33290,7 +33916,7 @@
     </w:p>
     <w:p>
       <w:r>
-        <w:t xml:space="preserve">On 22 October 2026, the 308 non-GUI tests were run against version 0.8.0 with REQUIRE_AUDIO_BACKENDS=1, so every optional backend had to be present: all 308 passed in 26.7 seconds, with no failures, errors or skips. For version 0.8.1 the same procedure ran 328 non-GUI tests in one process (all passed in 31 seconds, no skips). After the Wilson intervals were added on 23 October 2026 it ran 338 non-GUI tests in one process (all passed in 30 seconds, no skips) and each of the four test_builder.GuiTests cases in a separate process (all passed); reports/test-results.txt and reports/release.json record the run. The environment included c2pa-python 0.37.10, the audio libraries and the benchmark-only mir_eval 0.8.2 from requirements-benchmark.txt. A writable NUMBA_CACHE_DIR was supplied because the default audio library cache location may not be writable. With FLAC and MP3 support the same procedure ran 368 non-GUI tests in one process (all passed in 31 seconds, no skips) and the four GUI cases separately (all passed). soundfile 0.14.0 is now a core requirement. With the bandwidth provider (24 October 2026) it ran 382 non-GUI tests in one process (all passed in 32 seconds, no skips) and the four GUI cases separately (all passed). After merging the default-v6 scoring update with FLAC and MP3 support (24 October 2026) it ran 399 non-GUI tests in one process (all passed in 32 seconds, no skips) and the four GUI cases separately (all passed). After the cross-format review changes it ran 405 non-GUI tests in one process (all passed in 33 seconds, no skips) and the four GUI cases separately (all passed). With mixed-format evidence it ran 418 non-GUI tests in one process (all passed in 35 seconds, no skips) and the four GUI cases separately (all passed). After the WAV-focus scope change it ran 421 non-GUI tests in one process (all passed, no skips) and the four GUI cases separately (all passed).</w:t>
+        <w:t xml:space="preserve">On 22 October 2026, the 308 non-GUI tests were run against version 0.8.0 with REQUIRE_AUDIO_BACKENDS=1, so every optional backend had to be present: all 308 passed in 26.7 seconds, with no failures, errors or skips. For version 0.8.1 the same procedure ran 328 non-GUI tests in one process (all passed in 31 seconds, no skips). After the Wilson intervals were added on 23 October 2026 it ran 338 non-GUI tests in one process (all passed in 30 seconds, no skips) and each of the four test_builder.GuiTests cases in a separate process (all passed); reports/test-results.txt and reports/release.json record the run. The environment included c2pa-python 0.37.10, the audio libraries and the benchmark-only mir_eval 0.8.2 from requirements-benchmark.txt. A writable NUMBA_CACHE_DIR was supplied because the default audio library cache location may not be writable. With FLAC and MP3 support the same procedure ran 368 non-GUI tests in one process (all passed in 31 seconds, no skips) and the four GUI cases separately (all passed). soundfile 0.14.0 is now a core requirement. With the bandwidth provider (24 October 2026) it ran 382 non-GUI tests in one process (all passed in 32 seconds, no skips) and the four GUI cases separately (all passed). After merging the default-v6 scoring update with FLAC and MP3 support (24 October 2026) it ran 399 non-GUI tests in one process (all passed in 32 seconds, no skips) and the four GUI cases separately (all passed). After the cross-format review changes it ran 405 non-GUI tests in one process (all passed in 33 seconds, no skips) and the four GUI cases separately (all passed). With mixed-format evidence it ran 418 non-GUI tests in one process (all passed in 35 seconds, no skips) and the four GUI cases separately (all passed). After the WAV-focus scope change it ran 421 non-GUI tests in one process (all passed, no skips) and the four GUI cases separately (all passed). After Suno was added as a known AI signer (24 October 2026) it ran 430 non-GUI tests in one process (all passed in 36 seconds; the three Suno sample checks were skipped because the downloads are not stored in the repository) and the four GUI cases separately (all passed).</w:t>
       </w:r>
     </w:p>
     <w:p>
@@ -33304,7 +33930,7 @@
     <w:p>
       <w:r>
         <w:lastRenderedPageBreak/>
-        <w:t xml:space="preserve">The current discovery contains 425 cases: 133 core; 41 audio diagnostics; 24 C2PA; 22 remediation; 19 non-GUI builder; 16 builder-result; 34 scoring-remediation; 12 local-file-reference; 27 production-document; 9 audio calibration; 11 case-interval; 34 audio-format; 9 bandwidth; 16 format-conversion; 6 DAW-session; 5 structure benchmark; 3 music benchmark; and 4 GUI cases. Run GUI cases in separate processes when investigating macOS Tk lifecycle hangs; do not treat excluded cases as passes or skips.</w:t>
+        <w:t xml:space="preserve">The current discovery contains 434 cases: 133 core; 41 audio diagnostics; 33 C2PA; 22 remediation; 19 non-GUI builder; 16 builder-result; 34 scoring-remediation; 12 local-file-reference; 27 production-document; 9 audio calibration; 11 case-interval; 34 audio-format; 9 bandwidth; 16 format-conversion; 6 DAW-session; 5 structure benchmark; 3 music benchmark; and 4 GUI cases. Run GUI cases in separate processes when investigating macOS Tk lifecycle hangs; do not treat excluded cases as passes or skips.</w:t>
       </w:r>
     </w:p>
     <w:p>
@@ -33375,7 +34001,7 @@
         <w:spacing w:after="60" w:line="276" w:lineRule="auto"/>
       </w:pPr>
       <w:r>
-        <w:t>Time stamps are not verified against a time-stamp authority (TSA). The official C2PA TSA Trust List is downloaded, pinned and recorded, but c2pa-python 0.37.10 has no separate setting for TSA trust anchors, so it is not passed to the SDK. The legacy ITL rule (trusted only when signed before 1 January 2026) therefore relies on the signing time reported by the SDK rather than a time proven by a trusted TSA. Only the trusted_legacy_itl level (0.9) is affected; BytePlus Lumina is on neither trust list. When a later c2pa-python release adds a TSA trust setting, the pinned list can be passed to it.</w:t>
+        <w:t>Time stamps are not verified against a time-stamp authority (TSA). The official C2PA TSA Trust List is downloaded, pinned and recorded, but c2pa-python 0.37.10 has no separate setting for TSA trust anchors, so it is not passed to the SDK. The legacy ITL rule (trusted only when signed before 1 January 2026) therefore relies on the signing time reported by the SDK rather than a time proven by a trusted TSA. Only the trusted_legacy_itl level (0.9) is affected; BytePlus Lumina and Suno are on neither trust list. When a later c2pa-python release adds a TSA trust setting, the pinned list can be passed to it.</w:t>
       </w:r>
     </w:p>
     <w:p>
@@ -33388,7 +34014,7 @@
         <w:spacing w:after="60" w:line="276" w:lineRule="auto"/>
       </w:pPr>
       <w:r>
-        <w:t>The trust lists are a dated snapshot. The official C2PA Trust List is pinned at its 17 October 2026 commit and the known AI signer list was compiled on 21 October 2026. Signers added to or removed from the official list later are not reflected until the lists are updated with the procedure in policies/c2pa_trust/README.md (download, record commit and SHA-256 in trust_lists.json, run the C2PA tests, record the change in the program version). Each response records the snapshot it used in assessment_checks.c2pa_trust_configuration, so results stay reproducible.</w:t>
+        <w:t>The trust lists are a dated snapshot. The official C2PA Trust List is pinned at its 17 October 2026 commit and the known AI signer list was compiled on 21 October 2026 and extended with Suno on 24 October 2026. Signers added to or removed from the official list later are not reflected until the lists are updated with the procedure in policies/c2pa_trust/README.md (download, record commit and SHA-256 in trust_lists.json, run the C2PA tests, record the change in the program version). Each response records the snapshot it used in assessment_checks.c2pa_trust_configuration, so results stay reproducible.</w:t>
       </w:r>
     </w:p>
     <w:p>
@@ -33414,7 +34040,46 @@
         <w:spacing w:after="60" w:line="276" w:lineRule="auto"/>
       </w:pPr>
       <w:r>
-        <w:t>The known AI signer list has one entry, BytePlus Lumina (Seed Audio). Its fingerprint was extracted from Lumina output and has not yet been confirmed by BytePlus; the certificate expires on 16 March 2028. Other AI generators are not listed, so an invalid manifest from them is not recognised as an AI signer's label.</w:t>
+        <w:t xml:space="preserve">The known AI signer list has two entries, BytePlus Lumina (Seed Audio) and Suno. Both fingerprints were extracted from the generators' own output (Suno's from two separate generations) and neither has been confirmed by the vendor; the certificates expire on 16 March 2028 and 25 October 2028. Stability AI and Google Lyria need no entry because their certificates are already trusted. Other AI generators are not listed, so an invalid manifest from them is not recognised as an AI signer's label.</w:t>
+      </w:r>
+    </w:p>
+    <w:p>
+      <w:pPr>
+        <w:pStyle w:val="ListParagraph"/>
+        <w:numPr>
+          <w:ilvl w:val="0"/>
+          <w:numId w:val="2"/>
+        </w:numPr>
+        <w:spacing w:after="60" w:line="276" w:lineRule="auto"/>
+      </w:pPr>
+      <w:r>
+        <w:t xml:space="preserve">AI audio without an embedded manifest cannot be told apart from an unsigned human recording by C2PA: both read as absent. ElevenLabs WAV output carries no manifest, and ElevenLabs documents C2PA signing only for MP3 output from its API when the caller opts in, so no current certificate could be verified. Possible solution: verify signed ElevenLabs API MP3s from at least two generations and list the certificate if it is not already trusted; for unsigned files, rely on the declaration and the audio observations.</w:t>
+      </w:r>
+    </w:p>
+    <w:p>
+      <w:pPr>
+        <w:pStyle w:val="ListParagraph"/>
+        <w:numPr>
+          <w:ilvl w:val="0"/>
+          <w:numId w:val="2"/>
+        </w:numPr>
+        <w:spacing w:after="60" w:line="276" w:lineRule="auto"/>
+      </w:pPr>
+      <w:r>
+        <w:t xml:space="preserve">Remotely hosted manifests are not read. Adobe Firefly WAV output references a valid manifest hosted by Adobe instead of embedding it. Validation runs offline with remote manifest fetching switched off, so the file reads as absent, and a fingerprint would not change this. Possible solutions: an optional online mode that downloads the remote manifest, checks it against the file's hash with the same pinned lists and records the URL and retrieval time; or accepting a submitted .c2pa sidecar file and validating it offline. Either needs a client decision on network access.</w:t>
+      </w:r>
+    </w:p>
+    <w:p>
+      <w:pPr>
+        <w:pStyle w:val="ListParagraph"/>
+        <w:numPr>
+          <w:ilvl w:val="0"/>
+          <w:numId w:val="2"/>
+        </w:numPr>
+        <w:spacing w:after="60" w:line="276" w:lineRule="auto"/>
+      </w:pPr>
+      <w:r>
+        <w:t xml:space="preserve">The Stability AI, Google Lyria, ElevenLabs and Firefly samples were checked on 24 October 2026, but their SHA-256 hashes and certificate details were not recorded and no automated test uses them; only the Suno samples have recorded hashes and tests.</w:t>
       </w:r>
     </w:p>
     <w:p>

</xml_diff>

<commit_message>
Release 0.8.2: CSEC pin csec-2026-10-27, docs, manual and records
Version 0.8.2 (source_revision sha256:90716ba4d277b654807a335106b054e2de7829c3fa3656f822fad0cad278b021). Example responses regenerated with identical axis values. README, technical manual, CSEC handoff and red-team docs updated; release, verification and test records from a fresh install (501 tests, no skips).
</commit_message>
<xml_diff>
--- a/Manual_layout_check.docx
+++ b/Manual_layout_check.docx
@@ -194,7 +194,7 @@
                 <w:color w:val="000000"/>
                 <w:sz w:val="17"/>
               </w:rPr>
-              <w:t xml:space="preserve">0.8.1</w:t>
+              <w:t xml:space="preserve">0.8.2</w:t>
             </w:r>
           </w:p>
         </w:tc>
@@ -231,7 +231,7 @@
           </w:tcPr>
           <w:p>
             <w:r>
-              <w:t>22 October 2026</w:t>
+              <w:t xml:space="preserve">27 October 2026</w:t>
             </w:r>
           </w:p>
         </w:tc>
@@ -305,7 +305,7 @@
           </w:tcPr>
           <w:p>
             <w:r>
-              <w:t xml:space="preserve">1161380 (version 0.8.0 release) plus the version 0.8.1 changes described in this revision</w:t>
+              <w:t xml:space="preserve">3e9eeec (main, 27 October 2026) plus the version 0.8.2 changes described in this revision</w:t>
             </w:r>
           </w:p>
         </w:tc>
@@ -387,7 +387,7 @@
           </w:tcPr>
           <w:p>
             <w:r>
-              <w:t xml:space="preserve">default-v6, version 6</w:t>
+              <w:t xml:space="preserve">default-v7, version 7</w:t>
             </w:r>
           </w:p>
         </w:tc>
@@ -425,7 +425,7 @@
           </w:tcPr>
           <w:p>
             <w:r>
-              <w:t xml:space="preserve">425 tests discovered. All 421 non-GUI tests passed with every optional backend required; the four GUI tests passed when run separately; see Section 9.</w:t>
+              <w:t xml:space="preserve">501 tests discovered. On a fresh install all 496 non-GUI tests passed with every optional backend required and no skips; the five GUI tests passed when run separately; see Section 9.</w:t>
             </w:r>
           </w:p>
         </w:tc>
@@ -1379,6 +1379,14 @@
     </w:p>
     <w:p>
       <w:pPr>
+        <w:spacing w:line="276" w:lineRule="auto"/>
+      </w:pPr>
+      <w:r>
+        <w:t xml:space="preserve">Version 0.8.2 (27 October 2026) answers the feedback of CSEC, who ran the 25 October package. A file check can now fail or stay incomplete where it used to pass: damaged or unreadable audio fails file integrity (audio_file_readable, audio_stream_complete); every sample of every bound WAV, FLAC and MP3 is read, and NaN or Infinity fails audio_samples_valid; a scan that does not finish is not_completed, which leaves the file-integrity layer without a value and withholds Integrity with the new status incomplete; and a recorder file's bext TimeReference must equal its iXML timestamp. Weights, tiers and the release rule are unchanged, and every example response kept its values. The desktop builder runs the audio diagnostics by default; the command line and the CSEC path keep them opt-in. Section 4 and Section 7, 'Integrity', describe the new checks.</w:t>
+      </w:r>
+    </w:p>
+    <w:p>
+      <w:pPr>
         <w:spacing w:before="60" w:after="160" w:line="276" w:lineRule="auto"/>
         <w:ind w:left="170" w:right="170"/>
       </w:pPr>
@@ -13504,7 +13512,7 @@
     </w:p>
     <w:p>
       <w:r>
-        <w:t>Format checks do not authenticate metadata. The core inspects WAV headers and chunks without scanning all samples for disabled DSP. When optional decoding encounters NaN/Infinity, silence or channel cancellation, the dependent observation is unavailable. Optional libraries do not extend the accepted input formats.</w:t>
+        <w:t xml:space="preserve">Format checks do not authenticate metadata. Since 0.8.2 the core reads every sample of every bound WAV, FLAC and MP3 once, in bounded blocks, to check that it can be read and is finite (audio_samples_valid); WAV float samples are checked as stored, before any conversion. NaN or Infinity fails the check with the first one's time and channel; a scan stopped by the time limit, a file change or a missing decoder is not_completed and is never a pass. A malformed non-final file fails audio_file_readable, and audio the parser had to skip fails audio_stream_complete; a valid format the reader does not support is not counted as damage. This decoding compares nothing between files: the disabled signal comparison stays off. When the optional diagnostics meet silence or channel cancellation, the dependent observation is unavailable. Optional libraries do not extend the accepted input formats.</w:t>
       </w:r>
     </w:p>
     <w:p>
@@ -22015,7 +22023,7 @@
                 <w:sz w:val="17"/>
                 <w:szCs w:val="18"/>
               </w:rPr>
-              <w:t xml:space="preserve">SHA-256 binding, parser status and, for FLAC, the decoded-audio MD5. No submitter claim is compared here.</w:t>
+              <w:t xml:space="preserve">SHA-256 binding, readability, the full-length sample check, the bext/iXML timestamp agreement and, for FLAC, the decoded-audio MD5. No submitter claim is compared here. A not_completed check leaves the layer without a value and Integrity incomplete.</w:t>
             </w:r>
           </w:p>
         </w:tc>
@@ -23467,7 +23475,7 @@
         <w:spacing w:line="276" w:lineRule="auto"/>
       </w:pPr>
       <w:r>
-        <w:t xml:space="preserve">The costs were measured, not assigned. benchmarks/forge_cost.py forged claims in copies of Project Rock Ep01 and counted the smallest set of files that must change together for no contradiction to appear, plus one for a binary container: a take number needs the WAV, the sound report and the AAF (4); a start timecode moved by one second needs only the WAV and the sound report (3), because the AAF checks containment only; a cue range needs only the cue sheet (1). Recorder metadata takes the cheaper recorder claim. Six evidence mixes from half of the takes were then scored under strength floors 0 to 0.9 against five orderings stated in advance: default-v6 failed two (it cannot tell recorder-backed evidence from a cue sheet), and every floor passed all five under the derived costs, so the pre-registered 0.5 was kept. Held out to the end, the unmodified Ep01 keeps value 1.0 with confidence 0.427 (default-v6: 0.533). These are measured forgery costs on one production and a ranking check, not calibrated probabilities (docs/FORGE_COST.md).</w:t>
+        <w:t xml:space="preserve">The costs were measured, not assigned. benchmarks/forge_cost.py forged claims in copies of Project Rock Ep01 and counted the smallest set of files that must change together for no contradiction to appear, plus one for a binary container: a take number needs the WAV, the sound report and the AAF (4); a start timecode moved by one second needs only the WAV and the sound report (3), because the AAF checks containment only; a cue range needs only the cue sheet (1). Recorder metadata takes the cheaper recorder claim. Six evidence mixes from half of the takes were then scored under strength floors 0 to 0.9 against five orderings stated in advance: default-v6 failed two (it cannot tell recorder-backed evidence from a cue sheet), and every floor passed all five under the derived costs, so the pre-registered 0.5 was kept. Held out to the end, the unmodified Ep01 keeps value 1.0 with confidence 0.427 (default-v6: 0.533). These are measured forgery costs on one production and a ranking check, not calibrated probabilities (docs/FORGE_COST.md). Since 0.8.2 a shift written into bext alone fails the bext/iXML timestamp check; written into both, it still needs only the WAV and the sound report, so the measured cost stays 3.</w:t>
       </w:r>
     </w:p>
     <w:p>
@@ -23879,10 +23887,7 @@
     </w:p>
     <w:p>
       <w:r>
-        <w:t xml:space="preserve">The examples below apply default-v6 with equal weights and no later input-coverage downgrade. F, D and X denote the file, declaration and cross-evidence values; X uses scored facts. A dash is an unpopulated layer. These are arithmetic examples, not measured provenance cases.</w:t>
-      </w:r>
-      <w:r>
-        <w:t xml:space="preserve"> Under default-v7 every value and availability is the same and each confidence is multiplied by the forge-cost factor; for recorder-metadata evidence alone the factor is 0.8, so 0.533 becomes 0.427.</w:t>
+        <w:t xml:space="preserve">The examples below apply default-v6 with equal weights and no later input-coverage downgrade. F, D and X denote the file, declaration and cross-evidence values; X uses scored facts. A dash is an unpopulated layer. These are arithmetic examples, not measured provenance cases. Under default-v7 every value and availability is the same and each confidence is multiplied by the forge-cost factor; for recorder-metadata evidence alone the factor is 0.8, so 0.533 becomes 0.427.</w:t>
       </w:r>
     </w:p>
     <w:tbl>
@@ -31357,7 +31362,7 @@
                 <w:sz w:val="17"/>
                 <w:szCs w:val="18"/>
               </w:rPr>
-              <w:t>recorder_metadata.py</w:t>
+              <w:t xml:space="preserve">recorder_metadata.py</w:t>
             </w:r>
           </w:p>
         </w:tc>
@@ -31390,7 +31395,96 @@
                 <w:sz w:val="17"/>
                 <w:szCs w:val="18"/>
               </w:rPr>
-              <w:t xml:space="preserve">Recorder bext/iXML fields from a bound WAV; DAW and library BWF reported as daw_or_library.</w:t>
+              <w:t xml:space="preserve">Recorder bext/iXML fields from a bound WAV, including the iXML timestamp, and the bext/iXML timestamp check; DAW and library BWF reported as daw_or_library.</w:t>
+            </w:r>
+            <w:r>
+              <w:rPr>
+                <w:rFonts w:eastAsia="Consolas" w:cs="Consolas"/>
+                <w:color w:val="000000"/>
+                <w:sz w:val="17"/>
+                <w:szCs w:val="16"/>
+              </w:rPr>
+              <w:t/>
+            </w:r>
+            <w:r>
+              <w:rPr>
+                <w:color w:val="000000"/>
+                <w:sz w:val="17"/>
+                <w:szCs w:val="18"/>
+              </w:rPr>
+              <w:t/>
+            </w:r>
+          </w:p>
+        </w:tc>
+      </w:tr>
+      <w:tr>
+        <w:trPr>
+          <w:cantSplit/>
+        </w:trPr>
+        <w:tc>
+          <w:tcPr>
+            <w:tcW w:w="3855" w:type="dxa"/>
+            <w:tcBorders>
+              <w:top w:val="single" w:sz="4" w:space="0" w:color="C9D3DF"/>
+              <w:left w:val="single" w:sz="4" w:space="0" w:color="C9D3DF"/>
+              <w:bottom w:val="single" w:sz="4" w:space="0" w:color="C9D3DF"/>
+              <w:right w:val="single" w:sz="4" w:space="0" w:color="C9D3DF"/>
+            </w:tcBorders>
+            <w:shd w:val="clear" w:color="auto" w:fill="FFFFFF"/>
+            <w:tcMar>
+              <w:top w:w="70" w:type="dxa"/>
+              <w:left w:w="110" w:type="dxa"/>
+              <w:bottom w:w="70" w:type="dxa"/>
+              <w:right w:w="110" w:type="dxa"/>
+            </w:tcMar>
+            <w:vAlign w:val="center"/>
+          </w:tcPr>
+          <w:p>
+            <w:pPr>
+              <w:keepLines/>
+              <w:spacing w:after="40" w:line="254" w:lineRule="auto"/>
+            </w:pPr>
+            <w:r>
+              <w:rPr>
+                <w:bCs/>
+                <w:color w:val="000000"/>
+                <w:sz w:val="17"/>
+                <w:szCs w:val="18"/>
+              </w:rPr>
+              <w:t xml:space="preserve">sample_validation.py</w:t>
+            </w:r>
+          </w:p>
+        </w:tc>
+        <w:tc>
+          <w:tcPr>
+            <w:tcW w:w="5783" w:type="dxa"/>
+            <w:tcBorders>
+              <w:top w:val="single" w:sz="4" w:space="0" w:color="C9D3DF"/>
+              <w:left w:val="single" w:sz="4" w:space="0" w:color="C9D3DF"/>
+              <w:bottom w:val="single" w:sz="4" w:space="0" w:color="C9D3DF"/>
+              <w:right w:val="single" w:sz="4" w:space="0" w:color="C9D3DF"/>
+            </w:tcBorders>
+            <w:shd w:val="clear" w:color="auto" w:fill="FFFFFF"/>
+            <w:tcMar>
+              <w:top w:w="70" w:type="dxa"/>
+              <w:left w:w="110" w:type="dxa"/>
+              <w:bottom w:w="70" w:type="dxa"/>
+              <w:right w:w="110" w:type="dxa"/>
+            </w:tcMar>
+            <w:vAlign w:val="center"/>
+          </w:tcPr>
+          <w:p>
+            <w:pPr>
+              <w:keepLines/>
+              <w:spacing w:after="40" w:line="254" w:lineRule="auto"/>
+            </w:pPr>
+            <w:r>
+              <w:rPr>
+                <w:color w:val="000000"/>
+                <w:sz w:val="17"/>
+                <w:szCs w:val="18"/>
+              </w:rPr>
+              <w:t xml:space="preserve">Full-length sample check of every bound WAV, FLAC and MP3 (audio_samples_valid): NaN/Infinity fails; an unfinished scan is not_completed, never a pass.</w:t>
             </w:r>
             <w:r>
               <w:rPr>
@@ -33159,10 +33253,7 @@
           </w:tcPr>
           <w:p>
             <w:r>
-              <w:t>41 tests: workers, agreement, semantics, ranges, real providers, non-final versions and short-source local-match isolation. Also insufficient-support findings and calibration status.</w:t>
-            </w:r>
-            <w:r>
-              <w:t xml:space="preserve"> Now 61 tests: also declared-range search and findings, AAF unused ranges with their positive control, source coverage, and a real-audio check that a genuine take has content beyond the mix while a copy of the mix does not.</w:t>
+              <w:t xml:space="preserve">41 tests: workers, agreement, semantics, ranges, real providers, non-final versions and short-source local-match isolation. Also insufficient-support findings and calibration status. Now 61 tests: also declared-range search and findings, AAF unused ranges with their positive control, source coverage, and a real-audio check that a genuine take has content beyond the mix while a copy of the mix does not.</w:t>
             </w:r>
           </w:p>
         </w:tc>
@@ -34041,7 +34132,7 @@
     </w:p>
     <w:p>
       <w:r>
-        <w:t xml:space="preserve">The current discovery contains 466 cases: 133 core; 61 audio diagnostics; 33 C2PA; 22 remediation; 19 non-GUI builder; 16 builder-result; 34 scoring-remediation; 12 forge-cost; 12 local-file-reference; 27 production-document; 9 audio calibration; 11 case-interval; 34 audio-format; 9 bandwidth; 16 format-conversion; 6 DAW-session; 5 structure benchmark; 3 music benchmark; and 4 GUI cases. On 25 October 2026, 459 of the 462 non-GUI cases passed in one process with 3 skipped (the Suno real-sample cases need C2PA_SUNO_SAMPLE_DIR), and the four GUI cases passed in separate processes. Run GUI cases in separate processes when investigating macOS Tk lifecycle hangs; do not treat excluded cases as passes or skips.</w:t>
+        <w:t xml:space="preserve">The current discovery contains 501 cases: 136 core; 61 audio diagnostics; 33 C2PA; 22 remediation; 19 non-GUI builder; 8 builder-contract; 16 builder-result; 34 scoring-remediation; 12 forge-cost; 12 local-file-reference; 35 production-document; 13 sample-validation; 9 audio calibration; 11 case-interval; 36 audio-format; 9 bandwidth; 16 format-conversion; 6 DAW-session; 5 structure benchmark; 3 music benchmark; and 5 GUI cases. On 27 October 2026 (version 0.8.2) the code was exported into an empty folder and installed in a new virtual environment with all three requirement files; all 496 non-GUI cases passed in one process with no skips (C2PA_SUNO_SAMPLE_DIR pointed at the verified Suno downloads), and the five GUI cases passed in separate processes. Without C2PA_SUNO_SAMPLE_DIR the three Suno real-sample cases are skipped. Run GUI cases in separate processes when investigating macOS Tk lifecycle hangs; do not treat excluded cases as passes or skips.</w:t>
       </w:r>
     </w:p>
     <w:p>
@@ -34074,6 +34165,14 @@
       </w:r>
     </w:p>
     <w:p>
+      <w:pPr>
+        <w:spacing w:line="276" w:lineRule="auto"/>
+      </w:pPr>
+      <w:r>
+        <w:t xml:space="preserve">Version 0.8.2 (27 October 2026): the file checks of Section 4 (readability, stream completeness, the full-length sample check and the not_completed state), the bext/iXML timestamp check and the Integrity status incomplete. The example responses were regenerated; every axis value, confidence and status is unchanged. All 236 Project Rock WAVs pass the sample check (1.2 s for 3.37 GiB) and all 233 recorder takes pass the timestamp check. Coverage was not re-measured for 0.8.2.</w:t>
+      </w:r>
+    </w:p>
+    <w:p>
       <w:r>
         <w:t>Stored examples and reports are snapshots rather than fresh evidence of the current runtime. Regenerate response files when comparing a modified program or policy, and retain system.source_revision together with the Git commit and scoring-profile ID/version.</w:t>
       </w:r>
@@ -34095,7 +34194,7 @@
         <w:spacing w:line="276" w:lineRule="auto"/>
       </w:pPr>
       <w:r>
-        <w:t>This chapter collects the known limitations of version 0.8.1 in one place. Each one is a deliberate boundary or a dependency on outside parties, not an undetected defect; the results remain valid within these limits. Work that would remove a limitation is listed in Section 11.</w:t>
+        <w:t xml:space="preserve">This chapter collects the known limitations of version 0.8.2 in one place. Each one is a deliberate boundary or a dependency on outside parties, not an undetected defect; the results remain valid within these limits. Work that would remove a limitation is listed in Section 11.</w:t>
       </w:r>
     </w:p>
     <w:p>
@@ -34315,7 +34414,20 @@
         <w:spacing w:after="60" w:line="276" w:lineRule="auto"/>
       </w:pPr>
       <w:r>
-        <w:t xml:space="preserve">A take's start timecode moved by one second in the WAV's bext TimeReference and in the sound report raises no contradiction: the AAF checks only that each used range lies inside the recording, and the bext and iXML timestamps are not yet compared. Fixes are listed in Section 11 and NEXT_TASKS item 42.</w:t>
+        <w:t xml:space="preserve">A take's start timecode moved by one second in the WAV and in the sound report: since 0.8.2 a change to bext TimeReference alone fails the bext/iXML timestamp check, but a shift written into both bext and the iXML timestamp (plain XML in the same file) still raises no contradiction, because the AAF checks only that each used range lies inside the recording. The remaining fixes are listed in Section 11 and NEXT_TASKS item 42.</w:t>
+      </w:r>
+    </w:p>
+    <w:p>
+      <w:pPr>
+        <w:pStyle w:val="ListParagraph"/>
+        <w:numPr>
+          <w:ilvl w:val="0"/>
+          <w:numId w:val="2"/>
+        </w:numPr>
+        <w:spacing w:after="60" w:line="276" w:lineRule="auto"/>
+      </w:pPr>
+      <w:r>
+        <w:t xml:space="preserve">The full-length sample check proves only that every sample can be read and is finite. It does not detect clipping, silence, dropouts or edits that leave finite samples, and MP3 stores no checksum to compare its decoded samples with. A file whose scan does not finish within the time limit leaves Integrity incomplete; results are not cached between runs.</w:t>
       </w:r>
     </w:p>
     <w:p>
@@ -34580,7 +34692,7 @@
         <w:spacing w:after="60" w:line="276" w:lineRule="auto"/>
       </w:pPr>
       <w:r>
-        <w:t xml:space="preserve">Close the start-timecode gap: compare bext TimeReference with iXML TIMESTAMP_SAMPLES_SINCE_MIDNIGHT (scored); check the timecode-to-OriginationTime offset across a recorder's takes; and compare the fingerprint offset of each AAF-used range with the offset the AAF timeline predicts (report-only).</w:t>
+        <w:t xml:space="preserve">Close the rest of the start-timecode gap: the bext/iXML timestamp comparison was added in 0.8.2; still to do are checking the timecode-to-OriginationTime offset across a recorder's takes, and comparing the fingerprint offset of each AAF-used range with the offset the AAF timeline predicts (report-only).</w:t>
       </w:r>
     </w:p>
     <w:p>

</xml_diff>

<commit_message>
Release 0.8.3: summary-first GUI and offline review report
Presentation-only release: Core Evidence Consistency label for integrity, structured non-scoring audio review items, recording coverage, offline HTML and text export.
</commit_message>
<xml_diff>
--- a/Manual_layout_check.docx
+++ b/Manual_layout_check.docx
@@ -194,7 +194,7 @@
                 <w:color w:val="000000"/>
                 <w:sz w:val="17"/>
               </w:rPr>
-              <w:t xml:space="preserve">0.8.2</w:t>
+              <w:t>0.8.3</w:t>
             </w:r>
           </w:p>
         </w:tc>
@@ -231,7 +231,7 @@
           </w:tcPr>
           <w:p>
             <w:r>
-              <w:t xml:space="preserve">27 October 2026</w:t>
+              <w:t>28 October 2026</w:t>
             </w:r>
           </w:p>
         </w:tc>
@@ -305,7 +305,7 @@
           </w:tcPr>
           <w:p>
             <w:r>
-              <w:t xml:space="preserve">3e9eeec (main, 27 October 2026) plus the version 0.8.2 changes described in this revision</w:t>
+              <w:t>Released 0.8.2 baseline plus the 0.8.3 GUI and report presentation changes described in Appendix A</w:t>
             </w:r>
           </w:p>
         </w:tc>
@@ -425,7 +425,7 @@
           </w:tcPr>
           <w:p>
             <w:r>
-              <w:t xml:space="preserve">501 tests discovered. On a fresh install all 496 non-GUI tests passed with every optional backend required and no skips; the five GUI tests passed when run separately; see Section 9.</w:t>
+              <w:t>538 tests passed with no skips: 530 non-GUI tests and eight GUI cases in separate processes. Includes the original 501 and 37 added presentation tests. See Appendix A and the current verification report.</w:t>
             </w:r>
           </w:p>
         </w:tc>
@@ -498,12 +498,8 @@
       <w:pPr>
         <w:pStyle w:val="ManualTOC1"/>
       </w:pPr>
-      <w:hyperlink w:anchor="ManualSection1">
-        <w:r>
-          <w:t>Overview</w:t>
-        </w:r>
-      </w:hyperlink>
       <w:r>
+        <w:t>Overview</w:t>
         <w:tab/>
         <w:t>4</w:t>
       </w:r>
@@ -512,40 +508,8 @@
       <w:pPr>
         <w:pStyle w:val="ManualTOC1"/>
       </w:pPr>
-      <w:hyperlink w:anchor="ManualSection2">
-        <w:r>
-          <w:t>1 Program Purpose and Workflow</w:t>
-        </w:r>
-      </w:hyperlink>
       <w:r>
-        <w:tab/>
-        <w:t>4</w:t>
-      </w:r>
-    </w:p>
-    <w:p>
-      <w:pPr>
-        <w:pStyle w:val="ManualTOC2"/>
-      </w:pPr>
-      <w:hyperlink w:anchor="ManualSection3">
-        <w:r>
-          <w:t>End to end workflow</w:t>
-        </w:r>
-      </w:hyperlink>
-      <w:r>
-        <w:tab/>
-        <w:t>4</w:t>
-      </w:r>
-    </w:p>
-    <w:p>
-      <w:pPr>
-        <w:pStyle w:val="ManualTOC2"/>
-      </w:pPr>
-      <w:hyperlink w:anchor="ManualSection4">
-        <w:r>
-          <w:t>Unknown and invalid input</w:t>
-        </w:r>
-      </w:hyperlink>
-      <w:r>
+        <w:t>1 Program Purpose and Workflow</w:t>
         <w:tab/>
         <w:t>5</w:t>
       </w:r>
@@ -554,12 +518,28 @@
       <w:pPr>
         <w:pStyle w:val="ManualTOC2"/>
       </w:pPr>
-      <w:hyperlink w:anchor="ManualSection5">
-        <w:r>
-          <w:t>System boundaries</w:t>
-        </w:r>
-      </w:hyperlink>
       <w:r>
+        <w:t>End to end workflow</w:t>
+        <w:tab/>
+        <w:t>5</w:t>
+      </w:r>
+    </w:p>
+    <w:p>
+      <w:pPr>
+        <w:pStyle w:val="ManualTOC2"/>
+      </w:pPr>
+      <w:r>
+        <w:t>Unknown and invalid input</w:t>
+        <w:tab/>
+        <w:t>5</w:t>
+      </w:r>
+    </w:p>
+    <w:p>
+      <w:pPr>
+        <w:pStyle w:val="ManualTOC2"/>
+      </w:pPr>
+      <w:r>
+        <w:t>System boundaries</w:t>
         <w:tab/>
         <w:t>6</w:t>
       </w:r>
@@ -568,12 +548,8 @@
       <w:pPr>
         <w:pStyle w:val="ManualTOC2"/>
       </w:pPr>
-      <w:hyperlink w:anchor="ManualSection6">
-        <w:r>
-          <w:t>Design principles</w:t>
-        </w:r>
-      </w:hyperlink>
       <w:r>
+        <w:t>Design principles</w:t>
         <w:tab/>
         <w:t>6</w:t>
       </w:r>
@@ -582,12 +558,8 @@
       <w:pPr>
         <w:pStyle w:val="ManualTOC2"/>
       </w:pPr>
-      <w:hyperlink w:anchor="ManualSection7">
-        <w:r>
-          <w:t>Running the program</w:t>
-        </w:r>
-      </w:hyperlink>
       <w:r>
+        <w:t>Running the program</w:t>
         <w:tab/>
         <w:t>7</w:t>
       </w:r>
@@ -596,12 +568,8 @@
       <w:pPr>
         <w:pStyle w:val="ManualTOC2"/>
       </w:pPr>
-      <w:hyperlink w:anchor="ManualDesktopBuilder">
-        <w:r>
-          <w:t>Desktop manifest builder</w:t>
-        </w:r>
-      </w:hyperlink>
       <w:r>
+        <w:t>Desktop manifest builder</w:t>
         <w:tab/>
         <w:t>7</w:t>
       </w:r>
@@ -610,12 +578,8 @@
       <w:pPr>
         <w:pStyle w:val="ManualTOC2"/>
       </w:pPr>
-      <w:hyperlink w:anchor="ManualSection8">
-        <w:r>
-          <w:t>Request fields and profiles</w:t>
-        </w:r>
-      </w:hyperlink>
       <w:r>
+        <w:t>Request fields and profiles</w:t>
         <w:tab/>
         <w:t>8</w:t>
       </w:r>
@@ -624,40 +588,28 @@
       <w:pPr>
         <w:pStyle w:val="ManualTOC1"/>
       </w:pPr>
-      <w:hyperlink w:anchor="ManualSection9">
-        <w:r>
-          <w:t>2 Supported Artefact Types</w:t>
-        </w:r>
-      </w:hyperlink>
       <w:r>
+        <w:t>2 Supported Artefact Types</w:t>
         <w:tab/>
-        <w:t>8</w:t>
+        <w:t>9</w:t>
       </w:r>
     </w:p>
     <w:p>
       <w:pPr>
         <w:pStyle w:val="ManualTOC2"/>
       </w:pPr>
-      <w:hyperlink w:anchor="ManualSection10">
-        <w:r>
-          <w:t>Audio artefact types</w:t>
-        </w:r>
-      </w:hyperlink>
       <w:r>
+        <w:t>Audio artefact types</w:t>
         <w:tab/>
-        <w:t>8</w:t>
+        <w:t>9</w:t>
       </w:r>
     </w:p>
     <w:p>
       <w:pPr>
         <w:pStyle w:val="ManualTOC2"/>
       </w:pPr>
-      <w:hyperlink w:anchor="ManualSection11">
-        <w:r>
-          <w:t>Non audio artefact types</w:t>
-        </w:r>
-      </w:hyperlink>
       <w:r>
+        <w:t>Non audio artefact types</w:t>
         <w:tab/>
         <w:t>9</w:t>
       </w:r>
@@ -666,138 +618,38 @@
       <w:pPr>
         <w:pStyle w:val="ManualTOC1"/>
       </w:pPr>
-      <w:hyperlink w:anchor="ManualSection12">
-        <w:r>
-          <w:t>3 Supported Relationship Types</w:t>
-        </w:r>
-      </w:hyperlink>
       <w:r>
+        <w:t>3 Supported Relationship Types</w:t>
         <w:tab/>
-        <w:t>9</w:t>
+        <w:t>10</w:t>
       </w:r>
     </w:p>
     <w:p>
       <w:pPr>
         <w:pStyle w:val="ManualTOC2"/>
       </w:pPr>
-      <w:hyperlink w:anchor="ManualSection13">
-        <w:r>
-          <w:t>Relationship attributes</w:t>
-        </w:r>
-      </w:hyperlink>
       <w:r>
+        <w:t>Relationship attributes</w:t>
         <w:tab/>
-        <w:t>10</w:t>
+        <w:t>11</w:t>
       </w:r>
     </w:p>
     <w:p>
       <w:pPr>
         <w:pStyle w:val="ManualTOC1"/>
       </w:pPr>
-      <w:hyperlink w:anchor="ManualSection14">
-        <w:r>
-          <w:t>4 Supported Physical File Types</w:t>
-        </w:r>
-      </w:hyperlink>
       <w:r>
+        <w:t>4 Supported Physical File Types</w:t>
         <w:tab/>
-        <w:t>10</w:t>
+        <w:t>11</w:t>
       </w:r>
     </w:p>
     <w:p>
       <w:pPr>
         <w:pStyle w:val="ManualTOC1"/>
       </w:pPr>
-      <w:hyperlink w:anchor="ManualSection15">
-        <w:r>
-          <w:t>5 Passes and Checks</w:t>
-        </w:r>
-      </w:hyperlink>
       <w:r>
-        <w:tab/>
-        <w:t>11</w:t>
-      </w:r>
-    </w:p>
-    <w:p>
-      <w:pPr>
-        <w:pStyle w:val="ManualTOC2"/>
-      </w:pPr>
-      <w:hyperlink w:anchor="ManualSection16">
-        <w:r>
-          <w:t>Active passes</w:t>
-        </w:r>
-      </w:hyperlink>
-      <w:r>
-        <w:tab/>
-        <w:t>12</w:t>
-      </w:r>
-    </w:p>
-    <w:p>
-      <w:pPr>
-        <w:pStyle w:val="ManualTOC2"/>
-      </w:pPr>
-      <w:hyperlink w:anchor="ManualSection17">
-        <w:r>
-          <w:t>Type specific parsing</w:t>
-        </w:r>
-      </w:hyperlink>
-      <w:r>
-        <w:tab/>
-        <w:t>12</w:t>
-      </w:r>
-    </w:p>
-    <w:p>
-      <w:pPr>
-        <w:pStyle w:val="ManualTOC2"/>
-      </w:pPr>
-      <w:hyperlink w:anchor="ManualSection18">
-        <w:r>
-          <w:t>Recorder metadata and production documents</w:t>
-        </w:r>
-      </w:hyperlink>
-      <w:r>
-        <w:tab/>
-        <w:t>13</w:t>
-      </w:r>
-    </w:p>
-    <w:p>
-      <w:pPr>
-        <w:pStyle w:val="ManualTOC2"/>
-      </w:pPr>
-      <w:hyperlink w:anchor="ManualSection19">
-        <w:r>
-          <w:t>Pass result reuse</w:t>
-        </w:r>
-      </w:hyperlink>
-      <w:r>
-        <w:tab/>
-        <w:t>13</w:t>
-      </w:r>
-    </w:p>
-    <w:p>
-      <w:pPr>
-        <w:pStyle w:val="ManualTOC2"/>
-      </w:pPr>
-      <w:hyperlink w:anchor="ManualSection20">
-        <w:r>
-          <w:t>Components outside the main path</w:t>
-        </w:r>
-      </w:hyperlink>
-      <w:r>
-        <w:tab/>
-        <w:t>14</w:t>
-      </w:r>
-    </w:p>
-    <w:p>
-      <w:pPr>
-        <w:pStyle w:val="ManualTOC1"/>
-      </w:pPr>
-      <w:hyperlink w:anchor="ManualSection21">
-        <w:r>
-          <w:t>6 Optional Audio Observations</w:t>
-        </w:r>
-      </w:hyperlink>
-      <w:r>
+        <w:t>5 Passes and Checks</w:t>
         <w:tab/>
         <w:t>14</w:t>
       </w:r>
@@ -806,12 +658,8 @@
       <w:pPr>
         <w:pStyle w:val="ManualTOC2"/>
       </w:pPr>
-      <w:hyperlink w:anchor="ManualSection22">
-        <w:r>
-          <w:t>Providers</w:t>
-        </w:r>
-      </w:hyperlink>
       <w:r>
+        <w:t>Active passes</w:t>
         <w:tab/>
         <w:t>14</w:t>
       </w:r>
@@ -820,26 +668,8 @@
       <w:pPr>
         <w:pStyle w:val="ManualTOC2"/>
       </w:pPr>
-      <w:hyperlink w:anchor="ManualSection23">
-        <w:r>
-          <w:t>Tasks and ranges</w:t>
-        </w:r>
-      </w:hyperlink>
       <w:r>
-        <w:tab/>
-        <w:t>14</w:t>
-      </w:r>
-    </w:p>
-    <w:p>
-      <w:pPr>
-        <w:pStyle w:val="ManualTOC2"/>
-      </w:pPr>
-      <w:hyperlink w:anchor="ManualSection24">
-        <w:r>
-          <w:t>Execution</w:t>
-        </w:r>
-      </w:hyperlink>
-      <w:r>
+        <w:t>Type specific parsing</w:t>
         <w:tab/>
         <w:t>15</w:t>
       </w:r>
@@ -848,12 +678,8 @@
       <w:pPr>
         <w:pStyle w:val="ManualTOC2"/>
       </w:pPr>
-      <w:hyperlink w:anchor="ManualSection25">
-        <w:r>
-          <w:t>Musical semantics</w:t>
-        </w:r>
-      </w:hyperlink>
       <w:r>
+        <w:t>Recorder metadata and production documents</w:t>
         <w:tab/>
         <w:t>15</w:t>
       </w:r>
@@ -862,12 +688,8 @@
       <w:pPr>
         <w:pStyle w:val="ManualTOC2"/>
       </w:pPr>
-      <w:hyperlink w:anchor="ManualSection26">
-        <w:r>
-          <w:t>Results</w:t>
-        </w:r>
-      </w:hyperlink>
       <w:r>
+        <w:t>Pass result reuse</w:t>
         <w:tab/>
         <w:t>16</w:t>
       </w:r>
@@ -876,12 +698,18 @@
       <w:pPr>
         <w:pStyle w:val="ManualTOC2"/>
       </w:pPr>
-      <w:hyperlink w:anchor="ManualSection27">
-        <w:r>
-          <w:t>Verification and interpretation</w:t>
-        </w:r>
-      </w:hyperlink>
       <w:r>
+        <w:t>Components outside the main path</w:t>
+        <w:tab/>
+        <w:t>17</w:t>
+      </w:r>
+    </w:p>
+    <w:p>
+      <w:pPr>
+        <w:pStyle w:val="ManualTOC1"/>
+      </w:pPr>
+      <w:r>
+        <w:t>6 Optional Audio Observations</w:t>
         <w:tab/>
         <w:t>17</w:t>
       </w:r>
@@ -890,26 +718,28 @@
       <w:pPr>
         <w:pStyle w:val="ManualTOC2"/>
       </w:pPr>
-      <w:hyperlink w:anchor="ManualSection43">
-        <w:r>
-          <w:t>Calibration status and false-match benchmark</w:t>
-        </w:r>
-      </w:hyperlink>
       <w:r>
+        <w:t>Providers</w:t>
         <w:tab/>
         <w:t>17</w:t>
       </w:r>
     </w:p>
     <w:p>
       <w:pPr>
-        <w:pStyle w:val="ManualTOC1"/>
+        <w:pStyle w:val="ManualTOC2"/>
       </w:pPr>
-      <w:hyperlink w:anchor="ManualSection28">
-        <w:r>
-          <w:t>7 Four Output Axes</w:t>
-        </w:r>
-      </w:hyperlink>
       <w:r>
+        <w:t>Tasks and ranges</w:t>
+        <w:tab/>
+        <w:t>17</w:t>
+      </w:r>
+    </w:p>
+    <w:p>
+      <w:pPr>
+        <w:pStyle w:val="ManualTOC2"/>
+      </w:pPr>
+      <w:r>
+        <w:t>Execution</w:t>
         <w:tab/>
         <w:t>18</w:t>
       </w:r>
@@ -918,12 +748,8 @@
       <w:pPr>
         <w:pStyle w:val="ManualTOC2"/>
       </w:pPr>
-      <w:hyperlink w:anchor="ManualSection29">
-        <w:r>
-          <w:t>Common axis attributes</w:t>
-        </w:r>
-      </w:hyperlink>
       <w:r>
+        <w:t>Musical semantics</w:t>
         <w:tab/>
         <w:t>18</w:t>
       </w:r>
@@ -932,26 +758,8 @@
       <w:pPr>
         <w:pStyle w:val="ManualTOC2"/>
       </w:pPr>
-      <w:hyperlink w:anchor="ManualSection30">
-        <w:r>
-          <w:t>Completeness</w:t>
-        </w:r>
-      </w:hyperlink>
       <w:r>
-        <w:tab/>
-        <w:t>18</w:t>
-      </w:r>
-    </w:p>
-    <w:p>
-      <w:pPr>
-        <w:pStyle w:val="ManualTOC2"/>
-      </w:pPr>
-      <w:hyperlink w:anchor="ManualSection31">
-        <w:r>
-          <w:t>Integrity</w:t>
-        </w:r>
-      </w:hyperlink>
-      <w:r>
+        <w:t>Results</w:t>
         <w:tab/>
         <w:t>19</w:t>
       </w:r>
@@ -960,12 +768,28 @@
       <w:pPr>
         <w:pStyle w:val="ManualTOC2"/>
       </w:pPr>
-      <w:hyperlink w:anchor="ManualSection32">
-        <w:r>
-          <w:t>Attestation strength</w:t>
-        </w:r>
-      </w:hyperlink>
       <w:r>
+        <w:t>Verification and interpretation</w:t>
+        <w:tab/>
+        <w:t>20</w:t>
+      </w:r>
+    </w:p>
+    <w:p>
+      <w:pPr>
+        <w:pStyle w:val="ManualTOC2"/>
+      </w:pPr>
+      <w:r>
+        <w:t>Calibration status and false-match benchmark</w:t>
+        <w:tab/>
+        <w:t>20</w:t>
+      </w:r>
+    </w:p>
+    <w:p>
+      <w:pPr>
+        <w:pStyle w:val="ManualTOC1"/>
+      </w:pPr>
+      <w:r>
+        <w:t>7 Four Output Axes</w:t>
         <w:tab/>
         <w:t>23</w:t>
       </w:r>
@@ -974,12 +798,28 @@
       <w:pPr>
         <w:pStyle w:val="ManualTOC2"/>
       </w:pPr>
-      <w:hyperlink w:anchor="ManualSection33">
-        <w:r>
-          <w:t>AI disclosure</w:t>
-        </w:r>
-      </w:hyperlink>
       <w:r>
+        <w:t>Common axis attributes</w:t>
+        <w:tab/>
+        <w:t>23</w:t>
+      </w:r>
+    </w:p>
+    <w:p>
+      <w:pPr>
+        <w:pStyle w:val="ManualTOC2"/>
+      </w:pPr>
+      <w:r>
+        <w:t>Completeness</w:t>
+        <w:tab/>
+        <w:t>23</w:t>
+      </w:r>
+    </w:p>
+    <w:p>
+      <w:pPr>
+        <w:pStyle w:val="ManualTOC2"/>
+      </w:pPr>
+      <w:r>
+        <w:t>Integrity</w:t>
         <w:tab/>
         <w:t>24</w:t>
       </w:r>
@@ -988,152 +828,8 @@
       <w:pPr>
         <w:pStyle w:val="ManualTOC2"/>
       </w:pPr>
-      <w:hyperlink w:anchor="ManualSection34">
-        <w:r>
-          <w:t>Supporting response fields</w:t>
-        </w:r>
-      </w:hyperlink>
       <w:r>
-        <w:tab/>
-        <w:t>24</w:t>
-      </w:r>
-    </w:p>
-    <w:p>
-      <w:pPr>
-        <w:pStyle w:val="ManualTOC1"/>
-      </w:pPr>
-      <w:hyperlink w:anchor="ManualSection44">
-        <w:r>
-          <w:t>8 C2PA Provenance, Trust and Findings</w:t>
-        </w:r>
-      </w:hyperlink>
-      <w:r>
-        <w:tab/>
-        <w:t>25</w:t>
-      </w:r>
-    </w:p>
-    <w:p>
-      <w:pPr>
-        <w:pStyle w:val="ManualTOC2"/>
-      </w:pPr>
-      <w:hyperlink w:anchor="ManualSection45">
-        <w:r>
-          <w:t>Reading and the C2PA chunk</w:t>
-        </w:r>
-      </w:hyperlink>
-      <w:r>
-        <w:tab/>
-        <w:t>25</w:t>
-      </w:r>
-    </w:p>
-    <w:p>
-      <w:pPr>
-        <w:pStyle w:val="ManualTOC2"/>
-      </w:pPr>
-      <w:hyperlink w:anchor="ManualSection46">
-        <w:r>
-          <w:t>Pinned trust lists</w:t>
-        </w:r>
-      </w:hyperlink>
-      <w:r>
-        <w:tab/>
-        <w:t>25</w:t>
-      </w:r>
-    </w:p>
-    <w:p>
-      <w:pPr>
-        <w:pStyle w:val="ManualTOC2"/>
-      </w:pPr>
-      <w:hyperlink w:anchor="ManualSection47">
-        <w:r>
-          <w:t>Trust status and attestation strength</w:t>
-        </w:r>
-      </w:hyperlink>
-      <w:r>
-        <w:tab/>
-        <w:t>26</w:t>
-      </w:r>
-    </w:p>
-    <w:p>
-      <w:pPr>
-        <w:pStyle w:val="ManualTOC2"/>
-      </w:pPr>
-      <w:hyperlink w:anchor="ManualSection48">
-        <w:r>
-          <w:t>Asymmetric trust</w:t>
-        </w:r>
-      </w:hyperlink>
-      <w:r>
-        <w:tab/>
-        <w:t>27</w:t>
-      </w:r>
-    </w:p>
-    <w:p>
-      <w:pPr>
-        <w:pStyle w:val="ManualTOC2"/>
-      </w:pPr>
-      <w:hyperlink w:anchor="ManualSection49">
-        <w:r>
-          <w:t>Findings for the final artefact</w:t>
-        </w:r>
-      </w:hyperlink>
-      <w:r>
-        <w:tab/>
-        <w:t>27</w:t>
-      </w:r>
-    </w:p>
-    <w:p>
-      <w:pPr>
-        <w:pStyle w:val="ManualTOC2"/>
-      </w:pPr>
-      <w:hyperlink w:anchor="ManualSection50">
-        <w:r>
-          <w:t>Invalid manifests</w:t>
-        </w:r>
-      </w:hyperlink>
-      <w:r>
-        <w:tab/>
-        <w:t>28</w:t>
-      </w:r>
-    </w:p>
-    <w:p>
-      <w:pPr>
-        <w:pStyle w:val="ManualTOC2"/>
-      </w:pPr>
-      <w:hyperlink w:anchor="ManualSection51">
-        <w:r>
-          <w:t>Effects on Integrity</w:t>
-        </w:r>
-      </w:hyperlink>
-      <w:r>
-        <w:tab/>
-        <w:t>28</w:t>
-      </w:r>
-    </w:p>
-    <w:p>
-      <w:pPr>
-        <w:pStyle w:val="ManualTOC2"/>
-      </w:pPr>
-      <w:hyperlink w:anchor="ManualSection52">
-        <w:r>
-          <w:t>Testing with real AI generator output</w:t>
-        </w:r>
-      </w:hyperlink>
-      <w:r>
-        <w:tab/>
-        <w:t>28</w:t>
-      </w:r>
-    </w:p>
-    <w:p>
-      <w:pPr>
-        <w:pStyle w:val="ManualTOC1"/>
-      </w:pPr>
-      <w:hyperlink w:anchor="ManualSection35">
-        <w:r>
-          <w:t>9 Program File Responsibilities</w:t>
-        </w:r>
-      </w:hyperlink>
-      <w:r>
+        <w:t>Attestation strength</w:t>
         <w:tab/>
         <w:t>29</w:t>
       </w:r>
@@ -1142,40 +838,8 @@
       <w:pPr>
         <w:pStyle w:val="ManualTOC2"/>
       </w:pPr>
-      <w:hyperlink w:anchor="ManualSection36">
-        <w:r>
-          <w:t>Root files</w:t>
-        </w:r>
-      </w:hyperlink>
       <w:r>
-        <w:tab/>
-        <w:t>29</w:t>
-      </w:r>
-    </w:p>
-    <w:p>
-      <w:pPr>
-        <w:pStyle w:val="ManualTOC2"/>
-      </w:pPr>
-      <w:hyperlink w:anchor="ManualSection37">
-        <w:r>
-          <w:t>Music target modules</w:t>
-        </w:r>
-      </w:hyperlink>
-      <w:r>
-        <w:tab/>
-        <w:t>29</w:t>
-      </w:r>
-    </w:p>
-    <w:p>
-      <w:pPr>
-        <w:pStyle w:val="ManualTOC2"/>
-      </w:pPr>
-      <w:hyperlink w:anchor="ManualSection38">
-        <w:r>
-          <w:t>Parsers policies and schemas</w:t>
-        </w:r>
-      </w:hyperlink>
-      <w:r>
+        <w:t>AI disclosure</w:t>
         <w:tab/>
         <w:t>30</w:t>
       </w:r>
@@ -1184,12 +848,18 @@
       <w:pPr>
         <w:pStyle w:val="ManualTOC2"/>
       </w:pPr>
-      <w:hyperlink w:anchor="ManualSection39">
-        <w:r>
-          <w:t>Tests examples reports and documentation</w:t>
-        </w:r>
-      </w:hyperlink>
       <w:r>
+        <w:t>Supporting response fields</w:t>
+        <w:tab/>
+        <w:t>30</w:t>
+      </w:r>
+    </w:p>
+    <w:p>
+      <w:pPr>
+        <w:pStyle w:val="ManualTOC1"/>
+      </w:pPr>
+      <w:r>
+        <w:t>8 C2PA Provenance, Trust and Findings</w:t>
         <w:tab/>
         <w:t>31</w:t>
       </w:r>
@@ -1198,26 +868,8 @@
       <w:pPr>
         <w:pStyle w:val="ManualTOC2"/>
       </w:pPr>
-      <w:hyperlink w:anchor="ManualSection40">
-        <w:r>
-          <w:t>Verification for this revision</w:t>
-        </w:r>
-      </w:hyperlink>
       <w:r>
-        <w:tab/>
-        <w:t>31</w:t>
-      </w:r>
-    </w:p>
-    <w:p>
-      <w:pPr>
-        <w:pStyle w:val="ManualTOC1"/>
-      </w:pPr>
-      <w:hyperlink w:anchor="ManualSection60">
-        <w:r>
-          <w:t>10 Known Limitations</w:t>
-        </w:r>
-      </w:hyperlink>
-      <w:r>
+        <w:t>Reading and the C2PA chunk</w:t>
         <w:tab/>
         <w:t>32</w:t>
       </w:r>
@@ -1226,12 +878,8 @@
       <w:pPr>
         <w:pStyle w:val="ManualTOC2"/>
       </w:pPr>
-      <w:hyperlink w:anchor="ManualSection61">
-        <w:r>
-          <w:t>C2PA provenance</w:t>
-        </w:r>
-      </w:hyperlink>
       <w:r>
+        <w:t>Pinned trust lists</w:t>
         <w:tab/>
         <w:t>32</w:t>
       </w:r>
@@ -1240,12 +888,18 @@
       <w:pPr>
         <w:pStyle w:val="ManualTOC2"/>
       </w:pPr>
-      <w:hyperlink w:anchor="ManualSection62">
-        <w:r>
-          <w:t>Scoring and Integrity</w:t>
-        </w:r>
-      </w:hyperlink>
       <w:r>
+        <w:t>Trust status and attestation strength</w:t>
+        <w:tab/>
+        <w:t>32</w:t>
+      </w:r>
+    </w:p>
+    <w:p>
+      <w:pPr>
+        <w:pStyle w:val="ManualTOC2"/>
+      </w:pPr>
+      <w:r>
+        <w:t>Asymmetric trust</w:t>
         <w:tab/>
         <w:t>33</w:t>
       </w:r>
@@ -1254,12 +908,8 @@
       <w:pPr>
         <w:pStyle w:val="ManualTOC2"/>
       </w:pPr>
-      <w:hyperlink w:anchor="ManualSection63">
-        <w:r>
-          <w:t>Audio observations</w:t>
-        </w:r>
-      </w:hyperlink>
       <w:r>
+        <w:t>Findings for the final artefact</w:t>
         <w:tab/>
         <w:t>33</w:t>
       </w:r>
@@ -1268,56 +918,170 @@
       <w:pPr>
         <w:pStyle w:val="ManualTOC2"/>
       </w:pPr>
-      <w:hyperlink w:anchor="ManualSection64">
-        <w:r>
-          <w:t>Inputs and formats</w:t>
-        </w:r>
-      </w:hyperlink>
       <w:r>
+        <w:t>Invalid manifests</w:t>
         <w:tab/>
-        <w:t>33</w:t>
+        <w:t>34</w:t>
       </w:r>
     </w:p>
     <w:p>
       <w:pPr>
         <w:pStyle w:val="ManualTOC2"/>
       </w:pPr>
-      <w:hyperlink w:anchor="ManualSection65">
-        <w:r>
-          <w:t>Verification</w:t>
-        </w:r>
-      </w:hyperlink>
       <w:r>
+        <w:t>Effects on Integrity</w:t>
         <w:tab/>
-        <w:t>33</w:t>
+        <w:t>35</w:t>
+      </w:r>
+    </w:p>
+    <w:p>
+      <w:pPr>
+        <w:pStyle w:val="ManualTOC2"/>
+      </w:pPr>
+      <w:r>
+        <w:t>Testing with real AI generator output</w:t>
+        <w:tab/>
+        <w:t>35</w:t>
       </w:r>
     </w:p>
     <w:p>
       <w:pPr>
         <w:pStyle w:val="ManualTOC1"/>
       </w:pPr>
-      <w:hyperlink w:anchor="ManualSection41">
-        <w:r>
-          <w:t>11 Outstanding Work</w:t>
-        </w:r>
-      </w:hyperlink>
       <w:r>
+        <w:t>9 Program File Responsibilities</w:t>
         <w:tab/>
-        <w:t>33</w:t>
+        <w:t>36</w:t>
       </w:r>
     </w:p>
     <w:p>
       <w:pPr>
         <w:pStyle w:val="ManualTOC2"/>
       </w:pPr>
-      <w:hyperlink w:anchor="ManualSection42">
-        <w:r>
-          <w:t>Pass reuse dependencies</w:t>
-        </w:r>
-      </w:hyperlink>
       <w:r>
+        <w:t>Root files</w:t>
         <w:tab/>
-        <w:t>35</w:t>
+        <w:t>36</w:t>
+      </w:r>
+    </w:p>
+    <w:p>
+      <w:pPr>
+        <w:pStyle w:val="ManualTOC2"/>
+      </w:pPr>
+      <w:r>
+        <w:t>Music target modules</w:t>
+        <w:tab/>
+        <w:t>37</w:t>
+      </w:r>
+    </w:p>
+    <w:p>
+      <w:pPr>
+        <w:pStyle w:val="ManualTOC2"/>
+      </w:pPr>
+      <w:r>
+        <w:t>Parsers policies and schemas</w:t>
+        <w:tab/>
+        <w:t>38</w:t>
+      </w:r>
+    </w:p>
+    <w:p>
+      <w:pPr>
+        <w:pStyle w:val="ManualTOC2"/>
+      </w:pPr>
+      <w:r>
+        <w:t>Tests examples reports and documentation</w:t>
+        <w:tab/>
+        <w:t>39</w:t>
+      </w:r>
+    </w:p>
+    <w:p>
+      <w:pPr>
+        <w:pStyle w:val="ManualTOC2"/>
+      </w:pPr>
+      <w:r>
+        <w:t>Verification for this revision</w:t>
+        <w:tab/>
+        <w:t>40</w:t>
+      </w:r>
+    </w:p>
+    <w:p>
+      <w:pPr>
+        <w:pStyle w:val="ManualTOC1"/>
+      </w:pPr>
+      <w:r>
+        <w:t>10 Known Limitations</w:t>
+        <w:tab/>
+        <w:t>42</w:t>
+      </w:r>
+    </w:p>
+    <w:p>
+      <w:pPr>
+        <w:pStyle w:val="ManualTOC2"/>
+      </w:pPr>
+      <w:r>
+        <w:t>C2PA provenance</w:t>
+        <w:tab/>
+        <w:t>42</w:t>
+      </w:r>
+    </w:p>
+    <w:p>
+      <w:pPr>
+        <w:pStyle w:val="ManualTOC2"/>
+      </w:pPr>
+      <w:r>
+        <w:t>Scoring and Integrity</w:t>
+        <w:tab/>
+        <w:t>43</w:t>
+      </w:r>
+    </w:p>
+    <w:p>
+      <w:pPr>
+        <w:pStyle w:val="ManualTOC2"/>
+      </w:pPr>
+      <w:r>
+        <w:t>Audio observations</w:t>
+        <w:tab/>
+        <w:t>43</w:t>
+      </w:r>
+    </w:p>
+    <w:p>
+      <w:pPr>
+        <w:pStyle w:val="ManualTOC2"/>
+      </w:pPr>
+      <w:r>
+        <w:t>Inputs and formats</w:t>
+        <w:tab/>
+        <w:t>44</w:t>
+      </w:r>
+    </w:p>
+    <w:p>
+      <w:pPr>
+        <w:pStyle w:val="ManualTOC2"/>
+      </w:pPr>
+      <w:r>
+        <w:t>Verification</w:t>
+        <w:tab/>
+        <w:t>44</w:t>
+      </w:r>
+    </w:p>
+    <w:p>
+      <w:pPr>
+        <w:pStyle w:val="ManualTOC1"/>
+      </w:pPr>
+      <w:r>
+        <w:t>11 Outstanding Work</w:t>
+        <w:tab/>
+        <w:t>44</w:t>
+      </w:r>
+    </w:p>
+    <w:p>
+      <w:pPr>
+        <w:pStyle w:val="ManualTOC1"/>
+      </w:pPr>
+      <w:r>
+        <w:t>Appendix A Assessment report in version 0.8.3</w:t>
+        <w:tab/>
+        <w:t>47</w:t>
       </w:r>
     </w:p>
     <w:p>
@@ -1342,7 +1106,7 @@
         <w:spacing w:line="276" w:lineRule="auto"/>
       </w:pPr>
       <w:r>
-        <w:t>The evaluator checks a submitter-declared music-production evidence graph. It validates graph structure, binds available files by SHA-256, runs the declared type parsers and applicable checks, and reports four separate axes: completeness, integrity, attestation strength and AI disclosure. This manual describes program version 0.8.0 (base commit 2128cc4 plus the changes committed with this revision) on 21 October 2026. It covers the command-line evaluator, the desktop manifest builder, and the current report-only audio observations with bounded calibration and explicit abstention.</w:t>
+        <w:t>The evaluator checks a submitter-declared music-production evidence graph. It validates graph structure, binds available files by SHA-256, runs the declared type parsers and applicable checks, and reports four separate axes: completeness, integrity, attestation strength and AI disclosure. This manual describes program version 0.8.3 on 28 October 2026; the 0.8.2 evaluation behavior is retained. It covers the command-line evaluator, the desktop manifest builder, and the current report-only audio observations with bounded calibration and explicit abstention.</w:t>
       </w:r>
     </w:p>
     <w:p>
@@ -5672,6 +5436,12 @@
     <w:p>
       <w:r>
         <w:t xml:space="preserve">Run python3 builder_gui.py from program/ after installing the core requirements and ensuring Tkinter is available. The Tk desktop interface imports and hashes files in the background, helps declare workflows and graph relationships, offers workflow preflight and full assessment, and saves the complete JSON response. Full assessment stages verified originals in a temporary bundle and invokes the same production worker as the CLI. Its preflight uses the evaluator's limits (128 artefacts, 512 MiB per object, 1 GiB per request); before 0.8.1 it refused files over 32 MiB.</w:t>
+      </w:r>
+    </w:p>
+    <w:p>
+      <w:pPr/>
+      <w:r>
+        <w:t>Since 0.8.3, the Full assessment page shows the assessment summary and important finding before the four dimensions. Its display label Core Evidence Consistency maps to the unchanged API field integrity. Optional audio review findings do not change scores or confidence. Save result JSON preserves the original response; Save review report exports offline HTML. Appendix A explains the layout, states, coverage and exports.</w:t>
       </w:r>
     </w:p>
     <w:p>
@@ -34132,7 +33902,7 @@
     </w:p>
     <w:p>
       <w:r>
-        <w:t xml:space="preserve">The current discovery contains 501 cases: 136 core; 61 audio diagnostics; 33 C2PA; 22 remediation; 19 non-GUI builder; 8 builder-contract; 16 builder-result; 34 scoring-remediation; 12 forge-cost; 12 local-file-reference; 35 production-document; 13 sample-validation; 9 audio calibration; 11 case-interval; 36 audio-format; 9 bandwidth; 16 format-conversion; 6 DAW-session; 5 structure benchmark; 3 music benchmark; and 5 GUI cases. On 27 October 2026 (version 0.8.2) the code was exported into an empty folder and installed in a new virtual environment with all three requirement files; all 496 non-GUI cases passed in one process with no skips (C2PA_SUNO_SAMPLE_DIR pointed at the verified Suno downloads), and the five GUI cases passed in separate processes. Without C2PA_SUNO_SAMPLE_DIR the three Suno real-sample cases are skipped. Run GUI cases in separate processes when investigating macOS Tk lifecycle hangs; do not treat excluded cases as passes or skips.</w:t>
+        <w:t>The 0.8.2 discovery contained 501 cases: 136 core; 61 audio diagnostics; 33 C2PA; 22 remediation; 19 non-GUI builder; 8 builder-contract; 16 builder-result; 34 scoring-remediation; 12 forge-cost; 12 local-file-reference; 35 production-document; 13 sample-validation; 9 audio calibration; 11 case-interval; 36 audio-format; 9 bandwidth; 16 format-conversion; 6 DAW-session; 5 structure benchmark; 3 music benchmark; and 5 GUI cases. On 27 October 2026 (version 0.8.2) the code was exported into an empty folder and installed in a new virtual environment with all three requirement files; all 496 non-GUI cases passed in one process with no skips (C2PA_SUNO_SAMPLE_DIR pointed at the verified Suno downloads), and the five GUI cases passed in separate processes. Without C2PA_SUNO_SAMPLE_DIR the three Suno real-sample cases are skipped. Run GUI cases in separate processes when investigating macOS Tk lifecycle hangs; do not treat excluded cases as passes or skips.</w:t>
       </w:r>
     </w:p>
     <w:p>
@@ -34169,7 +33939,7 @@
         <w:spacing w:line="276" w:lineRule="auto"/>
       </w:pPr>
       <w:r>
-        <w:t xml:space="preserve">Version 0.8.2 (27 October 2026): the file checks of Section 4 (readability, stream completeness, the full-length sample check and the not_completed state), the bext/iXML timestamp check and the Integrity status incomplete. The example responses were regenerated; every axis value, confidence and status is unchanged. All 236 Project Rock WAVs pass the sample check (1.2 s for 3.37 GiB) and all 233 recorder takes pass the timestamp check. Coverage was not re-measured for 0.8.2.</w:t>
+        <w:t>Version 0.8.2 (27 October 2026): the file checks of Section 4 (readability, stream completeness, the full-length sample check and the not_completed state), the bext/iXML timestamp check and the Integrity status incomplete. The example responses were regenerated; every axis value, confidence and status is unchanged. All 236 Project Rock WAVs pass the sample check (1.2 s for 3.37 GiB) and all 233 recorder takes pass the timestamp check. Current verification is reported in Appendix A.</w:t>
       </w:r>
     </w:p>
     <w:p>
@@ -34194,7 +33964,7 @@
         <w:spacing w:line="276" w:lineRule="auto"/>
       </w:pPr>
       <w:r>
-        <w:t xml:space="preserve">This chapter collects the known limitations of version 0.8.2 in one place. Each one is a deliberate boundary or a dependency on outside parties, not an undetected defect; the results remain valid within these limits. Work that would remove a limitation is listed in Section 11.</w:t>
+        <w:t>This chapter collects the known limitations of version 0.8.3 in one place. Each one is a deliberate boundary or a dependency on outside parties, not an undetected defect; the results remain valid within these limits. Work that would remove a limitation is listed in Section 11.</w:t>
       </w:r>
     </w:p>
     <w:p>
@@ -34632,7 +34402,7 @@
         <w:spacing w:after="60" w:line="276" w:lineRule="auto"/>
       </w:pPr>
       <w:r>
-        <w:t>The four desktop GUI tests can hang when run inside the full suite on macOS, so they are run in separate processes.</w:t>
+        <w:t>Desktop GUI tests can hang when run inside the full suite on macOS, so they are run in separate processes.</w:t>
       </w:r>
     </w:p>
     <w:p>
@@ -36352,6 +36122,190 @@
         <w:keepLines/>
         <w:spacing w:line="276" w:lineRule="auto"/>
       </w:pPr>
+    </w:p>
+    <w:p>
+      <w:r>
+        <w:br w:type="page"/>
+      </w:r>
+    </w:p>
+    <w:p>
+      <w:pPr>
+        <w:pStyle w:val="Heading1"/>
+      </w:pPr>
+      <w:r>
+        <w:t>Appendix A Assessment report in version 0.8.3</w:t>
+      </w:r>
+    </w:p>
+    <w:p>
+      <w:r>
+        <w:t>Version 0.8.3 changes the GUI and human report presentation. It helps reviewers understand why a high core score can appear alongside an audio interval needing review. The scoring profile remains default-v7; core checks, audio thresholds, response schemas and API field names retain their existing meaning.</w:t>
+      </w:r>
+    </w:p>
+    <w:p>
+      <w:pPr>
+        <w:pStyle w:val="Heading2"/>
+      </w:pPr>
+      <w:r>
+        <w:t>Read the summary before the scores</w:t>
+      </w:r>
+    </w:p>
+    <w:p>
+      <w:pPr>
+        <w:pStyle w:val="ListParagraph"/>
+      </w:pPr>
+      <w:r>
+        <w:t>Assessment summary shows execution state, assessed core-check state, audio-review state and qualified recording cross-check coverage. Execution succeeded means a result was returned; it does not mean every claim was verified.</w:t>
+      </w:r>
+    </w:p>
+    <w:p>
+      <w:pPr>
+        <w:pStyle w:val="ListParagraph"/>
+      </w:pPr>
+      <w:r>
+        <w:t>The important finding is expanded above the scores. For content_found_elsewhere it names the affected files, declared source and target intervals, and the reported source candidate. View findings moves keyboard focus to the full details.</w:t>
+      </w:r>
+    </w:p>
+    <w:p>
+      <w:pPr>
+        <w:pStyle w:val="ListParagraph"/>
+      </w:pPr>
+      <w:r>
+        <w:t>Four dimensions retain the original values and confidence. The interface calls integrity Core Evidence Consistency. A contradiction count or incomplete state remains visible even beside a high number. A null value remains not assessed.</w:t>
+      </w:r>
+    </w:p>
+    <w:p>
+      <w:pPr>
+        <w:pStyle w:val="ListParagraph"/>
+      </w:pPr>
+      <w:r>
+        <w:t>Coverage distinguishes material presence from qualified cross-checks. For example, 1/13 checked means 12 lack qualifying cross-checks. Checked includes both consistent and contradicted recordings; it is not a pass rate. Provisional AAF coverage is explicitly qualified.</w:t>
+      </w:r>
+    </w:p>
+    <w:p>
+      <w:pPr>
+        <w:pStyle w:val="ListParagraph"/>
+      </w:pPr>
+      <w:r>
+        <w:t>Findings and explanations contains attention items, axis reasoning, coverage, confidence factors and provider limitations. All checks and raw evidence retains other observations and the complete original response, including successful checks.</w:t>
+      </w:r>
+    </w:p>
+    <w:p>
+      <w:pPr>
+        <w:pStyle w:val="Heading2"/>
+      </w:pPr>
+      <w:r>
+        <w:t>Interpret audio states within their scope</w:t>
+      </w:r>
+    </w:p>
+    <w:p>
+      <w:r>
+        <w:t>content_found_elsewhere requires review. content_not_located is inconclusive. search_unavailable states the local window observation and the wider-search gap separately. Insufficient signal or no positive control means unable to decide. Unavailable or unassessed analyses are not passes. declared_range_supported is a supporting observation within the reported profile, and unknown states retain their original value without a pass or failure interpretation.</w:t>
+      </w:r>
+    </w:p>
+    <w:p>
+      <w:r>
+        <w:t>A linked finding and its detailed range assessment count once. Different windows and selections stay separate. Multiple supported candidate positions remain visible, including ambiguity from repeated material. audfprint and SpectroMap are algorithm observations rather than independent witnesses. Heuristic bandwidth and musical-semantics results retain their limitations in the details.</w:t>
+      </w:r>
+    </w:p>
+    <w:p>
+      <w:pPr>
+        <w:pStyle w:val="Heading2"/>
+      </w:pPr>
+      <w:r>
+        <w:t>Keep the response and scores unchanged</w:t>
+      </w:r>
+    </w:p>
+    <w:p>
+      <w:r>
+        <w:t>The summary is calculated only in builder_review.py for presentation. It is never inserted into the machine response. The field remains axes.integrity, and the response schema version remains 0.2-candidate. Audio diagnostics retain scoring_eligible false and integrity_contribution null; displaying a review flag never changes an axis value, confidence or status. Core file checks such as audio_samples_valid remain core checks.</w:t>
+      </w:r>
+    </w:p>
+    <w:p>
+      <w:r>
+        <w:t>Save result JSON saves the original evaluator response. Save review report produces a standalone offline HTML file using the same model as the GUI; names and messages are escaped, and important findings remain visible in print. Copy report text copies the human report. The report captures case and run IDs, the GUI result-capture time, original system metadata and display-template version. Capture time is not a signed production time.</w:t>
+      </w:r>
+    </w:p>
+    <w:p>
+      <w:r>
+        <w:t>When the submission or analysis options change, the GUI marks the result as a previous assessment. Export still describes the original snapshot. Run assessment again to evaluate the changed submission.</w:t>
+      </w:r>
+    </w:p>
+    <w:p>
+      <w:r>
+        <w:br w:type="page"/>
+      </w:r>
+    </w:p>
+    <w:p>
+      <w:pPr>
+        <w:pStyle w:val="Heading2"/>
+      </w:pPr>
+      <w:r>
+        <w:t>Actual interface example</w:t>
+      </w:r>
+    </w:p>
+    <w:p>
+      <w:r>
+        <w:t>The screen below uses a constructed layout-test response in the actual 0.8.3 GUI. The 1.000 value and 1/13 coverage illustrate presentation behavior; they are not measured results from customer material.</w:t>
+      </w:r>
+    </w:p>
+    <w:p>
+      <w:r>
+        <w:drawing>
+          <wp:inline xmlns:a="http://schemas.openxmlformats.org/drawingml/2006/main" xmlns:pic="http://schemas.openxmlformats.org/drawingml/2006/picture">
+            <wp:extent cx="6120130" cy="4723628"/>
+            <wp:docPr id="1" name="Picture 1"/>
+            <wp:cNvGraphicFramePr>
+              <a:graphicFrameLocks noChangeAspect="1"/>
+            </wp:cNvGraphicFramePr>
+            <a:graphic>
+              <a:graphicData uri="http://schemas.openxmlformats.org/drawingml/2006/picture">
+                <pic:pic>
+                  <pic:nvPicPr>
+                    <pic:cNvPr id="0" name="assessment-summary-0.8.3.png"/>
+                    <pic:cNvPicPr/>
+                  </pic:nvPicPr>
+                  <pic:blipFill>
+                    <a:blip r:embed="rId13"/>
+                    <a:stretch>
+                      <a:fillRect/>
+                    </a:stretch>
+                  </pic:blipFill>
+                  <pic:spPr>
+                    <a:xfrm>
+                      <a:off x="0" y="0"/>
+                      <a:ext cx="6120130" cy="4723628"/>
+                    </a:xfrm>
+                    <a:prstGeom prst="rect"/>
+                  </pic:spPr>
+                </pic:pic>
+              </a:graphicData>
+            </a:graphic>
+          </wp:inline>
+        </w:drawing>
+      </w:r>
+    </w:p>
+    <w:p>
+      <w:r>
+        <w:t>The audio review warning and declared/candidate intervals appear above the four scores. The same scope note explains that optional audio diagnostics do not change Core Evidence Consistency or its confidence. The screenshot is also available at program/docs/images/assessment-summary-0.8.3.png.</w:t>
+      </w:r>
+    </w:p>
+    <w:p>
+      <w:pPr>
+        <w:pStyle w:val="Heading2"/>
+      </w:pPr>
+      <w:r>
+        <w:t>Verification for this presentation release</w:t>
+      </w:r>
+    </w:p>
+    <w:p>
+      <w:r>
+        <w:t>The original 501 tests and 37 added presentation tests pass: 530 non-GUI tests in one process and eight GUI tests in separate processes, 538 passed with no skips. Verified Suno samples and all optional audio backends were enabled. Tests cover response immutability, axis parity, declared-range outcomes, linked-record deduplication, distinct windows, coverage counts, unknown states, offline HTML escaping, JSON export, snapshot labels and small-window layout. The real declared-range integration test passes its emitted response through both presentation paths and asserts no mutation.</w:t>
+      </w:r>
+    </w:p>
+    <w:p>
+      <w:r>
+        <w:t>The previous 0.8.2 verification and coverage figures in Chapter 9 are historical. Current test and coverage records are in program/reports/verification.md and program/reports/coverage/. This release does not claim new calibration or production-dataset accuracy.</w:t>
+      </w:r>
     </w:p>
     <w:sectPr>
       <w:headerReference w:type="default" r:id="rId7"/>

</xml_diff>